<commit_message>
F3: medida de BER, curva y análisis del margen
</commit_message>
<xml_diff>
--- a/docs/Memoria_telemetria_868.docx
+++ b/docs/Memoria_telemetria_868.docx
@@ -142,7 +142,7 @@
           <w:sz w:val="22"/>
           <w:szCs w:val="22"/>
         </w:rPr>
-        <w:t xml:space="preserve">0.2 · 5 de octubre de 2026 · fase F1 y entorno</w:t>
+        <w:t xml:space="preserve">0.3 · 5 de octubre de 2026 · F1, entorno y simulación de BER</w:t>
       </w:r>
     </w:p>
     <w:p>
@@ -15018,7 +15018,7 @@
           <w:sz w:val="22"/>
           <w:szCs w:val="22"/>
         </w:rPr>
-        <w:t xml:space="preserve">Sin filtro, el demodulador recibía el ruido de los 96 kHz cuando la señal ocupa unos 20 kHz, y además los discriminadores de FM presentan un efecto umbral en torno a 10 dB de SNR. El filtro aportó una mejora de 20·log10(0,65/0,30) ≈ 6,7 dB, coherente con la reducción de ancho de banda de ruido, y dejó el receptor a unos 0,3 dB del límite teórico.</w:t>
+        <w:t xml:space="preserve">Sin filtro, el demodulador recibía el ruido de los 96 kHz cuando la señal ocupa unos 20 kHz, y además los discriminadores de FM presentan un efecto umbral en torno a 10 dB de SNR. El filtro aportó una mejora de 20·log10(0,65/0,30) ≈ 6,7 dB, coherente con la reducción de ancho de banda de ruido. La coincidencia del umbral con los 13,4 dB teóricos resultó ser aparente: la medida posterior con contador de errores (apartado 10.5) mostró que a ese nivel la BER real era del orden de 10⁻³, no 10⁻⁵, porque el ojo solo detecta los errores cuando ya son frecuentes.</w:t>
       </w:r>
     </w:p>
     <w:tbl>
@@ -15081,7 +15081,7 @@
                 <w:sz w:val="22"/>
                 <w:szCs w:val="22"/>
               </w:rPr>
-              <w:t xml:space="preserve">Un filtro adaptado al ancho de banda de la señal mejora el umbral unos 6–7 dB. En el balance de enlace, 6 dB equivalen a duplicar el alcance sin cambiar ni la antena ni la potencia. La medida fue visual y aproximada; en la fase F4 se sustituirá por un contador de errores para obtener la BER exacta.</w:t>
+              <w:t xml:space="preserve">Un filtro adaptado al ancho de banda de la señal mejora el umbral unos 6–7 dB. En el balance de enlace, 6 dB equivalen a duplicar el alcance sin cambiar ni la antena ni la potencia. La medida visual es optimista: subestima los errores. Por eso se añadió un contador de BER (apartado 10.5).</w:t>
             </w:r>
           </w:p>
         </w:tc>
@@ -15190,6 +15190,2978 @@
         <w:t xml:space="preserve">En resumen, la Heltec transmite y GNU Radio con el RTL-SDR recibe, interpreta y registra los datos: es el segmento de tierra del sistema.</w:t>
       </w:r>
     </w:p>
+    <w:p>
+      <w:pPr>
+        <w:pStyle w:val="Heading2"/>
+        <w:spacing w:after="120" w:before="260"/>
+      </w:pPr>
+      <w:r>
+        <w:rPr>
+          <w:rFonts w:ascii="Calibri" w:cs="Calibri" w:eastAsia="Calibri" w:hAnsi="Calibri"/>
+          <w:b/>
+          <w:bCs/>
+          <w:color w:val="1F4E79"/>
+          <w:sz w:val="26"/>
+          <w:szCs w:val="26"/>
+        </w:rPr>
+        <w:t xml:space="preserve">10.5 Medida de la BER y curva BER frente a Eb/N0</w:t>
+      </w:r>
+    </w:p>
+    <w:p>
+      <w:pPr>
+        <w:spacing w:after="140" w:line="276"/>
+        <w:jc w:val="both"/>
+      </w:pPr>
+      <w:r>
+        <w:rPr>
+          <w:rFonts w:ascii="Calibri" w:cs="Calibri" w:eastAsia="Calibri" w:hAnsi="Calibri"/>
+          <w:sz w:val="22"/>
+          <w:szCs w:val="22"/>
+        </w:rPr>
+        <w:t xml:space="preserve">Para sustituir la estimación visual se construyó un segundo flujo (ground/gnuradio/02_fsk_ber.grc) que cuenta los errores de bit. Cambios respecto al flujo anterior:</w:t>
+      </w:r>
+    </w:p>
+    <w:p>
+      <w:pPr>
+        <w:pStyle w:val="ListParagraph"/>
+        <w:numPr>
+          <w:ilvl w:val="0"/>
+          <w:numId w:val="3"/>
+        </w:numPr>
+        <w:spacing w:after="80"/>
+      </w:pPr>
+      <w:r>
+        <w:rPr>
+          <w:rFonts w:ascii="Calibri" w:cs="Calibri" w:eastAsia="Calibri" w:hAnsi="Calibri"/>
+          <w:b/>
+          <w:bCs/>
+          <w:sz w:val="22"/>
+          <w:szCs w:val="22"/>
+        </w:rPr>
+        <w:t xml:space="preserve">Ruido explícito: </w:t>
+      </w:r>
+      <w:r>
+        <w:rPr>
+          <w:rFonts w:ascii="Calibri" w:cs="Calibri" w:eastAsia="Calibri" w:hAnsi="Calibri"/>
+          <w:sz w:val="22"/>
+          <w:szCs w:val="22"/>
+        </w:rPr>
+        <w:t xml:space="preserve">Noise Source gaussiano + Add en lugar de Channel Model, que introducía un retardo interno difícil de compensar. La potencia de ruido es igual a la amplitud al cuadrado.</w:t>
+      </w:r>
+    </w:p>
+    <w:p>
+      <w:pPr>
+        <w:pStyle w:val="ListParagraph"/>
+        <w:numPr>
+          <w:ilvl w:val="0"/>
+          <w:numId w:val="3"/>
+        </w:numPr>
+        <w:spacing w:after="80"/>
+      </w:pPr>
+      <w:r>
+        <w:rPr>
+          <w:rFonts w:ascii="Calibri" w:cs="Calibri" w:eastAsia="Calibri" w:hAnsi="Calibri"/>
+          <w:b/>
+          <w:bCs/>
+          <w:sz w:val="22"/>
+          <w:szCs w:val="22"/>
+        </w:rPr>
+        <w:t xml:space="preserve">Integrador (filtro adaptado): </w:t>
+      </w:r>
+      <w:r>
+        <w:rPr>
+          <w:rFonts w:ascii="Calibri" w:cs="Calibri" w:eastAsia="Calibri" w:hAnsi="Calibri"/>
+          <w:sz w:val="22"/>
+          <w:szCs w:val="22"/>
+        </w:rPr>
+        <w:t xml:space="preserve">Moving Average de 10 muestras tras el demodulador; promedia el bit completo en lugar de leer una única muestra.</w:t>
+      </w:r>
+    </w:p>
+    <w:p>
+      <w:pPr>
+        <w:pStyle w:val="ListParagraph"/>
+        <w:numPr>
+          <w:ilvl w:val="0"/>
+          <w:numId w:val="3"/>
+        </w:numPr>
+        <w:spacing w:after="80"/>
+      </w:pPr>
+      <w:r>
+        <w:rPr>
+          <w:rFonts w:ascii="Calibri" w:cs="Calibri" w:eastAsia="Calibri" w:hAnsi="Calibri"/>
+          <w:b/>
+          <w:bCs/>
+          <w:sz w:val="22"/>
+          <w:szCs w:val="22"/>
+        </w:rPr>
+        <w:t xml:space="preserve">Decisión: </w:t>
+      </w:r>
+      <w:r>
+        <w:rPr>
+          <w:rFonts w:ascii="Calibri" w:cs="Calibri" w:eastAsia="Calibri" w:hAnsi="Calibri"/>
+          <w:sz w:val="22"/>
+          <w:szCs w:val="22"/>
+        </w:rPr>
+        <w:t xml:space="preserve">Keep 1 in N (una muestra por bit) y Binary Slicer (signo → 0/1).</w:t>
+      </w:r>
+    </w:p>
+    <w:p>
+      <w:pPr>
+        <w:pStyle w:val="ListParagraph"/>
+        <w:numPr>
+          <w:ilvl w:val="0"/>
+          <w:numId w:val="3"/>
+        </w:numPr>
+        <w:spacing w:after="80"/>
+      </w:pPr>
+      <w:r>
+        <w:rPr>
+          <w:rFonts w:ascii="Calibri" w:cs="Calibri" w:eastAsia="Calibri" w:hAnsi="Calibri"/>
+          <w:b/>
+          <w:bCs/>
+          <w:sz w:val="22"/>
+          <w:szCs w:val="22"/>
+        </w:rPr>
+        <w:t xml:space="preserve">Alineación: </w:t>
+      </w:r>
+      <w:r>
+        <w:rPr>
+          <w:rFonts w:ascii="Calibri" w:cs="Calibri" w:eastAsia="Calibri" w:hAnsi="Calibri"/>
+          <w:sz w:val="22"/>
+          <w:szCs w:val="22"/>
+        </w:rPr>
+        <w:t xml:space="preserve">la referencia se retrasa 28 muestras, el retardo de grupo del filtro FIR de 57 coeficientes ((57 − 1)/2).</w:t>
+      </w:r>
+    </w:p>
+    <w:p>
+      <w:pPr>
+        <w:pStyle w:val="ListParagraph"/>
+        <w:numPr>
+          <w:ilvl w:val="0"/>
+          <w:numId w:val="3"/>
+        </w:numPr>
+        <w:spacing w:after="80"/>
+      </w:pPr>
+      <w:r>
+        <w:rPr>
+          <w:rFonts w:ascii="Calibri" w:cs="Calibri" w:eastAsia="Calibri" w:hAnsi="Calibri"/>
+          <w:b/>
+          <w:bCs/>
+          <w:sz w:val="22"/>
+          <w:szCs w:val="22"/>
+        </w:rPr>
+        <w:t xml:space="preserve">Contador: </w:t>
+      </w:r>
+      <w:r>
+        <w:rPr>
+          <w:rFonts w:ascii="Calibri" w:cs="Calibri" w:eastAsia="Calibri" w:hAnsi="Calibri"/>
+          <w:sz w:val="22"/>
+          <w:szCs w:val="22"/>
+        </w:rPr>
+        <w:t xml:space="preserve">XOR entre bits enviados y recibidos y media móvil de 100 000 bits; la ventana muestra la BER medida junto al Eb/N0 y la BER teórica.</w:t>
+      </w:r>
+    </w:p>
+    <w:tbl>
+      <w:tblPr>
+        <w:tblW w:type="dxa" w:w="9026"/>
+        <w:tblBorders>
+          <w:top w:val="single" w:color="auto" w:sz="4"/>
+          <w:left w:val="single" w:color="auto" w:sz="4"/>
+          <w:bottom w:val="single" w:color="auto" w:sz="4"/>
+          <w:right w:val="single" w:color="auto" w:sz="4"/>
+          <w:insideH w:val="single" w:color="auto" w:sz="4"/>
+          <w:insideV w:val="single" w:color="auto" w:sz="4"/>
+        </w:tblBorders>
+      </w:tblPr>
+      <w:tblGrid>
+        <w:gridCol w:w="1500"/>
+        <w:gridCol w:w="1500"/>
+        <w:gridCol w:w="2000"/>
+        <w:gridCol w:w="2000"/>
+        <w:gridCol w:w="2026"/>
+      </w:tblGrid>
+      <w:tr>
+        <w:trPr>
+          <w:tblHeader/>
+        </w:trPr>
+        <w:tc>
+          <w:tcPr>
+            <w:tcW w:type="dxa" w:w="1500"/>
+            <w:tcBorders>
+              <w:top w:val="single" w:color="BFBFBF" w:sz="4"/>
+              <w:left w:val="single" w:color="BFBFBF" w:sz="4"/>
+              <w:bottom w:val="single" w:color="BFBFBF" w:sz="4"/>
+              <w:right w:val="single" w:color="BFBFBF" w:sz="4"/>
+            </w:tcBorders>
+            <w:shd w:fill="1F4E79" w:color="auto" w:val="clear"/>
+            <w:tcMar>
+              <w:top w:type="dxa" w:w="50"/>
+              <w:left w:type="dxa" w:w="90"/>
+              <w:bottom w:type="dxa" w:w="50"/>
+              <w:right w:type="dxa" w:w="90"/>
+            </w:tcMar>
+          </w:tcPr>
+          <w:p>
+            <w:pPr>
+              <w:jc w:val="left"/>
+            </w:pPr>
+            <w:r>
+              <w:rPr>
+                <w:rFonts w:ascii="Calibri" w:cs="Calibri" w:eastAsia="Calibri" w:hAnsi="Calibri"/>
+                <w:b/>
+                <w:bCs/>
+                <w:color w:val="FFFFFF"/>
+                <w:sz w:val="19"/>
+                <w:szCs w:val="19"/>
+              </w:rPr>
+              <w:t xml:space="preserve">Ruido</w:t>
+            </w:r>
+          </w:p>
+        </w:tc>
+        <w:tc>
+          <w:tcPr>
+            <w:tcW w:type="dxa" w:w="1500"/>
+            <w:tcBorders>
+              <w:top w:val="single" w:color="BFBFBF" w:sz="4"/>
+              <w:left w:val="single" w:color="BFBFBF" w:sz="4"/>
+              <w:bottom w:val="single" w:color="BFBFBF" w:sz="4"/>
+              <w:right w:val="single" w:color="BFBFBF" w:sz="4"/>
+            </w:tcBorders>
+            <w:shd w:fill="1F4E79" w:color="auto" w:val="clear"/>
+            <w:tcMar>
+              <w:top w:type="dxa" w:w="50"/>
+              <w:left w:type="dxa" w:w="90"/>
+              <w:bottom w:type="dxa" w:w="50"/>
+              <w:right w:type="dxa" w:w="90"/>
+            </w:tcMar>
+          </w:tcPr>
+          <w:p>
+            <w:pPr>
+              <w:jc w:val="left"/>
+            </w:pPr>
+            <w:r>
+              <w:rPr>
+                <w:rFonts w:ascii="Calibri" w:cs="Calibri" w:eastAsia="Calibri" w:hAnsi="Calibri"/>
+                <w:b/>
+                <w:bCs/>
+                <w:color w:val="FFFFFF"/>
+                <w:sz w:val="19"/>
+                <w:szCs w:val="19"/>
+              </w:rPr>
+              <w:t xml:space="preserve">Eb/N0</w:t>
+            </w:r>
+          </w:p>
+        </w:tc>
+        <w:tc>
+          <w:tcPr>
+            <w:tcW w:type="dxa" w:w="2000"/>
+            <w:tcBorders>
+              <w:top w:val="single" w:color="BFBFBF" w:sz="4"/>
+              <w:left w:val="single" w:color="BFBFBF" w:sz="4"/>
+              <w:bottom w:val="single" w:color="BFBFBF" w:sz="4"/>
+              <w:right w:val="single" w:color="BFBFBF" w:sz="4"/>
+            </w:tcBorders>
+            <w:shd w:fill="1F4E79" w:color="auto" w:val="clear"/>
+            <w:tcMar>
+              <w:top w:type="dxa" w:w="50"/>
+              <w:left w:type="dxa" w:w="90"/>
+              <w:bottom w:type="dxa" w:w="50"/>
+              <w:right w:type="dxa" w:w="90"/>
+            </w:tcMar>
+          </w:tcPr>
+          <w:p>
+            <w:pPr>
+              <w:jc w:val="left"/>
+            </w:pPr>
+            <w:r>
+              <w:rPr>
+                <w:rFonts w:ascii="Calibri" w:cs="Calibri" w:eastAsia="Calibri" w:hAnsi="Calibri"/>
+                <w:b/>
+                <w:bCs/>
+                <w:color w:val="FFFFFF"/>
+                <w:sz w:val="19"/>
+                <w:szCs w:val="19"/>
+              </w:rPr>
+              <w:t xml:space="preserve">BER medida</w:t>
+            </w:r>
+          </w:p>
+        </w:tc>
+        <w:tc>
+          <w:tcPr>
+            <w:tcW w:type="dxa" w:w="2000"/>
+            <w:tcBorders>
+              <w:top w:val="single" w:color="BFBFBF" w:sz="4"/>
+              <w:left w:val="single" w:color="BFBFBF" w:sz="4"/>
+              <w:bottom w:val="single" w:color="BFBFBF" w:sz="4"/>
+              <w:right w:val="single" w:color="BFBFBF" w:sz="4"/>
+            </w:tcBorders>
+            <w:shd w:fill="1F4E79" w:color="auto" w:val="clear"/>
+            <w:tcMar>
+              <w:top w:type="dxa" w:w="50"/>
+              <w:left w:type="dxa" w:w="90"/>
+              <w:bottom w:type="dxa" w:w="50"/>
+              <w:right w:type="dxa" w:w="90"/>
+            </w:tcMar>
+          </w:tcPr>
+          <w:p>
+            <w:pPr>
+              <w:jc w:val="left"/>
+            </w:pPr>
+            <w:r>
+              <w:rPr>
+                <w:rFonts w:ascii="Calibri" w:cs="Calibri" w:eastAsia="Calibri" w:hAnsi="Calibri"/>
+                <w:b/>
+                <w:bCs/>
+                <w:color w:val="FFFFFF"/>
+                <w:sz w:val="19"/>
+                <w:szCs w:val="19"/>
+              </w:rPr>
+              <w:t xml:space="preserve">BER teórica</w:t>
+            </w:r>
+          </w:p>
+        </w:tc>
+        <w:tc>
+          <w:tcPr>
+            <w:tcW w:type="dxa" w:w="2026"/>
+            <w:tcBorders>
+              <w:top w:val="single" w:color="BFBFBF" w:sz="4"/>
+              <w:left w:val="single" w:color="BFBFBF" w:sz="4"/>
+              <w:bottom w:val="single" w:color="BFBFBF" w:sz="4"/>
+              <w:right w:val="single" w:color="BFBFBF" w:sz="4"/>
+            </w:tcBorders>
+            <w:shd w:fill="1F4E79" w:color="auto" w:val="clear"/>
+            <w:tcMar>
+              <w:top w:type="dxa" w:w="50"/>
+              <w:left w:type="dxa" w:w="90"/>
+              <w:bottom w:type="dxa" w:w="50"/>
+              <w:right w:type="dxa" w:w="90"/>
+            </w:tcMar>
+          </w:tcPr>
+          <w:p>
+            <w:pPr>
+              <w:jc w:val="left"/>
+            </w:pPr>
+            <w:r>
+              <w:rPr>
+                <w:rFonts w:ascii="Calibri" w:cs="Calibri" w:eastAsia="Calibri" w:hAnsi="Calibri"/>
+                <w:b/>
+                <w:bCs/>
+                <w:color w:val="FFFFFF"/>
+                <w:sz w:val="19"/>
+                <w:szCs w:val="19"/>
+              </w:rPr>
+              <w:t xml:space="preserve">Pérdida</w:t>
+            </w:r>
+          </w:p>
+        </w:tc>
+      </w:tr>
+      <w:tr>
+        <w:tc>
+          <w:tcPr>
+            <w:tcW w:type="dxa" w:w="1500"/>
+            <w:tcBorders>
+              <w:top w:val="single" w:color="BFBFBF" w:sz="4"/>
+              <w:left w:val="single" w:color="BFBFBF" w:sz="4"/>
+              <w:bottom w:val="single" w:color="BFBFBF" w:sz="4"/>
+              <w:right w:val="single" w:color="BFBFBF" w:sz="4"/>
+            </w:tcBorders>
+            <w:tcMar>
+              <w:top w:type="dxa" w:w="50"/>
+              <w:left w:type="dxa" w:w="90"/>
+              <w:bottom w:type="dxa" w:w="50"/>
+              <w:right w:type="dxa" w:w="90"/>
+            </w:tcMar>
+          </w:tcPr>
+          <w:p>
+            <w:pPr>
+              <w:jc w:val="left"/>
+            </w:pPr>
+            <w:r>
+              <w:rPr>
+                <w:rFonts w:ascii="Calibri" w:cs="Calibri" w:eastAsia="Calibri" w:hAnsi="Calibri"/>
+                <w:b w:val="false"/>
+                <w:bCs w:val="false"/>
+                <w:sz w:val="19"/>
+                <w:szCs w:val="19"/>
+              </w:rPr>
+              <w:t xml:space="preserve">0,50</w:t>
+            </w:r>
+          </w:p>
+        </w:tc>
+        <w:tc>
+          <w:tcPr>
+            <w:tcW w:type="dxa" w:w="1500"/>
+            <w:tcBorders>
+              <w:top w:val="single" w:color="BFBFBF" w:sz="4"/>
+              <w:left w:val="single" w:color="BFBFBF" w:sz="4"/>
+              <w:bottom w:val="single" w:color="BFBFBF" w:sz="4"/>
+              <w:right w:val="single" w:color="BFBFBF" w:sz="4"/>
+            </w:tcBorders>
+            <w:tcMar>
+              <w:top w:type="dxa" w:w="50"/>
+              <w:left w:type="dxa" w:w="90"/>
+              <w:bottom w:type="dxa" w:w="50"/>
+              <w:right w:type="dxa" w:w="90"/>
+            </w:tcMar>
+          </w:tcPr>
+          <w:p>
+            <w:pPr>
+              <w:jc w:val="right"/>
+            </w:pPr>
+            <w:r>
+              <w:rPr>
+                <w:rFonts w:ascii="Calibri" w:cs="Calibri" w:eastAsia="Calibri" w:hAnsi="Calibri"/>
+                <w:b w:val="false"/>
+                <w:bCs w:val="false"/>
+                <w:sz w:val="19"/>
+                <w:szCs w:val="19"/>
+              </w:rPr>
+              <w:t xml:space="preserve">16,0 dB</w:t>
+            </w:r>
+          </w:p>
+        </w:tc>
+        <w:tc>
+          <w:tcPr>
+            <w:tcW w:type="dxa" w:w="2000"/>
+            <w:tcBorders>
+              <w:top w:val="single" w:color="BFBFBF" w:sz="4"/>
+              <w:left w:val="single" w:color="BFBFBF" w:sz="4"/>
+              <w:bottom w:val="single" w:color="BFBFBF" w:sz="4"/>
+              <w:right w:val="single" w:color="BFBFBF" w:sz="4"/>
+            </w:tcBorders>
+            <w:tcMar>
+              <w:top w:type="dxa" w:w="50"/>
+              <w:left w:type="dxa" w:w="90"/>
+              <w:bottom w:type="dxa" w:w="50"/>
+              <w:right w:type="dxa" w:w="90"/>
+            </w:tcMar>
+          </w:tcPr>
+          <w:p>
+            <w:pPr>
+              <w:jc w:val="right"/>
+            </w:pPr>
+            <w:r>
+              <w:rPr>
+                <w:rFonts w:ascii="Calibri" w:cs="Calibri" w:eastAsia="Calibri" w:hAnsi="Calibri"/>
+                <w:b w:val="false"/>
+                <w:bCs w:val="false"/>
+                <w:sz w:val="19"/>
+                <w:szCs w:val="19"/>
+              </w:rPr>
+              <w:t xml:space="preserve">&lt; 10⁻⁵ (0 errores)</w:t>
+            </w:r>
+          </w:p>
+        </w:tc>
+        <w:tc>
+          <w:tcPr>
+            <w:tcW w:type="dxa" w:w="2000"/>
+            <w:tcBorders>
+              <w:top w:val="single" w:color="BFBFBF" w:sz="4"/>
+              <w:left w:val="single" w:color="BFBFBF" w:sz="4"/>
+              <w:bottom w:val="single" w:color="BFBFBF" w:sz="4"/>
+              <w:right w:val="single" w:color="BFBFBF" w:sz="4"/>
+            </w:tcBorders>
+            <w:tcMar>
+              <w:top w:type="dxa" w:w="50"/>
+              <w:left w:type="dxa" w:w="90"/>
+              <w:bottom w:type="dxa" w:w="50"/>
+              <w:right w:type="dxa" w:w="90"/>
+            </w:tcMar>
+          </w:tcPr>
+          <w:p>
+            <w:pPr>
+              <w:jc w:val="right"/>
+            </w:pPr>
+            <w:r>
+              <w:rPr>
+                <w:rFonts w:ascii="Calibri" w:cs="Calibri" w:eastAsia="Calibri" w:hAnsi="Calibri"/>
+                <w:b w:val="false"/>
+                <w:bCs w:val="false"/>
+                <w:sz w:val="19"/>
+                <w:szCs w:val="19"/>
+              </w:rPr>
+              <w:t xml:space="preserve">1,0 × 10⁻⁹</w:t>
+            </w:r>
+          </w:p>
+        </w:tc>
+        <w:tc>
+          <w:tcPr>
+            <w:tcW w:type="dxa" w:w="2026"/>
+            <w:tcBorders>
+              <w:top w:val="single" w:color="BFBFBF" w:sz="4"/>
+              <w:left w:val="single" w:color="BFBFBF" w:sz="4"/>
+              <w:bottom w:val="single" w:color="BFBFBF" w:sz="4"/>
+              <w:right w:val="single" w:color="BFBFBF" w:sz="4"/>
+            </w:tcBorders>
+            <w:tcMar>
+              <w:top w:type="dxa" w:w="50"/>
+              <w:left w:type="dxa" w:w="90"/>
+              <w:bottom w:type="dxa" w:w="50"/>
+              <w:right w:type="dxa" w:w="90"/>
+            </w:tcMar>
+          </w:tcPr>
+          <w:p>
+            <w:pPr>
+              <w:jc w:val="right"/>
+            </w:pPr>
+            <w:r>
+              <w:rPr>
+                <w:rFonts w:ascii="Calibri" w:cs="Calibri" w:eastAsia="Calibri" w:hAnsi="Calibri"/>
+                <w:b w:val="false"/>
+                <w:bCs w:val="false"/>
+                <w:sz w:val="19"/>
+                <w:szCs w:val="19"/>
+              </w:rPr>
+              <w:t xml:space="preserve">–</w:t>
+            </w:r>
+          </w:p>
+        </w:tc>
+      </w:tr>
+      <w:tr>
+        <w:tc>
+          <w:tcPr>
+            <w:tcW w:type="dxa" w:w="1500"/>
+            <w:tcBorders>
+              <w:top w:val="single" w:color="BFBFBF" w:sz="4"/>
+              <w:left w:val="single" w:color="BFBFBF" w:sz="4"/>
+              <w:bottom w:val="single" w:color="BFBFBF" w:sz="4"/>
+              <w:right w:val="single" w:color="BFBFBF" w:sz="4"/>
+            </w:tcBorders>
+            <w:tcMar>
+              <w:top w:type="dxa" w:w="50"/>
+              <w:left w:type="dxa" w:w="90"/>
+              <w:bottom w:type="dxa" w:w="50"/>
+              <w:right w:type="dxa" w:w="90"/>
+            </w:tcMar>
+          </w:tcPr>
+          <w:p>
+            <w:pPr>
+              <w:jc w:val="left"/>
+            </w:pPr>
+            <w:r>
+              <w:rPr>
+                <w:rFonts w:ascii="Calibri" w:cs="Calibri" w:eastAsia="Calibri" w:hAnsi="Calibri"/>
+                <w:b w:val="false"/>
+                <w:bCs w:val="false"/>
+                <w:sz w:val="19"/>
+                <w:szCs w:val="19"/>
+              </w:rPr>
+              <w:t xml:space="preserve">0,65</w:t>
+            </w:r>
+          </w:p>
+        </w:tc>
+        <w:tc>
+          <w:tcPr>
+            <w:tcW w:type="dxa" w:w="1500"/>
+            <w:tcBorders>
+              <w:top w:val="single" w:color="BFBFBF" w:sz="4"/>
+              <w:left w:val="single" w:color="BFBFBF" w:sz="4"/>
+              <w:bottom w:val="single" w:color="BFBFBF" w:sz="4"/>
+              <w:right w:val="single" w:color="BFBFBF" w:sz="4"/>
+            </w:tcBorders>
+            <w:tcMar>
+              <w:top w:type="dxa" w:w="50"/>
+              <w:left w:type="dxa" w:w="90"/>
+              <w:bottom w:type="dxa" w:w="50"/>
+              <w:right w:type="dxa" w:w="90"/>
+            </w:tcMar>
+          </w:tcPr>
+          <w:p>
+            <w:pPr>
+              <w:jc w:val="right"/>
+            </w:pPr>
+            <w:r>
+              <w:rPr>
+                <w:rFonts w:ascii="Calibri" w:cs="Calibri" w:eastAsia="Calibri" w:hAnsi="Calibri"/>
+                <w:b w:val="false"/>
+                <w:bCs w:val="false"/>
+                <w:sz w:val="19"/>
+                <w:szCs w:val="19"/>
+              </w:rPr>
+              <w:t xml:space="preserve">13,7 dB</w:t>
+            </w:r>
+          </w:p>
+        </w:tc>
+        <w:tc>
+          <w:tcPr>
+            <w:tcW w:type="dxa" w:w="2000"/>
+            <w:tcBorders>
+              <w:top w:val="single" w:color="BFBFBF" w:sz="4"/>
+              <w:left w:val="single" w:color="BFBFBF" w:sz="4"/>
+              <w:bottom w:val="single" w:color="BFBFBF" w:sz="4"/>
+              <w:right w:val="single" w:color="BFBFBF" w:sz="4"/>
+            </w:tcBorders>
+            <w:tcMar>
+              <w:top w:type="dxa" w:w="50"/>
+              <w:left w:type="dxa" w:w="90"/>
+              <w:bottom w:type="dxa" w:w="50"/>
+              <w:right w:type="dxa" w:w="90"/>
+            </w:tcMar>
+          </w:tcPr>
+          <w:p>
+            <w:pPr>
+              <w:jc w:val="right"/>
+            </w:pPr>
+            <w:r>
+              <w:rPr>
+                <w:rFonts w:ascii="Calibri" w:cs="Calibri" w:eastAsia="Calibri" w:hAnsi="Calibri"/>
+                <w:b w:val="false"/>
+                <w:bCs w:val="false"/>
+                <w:sz w:val="19"/>
+                <w:szCs w:val="19"/>
+              </w:rPr>
+              <w:t xml:space="preserve">2,0 × 10⁻⁵</w:t>
+            </w:r>
+          </w:p>
+        </w:tc>
+        <w:tc>
+          <w:tcPr>
+            <w:tcW w:type="dxa" w:w="2000"/>
+            <w:tcBorders>
+              <w:top w:val="single" w:color="BFBFBF" w:sz="4"/>
+              <w:left w:val="single" w:color="BFBFBF" w:sz="4"/>
+              <w:bottom w:val="single" w:color="BFBFBF" w:sz="4"/>
+              <w:right w:val="single" w:color="BFBFBF" w:sz="4"/>
+            </w:tcBorders>
+            <w:tcMar>
+              <w:top w:type="dxa" w:w="50"/>
+              <w:left w:type="dxa" w:w="90"/>
+              <w:bottom w:type="dxa" w:w="50"/>
+              <w:right w:type="dxa" w:w="90"/>
+            </w:tcMar>
+          </w:tcPr>
+          <w:p>
+            <w:pPr>
+              <w:jc w:val="right"/>
+            </w:pPr>
+            <w:r>
+              <w:rPr>
+                <w:rFonts w:ascii="Calibri" w:cs="Calibri" w:eastAsia="Calibri" w:hAnsi="Calibri"/>
+                <w:b w:val="false"/>
+                <w:bCs w:val="false"/>
+                <w:sz w:val="19"/>
+                <w:szCs w:val="19"/>
+              </w:rPr>
+              <w:t xml:space="preserve">3,6 × 10⁻⁶</w:t>
+            </w:r>
+          </w:p>
+        </w:tc>
+        <w:tc>
+          <w:tcPr>
+            <w:tcW w:type="dxa" w:w="2026"/>
+            <w:tcBorders>
+              <w:top w:val="single" w:color="BFBFBF" w:sz="4"/>
+              <w:left w:val="single" w:color="BFBFBF" w:sz="4"/>
+              <w:bottom w:val="single" w:color="BFBFBF" w:sz="4"/>
+              <w:right w:val="single" w:color="BFBFBF" w:sz="4"/>
+            </w:tcBorders>
+            <w:tcMar>
+              <w:top w:type="dxa" w:w="50"/>
+              <w:left w:type="dxa" w:w="90"/>
+              <w:bottom w:type="dxa" w:w="50"/>
+              <w:right w:type="dxa" w:w="90"/>
+            </w:tcMar>
+          </w:tcPr>
+          <w:p>
+            <w:pPr>
+              <w:jc w:val="right"/>
+            </w:pPr>
+            <w:r>
+              <w:rPr>
+                <w:rFonts w:ascii="Calibri" w:cs="Calibri" w:eastAsia="Calibri" w:hAnsi="Calibri"/>
+                <w:b w:val="false"/>
+                <w:bCs w:val="false"/>
+                <w:sz w:val="19"/>
+                <w:szCs w:val="19"/>
+              </w:rPr>
+              <w:t xml:space="preserve">0,7 dB</w:t>
+            </w:r>
+          </w:p>
+        </w:tc>
+      </w:tr>
+      <w:tr>
+        <w:tc>
+          <w:tcPr>
+            <w:tcW w:type="dxa" w:w="1500"/>
+            <w:tcBorders>
+              <w:top w:val="single" w:color="BFBFBF" w:sz="4"/>
+              <w:left w:val="single" w:color="BFBFBF" w:sz="4"/>
+              <w:bottom w:val="single" w:color="BFBFBF" w:sz="4"/>
+              <w:right w:val="single" w:color="BFBFBF" w:sz="4"/>
+            </w:tcBorders>
+            <w:tcMar>
+              <w:top w:type="dxa" w:w="50"/>
+              <w:left w:type="dxa" w:w="90"/>
+              <w:bottom w:type="dxa" w:w="50"/>
+              <w:right w:type="dxa" w:w="90"/>
+            </w:tcMar>
+          </w:tcPr>
+          <w:p>
+            <w:pPr>
+              <w:jc w:val="left"/>
+            </w:pPr>
+            <w:r>
+              <w:rPr>
+                <w:rFonts w:ascii="Calibri" w:cs="Calibri" w:eastAsia="Calibri" w:hAnsi="Calibri"/>
+                <w:b w:val="false"/>
+                <w:bCs w:val="false"/>
+                <w:sz w:val="19"/>
+                <w:szCs w:val="19"/>
+              </w:rPr>
+              <w:t xml:space="preserve">0,80</w:t>
+            </w:r>
+          </w:p>
+        </w:tc>
+        <w:tc>
+          <w:tcPr>
+            <w:tcW w:type="dxa" w:w="1500"/>
+            <w:tcBorders>
+              <w:top w:val="single" w:color="BFBFBF" w:sz="4"/>
+              <w:left w:val="single" w:color="BFBFBF" w:sz="4"/>
+              <w:bottom w:val="single" w:color="BFBFBF" w:sz="4"/>
+              <w:right w:val="single" w:color="BFBFBF" w:sz="4"/>
+            </w:tcBorders>
+            <w:tcMar>
+              <w:top w:type="dxa" w:w="50"/>
+              <w:left w:type="dxa" w:w="90"/>
+              <w:bottom w:type="dxa" w:w="50"/>
+              <w:right w:type="dxa" w:w="90"/>
+            </w:tcMar>
+          </w:tcPr>
+          <w:p>
+            <w:pPr>
+              <w:jc w:val="right"/>
+            </w:pPr>
+            <w:r>
+              <w:rPr>
+                <w:rFonts w:ascii="Calibri" w:cs="Calibri" w:eastAsia="Calibri" w:hAnsi="Calibri"/>
+                <w:b w:val="false"/>
+                <w:bCs w:val="false"/>
+                <w:sz w:val="19"/>
+                <w:szCs w:val="19"/>
+              </w:rPr>
+              <w:t xml:space="preserve">11,9 dB</w:t>
+            </w:r>
+          </w:p>
+        </w:tc>
+        <w:tc>
+          <w:tcPr>
+            <w:tcW w:type="dxa" w:w="2000"/>
+            <w:tcBorders>
+              <w:top w:val="single" w:color="BFBFBF" w:sz="4"/>
+              <w:left w:val="single" w:color="BFBFBF" w:sz="4"/>
+              <w:bottom w:val="single" w:color="BFBFBF" w:sz="4"/>
+              <w:right w:val="single" w:color="BFBFBF" w:sz="4"/>
+            </w:tcBorders>
+            <w:tcMar>
+              <w:top w:type="dxa" w:w="50"/>
+              <w:left w:type="dxa" w:w="90"/>
+              <w:bottom w:type="dxa" w:w="50"/>
+              <w:right w:type="dxa" w:w="90"/>
+            </w:tcMar>
+          </w:tcPr>
+          <w:p>
+            <w:pPr>
+              <w:jc w:val="right"/>
+            </w:pPr>
+            <w:r>
+              <w:rPr>
+                <w:rFonts w:ascii="Calibri" w:cs="Calibri" w:eastAsia="Calibri" w:hAnsi="Calibri"/>
+                <w:b w:val="false"/>
+                <w:bCs w:val="false"/>
+                <w:sz w:val="19"/>
+                <w:szCs w:val="19"/>
+              </w:rPr>
+              <w:t xml:space="preserve">6,5 × 10⁻⁴</w:t>
+            </w:r>
+          </w:p>
+        </w:tc>
+        <w:tc>
+          <w:tcPr>
+            <w:tcW w:type="dxa" w:w="2000"/>
+            <w:tcBorders>
+              <w:top w:val="single" w:color="BFBFBF" w:sz="4"/>
+              <w:left w:val="single" w:color="BFBFBF" w:sz="4"/>
+              <w:bottom w:val="single" w:color="BFBFBF" w:sz="4"/>
+              <w:right w:val="single" w:color="BFBFBF" w:sz="4"/>
+            </w:tcBorders>
+            <w:tcMar>
+              <w:top w:type="dxa" w:w="50"/>
+              <w:left w:type="dxa" w:w="90"/>
+              <w:bottom w:type="dxa" w:w="50"/>
+              <w:right w:type="dxa" w:w="90"/>
+            </w:tcMar>
+          </w:tcPr>
+          <w:p>
+            <w:pPr>
+              <w:jc w:val="right"/>
+            </w:pPr>
+            <w:r>
+              <w:rPr>
+                <w:rFonts w:ascii="Calibri" w:cs="Calibri" w:eastAsia="Calibri" w:hAnsi="Calibri"/>
+                <w:b w:val="false"/>
+                <w:bCs w:val="false"/>
+                <w:sz w:val="19"/>
+                <w:szCs w:val="19"/>
+              </w:rPr>
+              <w:t xml:space="preserve">2,0 × 10⁻⁴</w:t>
+            </w:r>
+          </w:p>
+        </w:tc>
+        <w:tc>
+          <w:tcPr>
+            <w:tcW w:type="dxa" w:w="2026"/>
+            <w:tcBorders>
+              <w:top w:val="single" w:color="BFBFBF" w:sz="4"/>
+              <w:left w:val="single" w:color="BFBFBF" w:sz="4"/>
+              <w:bottom w:val="single" w:color="BFBFBF" w:sz="4"/>
+              <w:right w:val="single" w:color="BFBFBF" w:sz="4"/>
+            </w:tcBorders>
+            <w:tcMar>
+              <w:top w:type="dxa" w:w="50"/>
+              <w:left w:type="dxa" w:w="90"/>
+              <w:bottom w:type="dxa" w:w="50"/>
+              <w:right w:type="dxa" w:w="90"/>
+            </w:tcMar>
+          </w:tcPr>
+          <w:p>
+            <w:pPr>
+              <w:jc w:val="right"/>
+            </w:pPr>
+            <w:r>
+              <w:rPr>
+                <w:rFonts w:ascii="Calibri" w:cs="Calibri" w:eastAsia="Calibri" w:hAnsi="Calibri"/>
+                <w:b w:val="false"/>
+                <w:bCs w:val="false"/>
+                <w:sz w:val="19"/>
+                <w:szCs w:val="19"/>
+              </w:rPr>
+              <w:t xml:space="preserve">0,7 dB</w:t>
+            </w:r>
+          </w:p>
+        </w:tc>
+      </w:tr>
+      <w:tr>
+        <w:tc>
+          <w:tcPr>
+            <w:tcW w:type="dxa" w:w="1500"/>
+            <w:tcBorders>
+              <w:top w:val="single" w:color="BFBFBF" w:sz="4"/>
+              <w:left w:val="single" w:color="BFBFBF" w:sz="4"/>
+              <w:bottom w:val="single" w:color="BFBFBF" w:sz="4"/>
+              <w:right w:val="single" w:color="BFBFBF" w:sz="4"/>
+            </w:tcBorders>
+            <w:tcMar>
+              <w:top w:type="dxa" w:w="50"/>
+              <w:left w:type="dxa" w:w="90"/>
+              <w:bottom w:type="dxa" w:w="50"/>
+              <w:right w:type="dxa" w:w="90"/>
+            </w:tcMar>
+          </w:tcPr>
+          <w:p>
+            <w:pPr>
+              <w:jc w:val="left"/>
+            </w:pPr>
+            <w:r>
+              <w:rPr>
+                <w:rFonts w:ascii="Calibri" w:cs="Calibri" w:eastAsia="Calibri" w:hAnsi="Calibri"/>
+                <w:b w:val="false"/>
+                <w:bCs w:val="false"/>
+                <w:sz w:val="19"/>
+                <w:szCs w:val="19"/>
+              </w:rPr>
+              <w:t xml:space="preserve">1,00</w:t>
+            </w:r>
+          </w:p>
+        </w:tc>
+        <w:tc>
+          <w:tcPr>
+            <w:tcW w:type="dxa" w:w="1500"/>
+            <w:tcBorders>
+              <w:top w:val="single" w:color="BFBFBF" w:sz="4"/>
+              <w:left w:val="single" w:color="BFBFBF" w:sz="4"/>
+              <w:bottom w:val="single" w:color="BFBFBF" w:sz="4"/>
+              <w:right w:val="single" w:color="BFBFBF" w:sz="4"/>
+            </w:tcBorders>
+            <w:tcMar>
+              <w:top w:type="dxa" w:w="50"/>
+              <w:left w:type="dxa" w:w="90"/>
+              <w:bottom w:type="dxa" w:w="50"/>
+              <w:right w:type="dxa" w:w="90"/>
+            </w:tcMar>
+          </w:tcPr>
+          <w:p>
+            <w:pPr>
+              <w:jc w:val="right"/>
+            </w:pPr>
+            <w:r>
+              <w:rPr>
+                <w:rFonts w:ascii="Calibri" w:cs="Calibri" w:eastAsia="Calibri" w:hAnsi="Calibri"/>
+                <w:b w:val="false"/>
+                <w:bCs w:val="false"/>
+                <w:sz w:val="19"/>
+                <w:szCs w:val="19"/>
+              </w:rPr>
+              <w:t xml:space="preserve">10,0 dB</w:t>
+            </w:r>
+          </w:p>
+        </w:tc>
+        <w:tc>
+          <w:tcPr>
+            <w:tcW w:type="dxa" w:w="2000"/>
+            <w:tcBorders>
+              <w:top w:val="single" w:color="BFBFBF" w:sz="4"/>
+              <w:left w:val="single" w:color="BFBFBF" w:sz="4"/>
+              <w:bottom w:val="single" w:color="BFBFBF" w:sz="4"/>
+              <w:right w:val="single" w:color="BFBFBF" w:sz="4"/>
+            </w:tcBorders>
+            <w:tcMar>
+              <w:top w:type="dxa" w:w="50"/>
+              <w:left w:type="dxa" w:w="90"/>
+              <w:bottom w:type="dxa" w:w="50"/>
+              <w:right w:type="dxa" w:w="90"/>
+            </w:tcMar>
+          </w:tcPr>
+          <w:p>
+            <w:pPr>
+              <w:jc w:val="right"/>
+            </w:pPr>
+            <w:r>
+              <w:rPr>
+                <w:rFonts w:ascii="Calibri" w:cs="Calibri" w:eastAsia="Calibri" w:hAnsi="Calibri"/>
+                <w:b w:val="false"/>
+                <w:bCs w:val="false"/>
+                <w:sz w:val="19"/>
+                <w:szCs w:val="19"/>
+              </w:rPr>
+              <w:t xml:space="preserve">7,4 × 10⁻³</w:t>
+            </w:r>
+          </w:p>
+        </w:tc>
+        <w:tc>
+          <w:tcPr>
+            <w:tcW w:type="dxa" w:w="2000"/>
+            <w:tcBorders>
+              <w:top w:val="single" w:color="BFBFBF" w:sz="4"/>
+              <w:left w:val="single" w:color="BFBFBF" w:sz="4"/>
+              <w:bottom w:val="single" w:color="BFBFBF" w:sz="4"/>
+              <w:right w:val="single" w:color="BFBFBF" w:sz="4"/>
+            </w:tcBorders>
+            <w:tcMar>
+              <w:top w:type="dxa" w:w="50"/>
+              <w:left w:type="dxa" w:w="90"/>
+              <w:bottom w:type="dxa" w:w="50"/>
+              <w:right w:type="dxa" w:w="90"/>
+            </w:tcMar>
+          </w:tcPr>
+          <w:p>
+            <w:pPr>
+              <w:jc w:val="right"/>
+            </w:pPr>
+            <w:r>
+              <w:rPr>
+                <w:rFonts w:ascii="Calibri" w:cs="Calibri" w:eastAsia="Calibri" w:hAnsi="Calibri"/>
+                <w:b w:val="false"/>
+                <w:bCs w:val="false"/>
+                <w:sz w:val="19"/>
+                <w:szCs w:val="19"/>
+              </w:rPr>
+              <w:t xml:space="preserve">3,4 × 10⁻³</w:t>
+            </w:r>
+          </w:p>
+        </w:tc>
+        <w:tc>
+          <w:tcPr>
+            <w:tcW w:type="dxa" w:w="2026"/>
+            <w:tcBorders>
+              <w:top w:val="single" w:color="BFBFBF" w:sz="4"/>
+              <w:left w:val="single" w:color="BFBFBF" w:sz="4"/>
+              <w:bottom w:val="single" w:color="BFBFBF" w:sz="4"/>
+              <w:right w:val="single" w:color="BFBFBF" w:sz="4"/>
+            </w:tcBorders>
+            <w:tcMar>
+              <w:top w:type="dxa" w:w="50"/>
+              <w:left w:type="dxa" w:w="90"/>
+              <w:bottom w:type="dxa" w:w="50"/>
+              <w:right w:type="dxa" w:w="90"/>
+            </w:tcMar>
+          </w:tcPr>
+          <w:p>
+            <w:pPr>
+              <w:jc w:val="right"/>
+            </w:pPr>
+            <w:r>
+              <w:rPr>
+                <w:rFonts w:ascii="Calibri" w:cs="Calibri" w:eastAsia="Calibri" w:hAnsi="Calibri"/>
+                <w:b w:val="false"/>
+                <w:bCs w:val="false"/>
+                <w:sz w:val="19"/>
+                <w:szCs w:val="19"/>
+              </w:rPr>
+              <w:t xml:space="preserve">0,7 dB</w:t>
+            </w:r>
+          </w:p>
+        </w:tc>
+      </w:tr>
+    </w:tbl>
+    <w:p>
+      <w:pPr>
+        <w:spacing w:after="200" w:before="60"/>
+        <w:jc w:val="center"/>
+      </w:pPr>
+      <w:r>
+        <w:rPr>
+          <w:rFonts w:ascii="Calibri" w:cs="Calibri" w:eastAsia="Calibri" w:hAnsi="Calibri"/>
+          <w:i/>
+          <w:iCs/>
+          <w:color w:val="595959"/>
+          <w:sz w:val="19"/>
+          <w:szCs w:val="19"/>
+        </w:rPr>
+        <w:t xml:space="preserve">Tabla 13. BER medida con integrador (100 000 bits por punto) frente a la teoría de 2-FSK no coherente, Pb = ½·exp(−Eb/N0 / 2).</w:t>
+      </w:r>
+    </w:p>
+    <w:p>
+      <w:pPr>
+        <w:jc w:val="center"/>
+      </w:pPr>
+      <w:r>
+        <w:drawing>
+          <wp:inline distT="0" distB="0" distL="0" distR="0">
+            <wp:extent cx="5524500" cy="3676650"/>
+            <wp:effectExtent t="0" r="0" b="0" l="0"/>
+            <wp:docPr id="1" name="" descr="" title=""/>
+            <wp:cNvGraphicFramePr>
+              <a:graphicFrameLocks xmlns:a="http://schemas.openxmlformats.org/drawingml/2006/main" noChangeAspect="1"/>
+            </wp:cNvGraphicFramePr>
+            <a:graphic xmlns:a="http://schemas.openxmlformats.org/drawingml/2006/main">
+              <a:graphicData uri="http://schemas.openxmlformats.org/drawingml/2006/picture">
+                <pic:pic xmlns:pic="http://schemas.openxmlformats.org/drawingml/2006/picture">
+                  <pic:nvPicPr>
+                    <pic:cNvPr id="0" name="" descr=""/>
+                    <pic:cNvPicPr>
+                      <a:picLocks noChangeAspect="1" noChangeArrowheads="1"/>
+                    </pic:cNvPicPr>
+                  </pic:nvPicPr>
+                  <pic:blipFill>
+                    <a:blip r:embed="rId11" cstate="none"/>
+                    <a:srcRect/>
+                    <a:stretch>
+                      <a:fillRect/>
+                    </a:stretch>
+                  </pic:blipFill>
+                  <pic:spPr bwMode="auto">
+                    <a:xfrm>
+                      <a:off x="0" y="0"/>
+                      <a:ext cx="5524500" cy="3676650"/>
+                    </a:xfrm>
+                    <a:prstGeom prst="rect">
+                      <a:avLst/>
+                    </a:prstGeom>
+                  </pic:spPr>
+                </pic:pic>
+              </a:graphicData>
+            </a:graphic>
+          </wp:inline>
+        </w:drawing>
+      </w:r>
+    </w:p>
+    <w:p>
+      <w:pPr>
+        <w:spacing w:after="200" w:before="60"/>
+        <w:jc w:val="center"/>
+      </w:pPr>
+      <w:r>
+        <w:rPr>
+          <w:rFonts w:ascii="Calibri" w:cs="Calibri" w:eastAsia="Calibri" w:hAnsi="Calibri"/>
+          <w:i/>
+          <w:iCs/>
+          <w:color w:val="595959"/>
+          <w:sz w:val="19"/>
+          <w:szCs w:val="19"/>
+        </w:rPr>
+        <w:t xml:space="preserve">Figura 3. Curva de BER frente a Eb/N0: teoría y medidas con y sin integrador (analysis/curva_ber.py).</w:t>
+      </w:r>
+    </w:p>
+    <w:p>
+      <w:pPr>
+        <w:spacing w:after="140" w:line="276"/>
+        <w:jc w:val="both"/>
+      </w:pPr>
+      <w:r>
+        <w:rPr>
+          <w:rFonts w:ascii="Calibri" w:cs="Calibri" w:eastAsia="Calibri" w:hAnsi="Calibri"/>
+          <w:sz w:val="22"/>
+          <w:szCs w:val="22"/>
+        </w:rPr>
+        <w:t xml:space="preserve">La pérdida de implementación es la diferencia entre el Eb/N0 al que se mide una BER y el que necesitaría la teoría para esa misma BER. Con integrador es de unos 0,7 dB, constante en todo el rango; sin integrador, leyendo una sola muestra por bit, era de unos 2,5 dB. El integrador aporta por tanto unos 1,8 dB, que se suman a los 6,7 dB del filtro paso bajo.</w:t>
+      </w:r>
+    </w:p>
+    <w:tbl>
+      <w:tblPr>
+        <w:tblW w:type="dxa" w:w="9026"/>
+        <w:tblBorders>
+          <w:top w:val="single" w:color="auto" w:sz="4"/>
+          <w:left w:val="single" w:color="auto" w:sz="4"/>
+          <w:bottom w:val="single" w:color="auto" w:sz="4"/>
+          <w:right w:val="single" w:color="auto" w:sz="4"/>
+          <w:insideH w:val="single" w:color="auto" w:sz="4"/>
+          <w:insideV w:val="single" w:color="auto" w:sz="4"/>
+        </w:tblBorders>
+      </w:tblPr>
+      <w:tblGrid>
+        <w:gridCol w:w="9026"/>
+      </w:tblGrid>
+      <w:tr>
+        <w:tc>
+          <w:tcPr>
+            <w:tcW w:type="dxa" w:w="9026"/>
+            <w:tcBorders>
+              <w:top w:val="none" w:color="FFFFFF" w:sz="0"/>
+              <w:left w:val="single" w:color="2E75B6" w:sz="24"/>
+              <w:bottom w:val="none" w:color="FFFFFF" w:sz="0"/>
+              <w:right w:val="none" w:color="FFFFFF" w:sz="0"/>
+            </w:tcBorders>
+            <w:shd w:fill="DEEAF6" w:color="auto" w:val="clear"/>
+            <w:tcMar>
+              <w:top w:type="dxa" w:w="120"/>
+              <w:left w:type="dxa" w:w="180"/>
+              <w:bottom w:type="dxa" w:w="100"/>
+              <w:right w:type="dxa" w:w="180"/>
+            </w:tcMar>
+          </w:tcPr>
+          <w:p>
+            <w:pPr>
+              <w:spacing w:after="80"/>
+            </w:pPr>
+            <w:r>
+              <w:rPr>
+                <w:rFonts w:ascii="Calibri" w:cs="Calibri" w:eastAsia="Calibri" w:hAnsi="Calibri"/>
+                <w:b/>
+                <w:bCs/>
+                <w:color w:val="2E75B6"/>
+                <w:sz w:val="22"/>
+                <w:szCs w:val="22"/>
+              </w:rPr>
+              <w:t xml:space="preserve">Conclusión</w:t>
+            </w:r>
+          </w:p>
+          <w:p>
+            <w:pPr>
+              <w:spacing w:after="140" w:line="276"/>
+              <w:jc w:val="left"/>
+            </w:pPr>
+            <w:r>
+              <w:rPr>
+                <w:rFonts w:ascii="Calibri" w:cs="Calibri" w:eastAsia="Calibri" w:hAnsi="Calibri"/>
+                <w:sz w:val="22"/>
+                <w:szCs w:val="22"/>
+              </w:rPr>
+              <w:t xml:space="preserve">El receptor simulado queda a 0,7 dB del límite teórico, un valor muy razonable para un demodulador por discriminador. Para alcanzar la BER objetivo de 10⁻⁵ se necesitan unos 14,1 dB de Eb/N0. Estos 0,7 dB, más un margen por las imperfecciones del hardware real, son las pérdidas de implementación que deben figurar en el balance de enlace (se supusieron 3 dB, valor conservador).</w:t>
+            </w:r>
+          </w:p>
+        </w:tc>
+      </w:tr>
+    </w:tbl>
+    <w:tbl>
+      <w:tblPr>
+        <w:tblW w:type="dxa" w:w="9026"/>
+        <w:tblBorders>
+          <w:top w:val="single" w:color="auto" w:sz="4"/>
+          <w:left w:val="single" w:color="auto" w:sz="4"/>
+          <w:bottom w:val="single" w:color="auto" w:sz="4"/>
+          <w:right w:val="single" w:color="auto" w:sz="4"/>
+          <w:insideH w:val="single" w:color="auto" w:sz="4"/>
+          <w:insideV w:val="single" w:color="auto" w:sz="4"/>
+        </w:tblBorders>
+      </w:tblPr>
+      <w:tblGrid>
+        <w:gridCol w:w="9026"/>
+      </w:tblGrid>
+      <w:tr>
+        <w:tc>
+          <w:tcPr>
+            <w:tcW w:type="dxa" w:w="9026"/>
+            <w:tcBorders>
+              <w:top w:val="none" w:color="FFFFFF" w:sz="0"/>
+              <w:left w:val="single" w:color="548235" w:sz="24"/>
+              <w:bottom w:val="none" w:color="FFFFFF" w:sz="0"/>
+              <w:right w:val="none" w:color="FFFFFF" w:sz="0"/>
+            </w:tcBorders>
+            <w:shd w:fill="E2EFDA" w:color="auto" w:val="clear"/>
+            <w:tcMar>
+              <w:top w:type="dxa" w:w="120"/>
+              <w:left w:type="dxa" w:w="180"/>
+              <w:bottom w:type="dxa" w:w="100"/>
+              <w:right w:type="dxa" w:w="180"/>
+            </w:tcMar>
+          </w:tcPr>
+          <w:p>
+            <w:pPr>
+              <w:spacing w:after="80"/>
+            </w:pPr>
+            <w:r>
+              <w:rPr>
+                <w:rFonts w:ascii="Calibri" w:cs="Calibri" w:eastAsia="Calibri" w:hAnsi="Calibri"/>
+                <w:b/>
+                <w:bCs/>
+                <w:color w:val="548235"/>
+                <w:sz w:val="22"/>
+                <w:szCs w:val="22"/>
+              </w:rPr>
+              <w:t xml:space="preserve">Lección aprendida</w:t>
+            </w:r>
+          </w:p>
+          <w:p>
+            <w:pPr>
+              <w:spacing w:after="140" w:line="276"/>
+              <w:jc w:val="left"/>
+            </w:pPr>
+            <w:r>
+              <w:rPr>
+                <w:rFonts w:ascii="Calibri" w:cs="Calibri" w:eastAsia="Calibri" w:hAnsi="Calibri"/>
+                <w:sz w:val="22"/>
+                <w:szCs w:val="22"/>
+              </w:rPr>
+              <w:t xml:space="preserve">La estimación visual del umbral (13,7 dB) parecía coincidir con la teoría, pero la medida con contador mostró una BER de 7,6 × 10⁻⁴ en ese punto sin integrador. En ingeniería de RF no se valida a ojo: se mide la BER con suficientes bits (al menos 10/BER).</w:t>
+            </w:r>
+          </w:p>
+        </w:tc>
+      </w:tr>
+    </w:tbl>
+    <w:p>
+      <w:pPr>
+        <w:pStyle w:val="Heading2"/>
+        <w:spacing w:after="120" w:before="260"/>
+      </w:pPr>
+      <w:r>
+        <w:rPr>
+          <w:rFonts w:ascii="Calibri" w:cs="Calibri" w:eastAsia="Calibri" w:hAnsi="Calibri"/>
+          <w:b/>
+          <w:bCs/>
+          <w:color w:val="1F4E79"/>
+          <w:sz w:val="26"/>
+          <w:szCs w:val="26"/>
+        </w:rPr>
+        <w:t xml:space="preserve">10.6 Interpretación: umbral de Eb/N0, sensibilidad y margen</w:t>
+      </w:r>
+    </w:p>
+    <w:p>
+      <w:pPr>
+        <w:pStyle w:val="Heading3"/>
+        <w:spacing w:after="100" w:before="200"/>
+      </w:pPr>
+      <w:r>
+        <w:rPr>
+          <w:rFonts w:ascii="Calibri" w:cs="Calibri" w:eastAsia="Calibri" w:hAnsi="Calibri"/>
+          <w:b/>
+          <w:bCs/>
+          <w:color w:val="2E75B6"/>
+          <w:sz w:val="23"/>
+          <w:szCs w:val="23"/>
+        </w:rPr>
+        <w:t xml:space="preserve">Qué significan los 14 dB</w:t>
+      </w:r>
+    </w:p>
+    <w:p>
+      <w:pPr>
+        <w:spacing w:after="140" w:line="276"/>
+        <w:jc w:val="both"/>
+      </w:pPr>
+      <w:r>
+        <w:rPr>
+          <w:rFonts w:ascii="Calibri" w:cs="Calibri" w:eastAsia="Calibri" w:hAnsi="Calibri"/>
+          <w:sz w:val="22"/>
+          <w:szCs w:val="22"/>
+        </w:rPr>
+        <w:t xml:space="preserve">Los 14,1 dB son una propiedad del demodulador (modulación 2-FSK más 0,7 dB de pérdida de implementación): es el Eb/N0 que debe llegarle para cometer menos de un error cada 100 000 bits. No exigen por sí solos más potencia al emisor ni más sensibilidad al receptor; se pueden alcanzar actuando sobre cualquier término del balance de enlace:</w:t>
+      </w:r>
+    </w:p>
+    <w:p>
+      <w:pPr>
+        <w:spacing w:after="140" w:line="276"/>
+        <w:jc w:val="center"/>
+      </w:pPr>
+      <w:r>
+        <w:rPr>
+          <w:rFonts w:ascii="Calibri" w:cs="Calibri" w:eastAsia="Calibri" w:hAnsi="Calibri"/>
+          <w:i/>
+          <w:iCs/>
+          <w:sz w:val="22"/>
+          <w:szCs w:val="22"/>
+        </w:rPr>
+        <w:t xml:space="preserve">Eb/N0 recibido = P</w:t>
+      </w:r>
+      <w:r>
+        <w:rPr>
+          <w:rFonts w:ascii="Calibri" w:cs="Calibri" w:eastAsia="Calibri" w:hAnsi="Calibri"/>
+          <w:i/>
+          <w:iCs/>
+          <w:sz w:val="22"/>
+          <w:szCs w:val="22"/>
+          <w:vertAlign w:val="subscript"/>
+        </w:rPr>
+        <w:t xml:space="preserve">TX</w:t>
+      </w:r>
+      <w:r>
+        <w:rPr>
+          <w:rFonts w:ascii="Calibri" w:cs="Calibri" w:eastAsia="Calibri" w:hAnsi="Calibri"/>
+          <w:i/>
+          <w:iCs/>
+          <w:sz w:val="22"/>
+          <w:szCs w:val="22"/>
+        </w:rPr>
+        <w:t xml:space="preserve"> + G</w:t>
+      </w:r>
+      <w:r>
+        <w:rPr>
+          <w:rFonts w:ascii="Calibri" w:cs="Calibri" w:eastAsia="Calibri" w:hAnsi="Calibri"/>
+          <w:i/>
+          <w:iCs/>
+          <w:sz w:val="22"/>
+          <w:szCs w:val="22"/>
+          <w:vertAlign w:val="subscript"/>
+        </w:rPr>
+        <w:t xml:space="preserve">TX</w:t>
+      </w:r>
+      <w:r>
+        <w:rPr>
+          <w:rFonts w:ascii="Calibri" w:cs="Calibri" w:eastAsia="Calibri" w:hAnsi="Calibri"/>
+          <w:i/>
+          <w:iCs/>
+          <w:sz w:val="22"/>
+          <w:szCs w:val="22"/>
+        </w:rPr>
+        <w:t xml:space="preserve"> − L</w:t>
+      </w:r>
+      <w:r>
+        <w:rPr>
+          <w:rFonts w:ascii="Calibri" w:cs="Calibri" w:eastAsia="Calibri" w:hAnsi="Calibri"/>
+          <w:i/>
+          <w:iCs/>
+          <w:sz w:val="22"/>
+          <w:szCs w:val="22"/>
+          <w:vertAlign w:val="subscript"/>
+        </w:rPr>
+        <w:t xml:space="preserve">camino</w:t>
+      </w:r>
+      <w:r>
+        <w:rPr>
+          <w:rFonts w:ascii="Calibri" w:cs="Calibri" w:eastAsia="Calibri" w:hAnsi="Calibri"/>
+          <w:i/>
+          <w:iCs/>
+          <w:sz w:val="22"/>
+          <w:szCs w:val="22"/>
+        </w:rPr>
+        <w:t xml:space="preserve"> + G</w:t>
+      </w:r>
+      <w:r>
+        <w:rPr>
+          <w:rFonts w:ascii="Calibri" w:cs="Calibri" w:eastAsia="Calibri" w:hAnsi="Calibri"/>
+          <w:i/>
+          <w:iCs/>
+          <w:sz w:val="22"/>
+          <w:szCs w:val="22"/>
+          <w:vertAlign w:val="subscript"/>
+        </w:rPr>
+        <w:t xml:space="preserve">RX</w:t>
+      </w:r>
+      <w:r>
+        <w:rPr>
+          <w:rFonts w:ascii="Calibri" w:cs="Calibri" w:eastAsia="Calibri" w:hAnsi="Calibri"/>
+          <w:i/>
+          <w:iCs/>
+          <w:sz w:val="22"/>
+          <w:szCs w:val="22"/>
+        </w:rPr>
+        <w:t xml:space="preserve"> − L</w:t>
+      </w:r>
+      <w:r>
+        <w:rPr>
+          <w:rFonts w:ascii="Calibri" w:cs="Calibri" w:eastAsia="Calibri" w:hAnsi="Calibri"/>
+          <w:i/>
+          <w:iCs/>
+          <w:sz w:val="22"/>
+          <w:szCs w:val="22"/>
+          <w:vertAlign w:val="subscript"/>
+        </w:rPr>
+        <w:t xml:space="preserve">cables</w:t>
+      </w:r>
+      <w:r>
+        <w:rPr>
+          <w:rFonts w:ascii="Calibri" w:cs="Calibri" w:eastAsia="Calibri" w:hAnsi="Calibri"/>
+          <w:i/>
+          <w:iCs/>
+          <w:sz w:val="22"/>
+          <w:szCs w:val="22"/>
+        </w:rPr>
+        <w:t xml:space="preserve"> − (kT + NF) − 10·log10(R</w:t>
+      </w:r>
+      <w:r>
+        <w:rPr>
+          <w:rFonts w:ascii="Calibri" w:cs="Calibri" w:eastAsia="Calibri" w:hAnsi="Calibri"/>
+          <w:i/>
+          <w:iCs/>
+          <w:sz w:val="22"/>
+          <w:szCs w:val="22"/>
+          <w:vertAlign w:val="subscript"/>
+        </w:rPr>
+        <w:t xml:space="preserve">b</w:t>
+      </w:r>
+      <w:r>
+        <w:rPr>
+          <w:rFonts w:ascii="Calibri" w:cs="Calibri" w:eastAsia="Calibri" w:hAnsi="Calibri"/>
+          <w:i/>
+          <w:iCs/>
+          <w:sz w:val="22"/>
+          <w:szCs w:val="22"/>
+        </w:rPr>
+        <w:t xml:space="preserve">)</w:t>
+      </w:r>
+    </w:p>
+    <w:tbl>
+      <w:tblPr>
+        <w:tblW w:type="dxa" w:w="9026"/>
+        <w:tblBorders>
+          <w:top w:val="single" w:color="auto" w:sz="4"/>
+          <w:left w:val="single" w:color="auto" w:sz="4"/>
+          <w:bottom w:val="single" w:color="auto" w:sz="4"/>
+          <w:right w:val="single" w:color="auto" w:sz="4"/>
+          <w:insideH w:val="single" w:color="auto" w:sz="4"/>
+          <w:insideV w:val="single" w:color="auto" w:sz="4"/>
+        </w:tblBorders>
+      </w:tblPr>
+      <w:tblGrid>
+        <w:gridCol w:w="2600"/>
+        <w:gridCol w:w="3900"/>
+        <w:gridCol w:w="2526"/>
+      </w:tblGrid>
+      <w:tr>
+        <w:trPr>
+          <w:tblHeader/>
+        </w:trPr>
+        <w:tc>
+          <w:tcPr>
+            <w:tcW w:type="dxa" w:w="2600"/>
+            <w:tcBorders>
+              <w:top w:val="single" w:color="BFBFBF" w:sz="4"/>
+              <w:left w:val="single" w:color="BFBFBF" w:sz="4"/>
+              <w:bottom w:val="single" w:color="BFBFBF" w:sz="4"/>
+              <w:right w:val="single" w:color="BFBFBF" w:sz="4"/>
+            </w:tcBorders>
+            <w:shd w:fill="1F4E79" w:color="auto" w:val="clear"/>
+            <w:tcMar>
+              <w:top w:type="dxa" w:w="50"/>
+              <w:left w:type="dxa" w:w="90"/>
+              <w:bottom w:type="dxa" w:w="50"/>
+              <w:right w:type="dxa" w:w="90"/>
+            </w:tcMar>
+          </w:tcPr>
+          <w:p>
+            <w:pPr>
+              <w:jc w:val="left"/>
+            </w:pPr>
+            <w:r>
+              <w:rPr>
+                <w:rFonts w:ascii="Calibri" w:cs="Calibri" w:eastAsia="Calibri" w:hAnsi="Calibri"/>
+                <w:b/>
+                <w:bCs/>
+                <w:color w:val="FFFFFF"/>
+                <w:sz w:val="19"/>
+                <w:szCs w:val="19"/>
+              </w:rPr>
+              <w:t xml:space="preserve">Palanca</w:t>
+            </w:r>
+          </w:p>
+        </w:tc>
+        <w:tc>
+          <w:tcPr>
+            <w:tcW w:type="dxa" w:w="3900"/>
+            <w:tcBorders>
+              <w:top w:val="single" w:color="BFBFBF" w:sz="4"/>
+              <w:left w:val="single" w:color="BFBFBF" w:sz="4"/>
+              <w:bottom w:val="single" w:color="BFBFBF" w:sz="4"/>
+              <w:right w:val="single" w:color="BFBFBF" w:sz="4"/>
+            </w:tcBorders>
+            <w:shd w:fill="1F4E79" w:color="auto" w:val="clear"/>
+            <w:tcMar>
+              <w:top w:type="dxa" w:w="50"/>
+              <w:left w:type="dxa" w:w="90"/>
+              <w:bottom w:type="dxa" w:w="50"/>
+              <w:right w:type="dxa" w:w="90"/>
+            </w:tcMar>
+          </w:tcPr>
+          <w:p>
+            <w:pPr>
+              <w:jc w:val="left"/>
+            </w:pPr>
+            <w:r>
+              <w:rPr>
+                <w:rFonts w:ascii="Calibri" w:cs="Calibri" w:eastAsia="Calibri" w:hAnsi="Calibri"/>
+                <w:b/>
+                <w:bCs/>
+                <w:color w:val="FFFFFF"/>
+                <w:sz w:val="19"/>
+                <w:szCs w:val="19"/>
+              </w:rPr>
+              <w:t xml:space="preserve">Ejemplo en el proyecto</w:t>
+            </w:r>
+          </w:p>
+        </w:tc>
+        <w:tc>
+          <w:tcPr>
+            <w:tcW w:type="dxa" w:w="2526"/>
+            <w:tcBorders>
+              <w:top w:val="single" w:color="BFBFBF" w:sz="4"/>
+              <w:left w:val="single" w:color="BFBFBF" w:sz="4"/>
+              <w:bottom w:val="single" w:color="BFBFBF" w:sz="4"/>
+              <w:right w:val="single" w:color="BFBFBF" w:sz="4"/>
+            </w:tcBorders>
+            <w:shd w:fill="1F4E79" w:color="auto" w:val="clear"/>
+            <w:tcMar>
+              <w:top w:type="dxa" w:w="50"/>
+              <w:left w:type="dxa" w:w="90"/>
+              <w:bottom w:type="dxa" w:w="50"/>
+              <w:right w:type="dxa" w:w="90"/>
+            </w:tcMar>
+          </w:tcPr>
+          <w:p>
+            <w:pPr>
+              <w:jc w:val="left"/>
+            </w:pPr>
+            <w:r>
+              <w:rPr>
+                <w:rFonts w:ascii="Calibri" w:cs="Calibri" w:eastAsia="Calibri" w:hAnsi="Calibri"/>
+                <w:b/>
+                <w:bCs/>
+                <w:color w:val="FFFFFF"/>
+                <w:sz w:val="19"/>
+                <w:szCs w:val="19"/>
+              </w:rPr>
+              <w:t xml:space="preserve">Efecto aproximado</w:t>
+            </w:r>
+          </w:p>
+        </w:tc>
+      </w:tr>
+      <w:tr>
+        <w:tc>
+          <w:tcPr>
+            <w:tcW w:type="dxa" w:w="2600"/>
+            <w:tcBorders>
+              <w:top w:val="single" w:color="BFBFBF" w:sz="4"/>
+              <w:left w:val="single" w:color="BFBFBF" w:sz="4"/>
+              <w:bottom w:val="single" w:color="BFBFBF" w:sz="4"/>
+              <w:right w:val="single" w:color="BFBFBF" w:sz="4"/>
+            </w:tcBorders>
+            <w:tcMar>
+              <w:top w:type="dxa" w:w="50"/>
+              <w:left w:type="dxa" w:w="90"/>
+              <w:bottom w:type="dxa" w:w="50"/>
+              <w:right w:type="dxa" w:w="90"/>
+            </w:tcMar>
+          </w:tcPr>
+          <w:p>
+            <w:pPr>
+              <w:jc w:val="left"/>
+            </w:pPr>
+            <w:r>
+              <w:rPr>
+                <w:rFonts w:ascii="Calibri" w:cs="Calibri" w:eastAsia="Calibri" w:hAnsi="Calibri"/>
+                <w:b w:val="false"/>
+                <w:bCs w:val="false"/>
+                <w:sz w:val="19"/>
+                <w:szCs w:val="19"/>
+              </w:rPr>
+              <w:t xml:space="preserve">Potencia del emisor</w:t>
+            </w:r>
+          </w:p>
+        </w:tc>
+        <w:tc>
+          <w:tcPr>
+            <w:tcW w:type="dxa" w:w="3900"/>
+            <w:tcBorders>
+              <w:top w:val="single" w:color="BFBFBF" w:sz="4"/>
+              <w:left w:val="single" w:color="BFBFBF" w:sz="4"/>
+              <w:bottom w:val="single" w:color="BFBFBF" w:sz="4"/>
+              <w:right w:val="single" w:color="BFBFBF" w:sz="4"/>
+            </w:tcBorders>
+            <w:tcMar>
+              <w:top w:type="dxa" w:w="50"/>
+              <w:left w:type="dxa" w:w="90"/>
+              <w:bottom w:type="dxa" w:w="50"/>
+              <w:right w:type="dxa" w:w="90"/>
+            </w:tcMar>
+          </w:tcPr>
+          <w:p>
+            <w:pPr>
+              <w:jc w:val="left"/>
+            </w:pPr>
+            <w:r>
+              <w:rPr>
+                <w:rFonts w:ascii="Calibri" w:cs="Calibri" w:eastAsia="Calibri" w:hAnsi="Calibri"/>
+                <w:b w:val="false"/>
+                <w:bCs w:val="false"/>
+                <w:sz w:val="19"/>
+                <w:szCs w:val="19"/>
+              </w:rPr>
+              <w:t xml:space="preserve">Subir el SX1262 de +20 a +22 dBm</w:t>
+            </w:r>
+          </w:p>
+        </w:tc>
+        <w:tc>
+          <w:tcPr>
+            <w:tcW w:type="dxa" w:w="2526"/>
+            <w:tcBorders>
+              <w:top w:val="single" w:color="BFBFBF" w:sz="4"/>
+              <w:left w:val="single" w:color="BFBFBF" w:sz="4"/>
+              <w:bottom w:val="single" w:color="BFBFBF" w:sz="4"/>
+              <w:right w:val="single" w:color="BFBFBF" w:sz="4"/>
+            </w:tcBorders>
+            <w:tcMar>
+              <w:top w:type="dxa" w:w="50"/>
+              <w:left w:type="dxa" w:w="90"/>
+              <w:bottom w:type="dxa" w:w="50"/>
+              <w:right w:type="dxa" w:w="90"/>
+            </w:tcMar>
+          </w:tcPr>
+          <w:p>
+            <w:pPr>
+              <w:jc w:val="left"/>
+            </w:pPr>
+            <w:r>
+              <w:rPr>
+                <w:rFonts w:ascii="Calibri" w:cs="Calibri" w:eastAsia="Calibri" w:hAnsi="Calibri"/>
+                <w:b w:val="false"/>
+                <w:bCs w:val="false"/>
+                <w:sz w:val="19"/>
+                <w:szCs w:val="19"/>
+              </w:rPr>
+              <w:t xml:space="preserve">+2 dB</w:t>
+            </w:r>
+          </w:p>
+        </w:tc>
+      </w:tr>
+      <w:tr>
+        <w:tc>
+          <w:tcPr>
+            <w:tcW w:type="dxa" w:w="2600"/>
+            <w:tcBorders>
+              <w:top w:val="single" w:color="BFBFBF" w:sz="4"/>
+              <w:left w:val="single" w:color="BFBFBF" w:sz="4"/>
+              <w:bottom w:val="single" w:color="BFBFBF" w:sz="4"/>
+              <w:right w:val="single" w:color="BFBFBF" w:sz="4"/>
+            </w:tcBorders>
+            <w:tcMar>
+              <w:top w:type="dxa" w:w="50"/>
+              <w:left w:type="dxa" w:w="90"/>
+              <w:bottom w:type="dxa" w:w="50"/>
+              <w:right w:type="dxa" w:w="90"/>
+            </w:tcMar>
+          </w:tcPr>
+          <w:p>
+            <w:pPr>
+              <w:jc w:val="left"/>
+            </w:pPr>
+            <w:r>
+              <w:rPr>
+                <w:rFonts w:ascii="Calibri" w:cs="Calibri" w:eastAsia="Calibri" w:hAnsi="Calibri"/>
+                <w:b w:val="false"/>
+                <w:bCs w:val="false"/>
+                <w:sz w:val="19"/>
+                <w:szCs w:val="19"/>
+              </w:rPr>
+              <w:t xml:space="preserve">Ganancia de antena</w:t>
+            </w:r>
+          </w:p>
+        </w:tc>
+        <w:tc>
+          <w:tcPr>
+            <w:tcW w:type="dxa" w:w="3900"/>
+            <w:tcBorders>
+              <w:top w:val="single" w:color="BFBFBF" w:sz="4"/>
+              <w:left w:val="single" w:color="BFBFBF" w:sz="4"/>
+              <w:bottom w:val="single" w:color="BFBFBF" w:sz="4"/>
+              <w:right w:val="single" w:color="BFBFBF" w:sz="4"/>
+            </w:tcBorders>
+            <w:tcMar>
+              <w:top w:type="dxa" w:w="50"/>
+              <w:left w:type="dxa" w:w="90"/>
+              <w:bottom w:type="dxa" w:w="50"/>
+              <w:right w:type="dxa" w:w="90"/>
+            </w:tcMar>
+          </w:tcPr>
+          <w:p>
+            <w:pPr>
+              <w:jc w:val="left"/>
+            </w:pPr>
+            <w:r>
+              <w:rPr>
+                <w:rFonts w:ascii="Calibri" w:cs="Calibri" w:eastAsia="Calibri" w:hAnsi="Calibri"/>
+                <w:b w:val="false"/>
+                <w:bCs w:val="false"/>
+                <w:sz w:val="19"/>
+                <w:szCs w:val="19"/>
+              </w:rPr>
+              <w:t xml:space="preserve">Yagi de 7 dBi en lugar de un monopolo</w:t>
+            </w:r>
+          </w:p>
+        </w:tc>
+        <w:tc>
+          <w:tcPr>
+            <w:tcW w:type="dxa" w:w="2526"/>
+            <w:tcBorders>
+              <w:top w:val="single" w:color="BFBFBF" w:sz="4"/>
+              <w:left w:val="single" w:color="BFBFBF" w:sz="4"/>
+              <w:bottom w:val="single" w:color="BFBFBF" w:sz="4"/>
+              <w:right w:val="single" w:color="BFBFBF" w:sz="4"/>
+            </w:tcBorders>
+            <w:tcMar>
+              <w:top w:type="dxa" w:w="50"/>
+              <w:left w:type="dxa" w:w="90"/>
+              <w:bottom w:type="dxa" w:w="50"/>
+              <w:right w:type="dxa" w:w="90"/>
+            </w:tcMar>
+          </w:tcPr>
+          <w:p>
+            <w:pPr>
+              <w:jc w:val="left"/>
+            </w:pPr>
+            <w:r>
+              <w:rPr>
+                <w:rFonts w:ascii="Calibri" w:cs="Calibri" w:eastAsia="Calibri" w:hAnsi="Calibri"/>
+                <w:b w:val="false"/>
+                <w:bCs w:val="false"/>
+                <w:sz w:val="19"/>
+                <w:szCs w:val="19"/>
+              </w:rPr>
+              <w:t xml:space="preserve">+5 dB</w:t>
+            </w:r>
+          </w:p>
+        </w:tc>
+      </w:tr>
+      <w:tr>
+        <w:tc>
+          <w:tcPr>
+            <w:tcW w:type="dxa" w:w="2600"/>
+            <w:tcBorders>
+              <w:top w:val="single" w:color="BFBFBF" w:sz="4"/>
+              <w:left w:val="single" w:color="BFBFBF" w:sz="4"/>
+              <w:bottom w:val="single" w:color="BFBFBF" w:sz="4"/>
+              <w:right w:val="single" w:color="BFBFBF" w:sz="4"/>
+            </w:tcBorders>
+            <w:tcMar>
+              <w:top w:type="dxa" w:w="50"/>
+              <w:left w:type="dxa" w:w="90"/>
+              <w:bottom w:type="dxa" w:w="50"/>
+              <w:right w:type="dxa" w:w="90"/>
+            </w:tcMar>
+          </w:tcPr>
+          <w:p>
+            <w:pPr>
+              <w:jc w:val="left"/>
+            </w:pPr>
+            <w:r>
+              <w:rPr>
+                <w:rFonts w:ascii="Calibri" w:cs="Calibri" w:eastAsia="Calibri" w:hAnsi="Calibri"/>
+                <w:b w:val="false"/>
+                <w:bCs w:val="false"/>
+                <w:sz w:val="19"/>
+                <w:szCs w:val="19"/>
+              </w:rPr>
+              <w:t xml:space="preserve">Pérdidas</w:t>
+            </w:r>
+          </w:p>
+        </w:tc>
+        <w:tc>
+          <w:tcPr>
+            <w:tcW w:type="dxa" w:w="3900"/>
+            <w:tcBorders>
+              <w:top w:val="single" w:color="BFBFBF" w:sz="4"/>
+              <w:left w:val="single" w:color="BFBFBF" w:sz="4"/>
+              <w:bottom w:val="single" w:color="BFBFBF" w:sz="4"/>
+              <w:right w:val="single" w:color="BFBFBF" w:sz="4"/>
+            </w:tcBorders>
+            <w:tcMar>
+              <w:top w:type="dxa" w:w="50"/>
+              <w:left w:type="dxa" w:w="90"/>
+              <w:bottom w:type="dxa" w:w="50"/>
+              <w:right w:type="dxa" w:w="90"/>
+            </w:tcMar>
+          </w:tcPr>
+          <w:p>
+            <w:pPr>
+              <w:jc w:val="left"/>
+            </w:pPr>
+            <w:r>
+              <w:rPr>
+                <w:rFonts w:ascii="Calibri" w:cs="Calibri" w:eastAsia="Calibri" w:hAnsi="Calibri"/>
+                <w:b w:val="false"/>
+                <w:bCs w:val="false"/>
+                <w:sz w:val="19"/>
+                <w:szCs w:val="19"/>
+              </w:rPr>
+              <w:t xml:space="preserve">Cable más corto o de menor atenuación</w:t>
+            </w:r>
+          </w:p>
+        </w:tc>
+        <w:tc>
+          <w:tcPr>
+            <w:tcW w:type="dxa" w:w="2526"/>
+            <w:tcBorders>
+              <w:top w:val="single" w:color="BFBFBF" w:sz="4"/>
+              <w:left w:val="single" w:color="BFBFBF" w:sz="4"/>
+              <w:bottom w:val="single" w:color="BFBFBF" w:sz="4"/>
+              <w:right w:val="single" w:color="BFBFBF" w:sz="4"/>
+            </w:tcBorders>
+            <w:tcMar>
+              <w:top w:type="dxa" w:w="50"/>
+              <w:left w:type="dxa" w:w="90"/>
+              <w:bottom w:type="dxa" w:w="50"/>
+              <w:right w:type="dxa" w:w="90"/>
+            </w:tcMar>
+          </w:tcPr>
+          <w:p>
+            <w:pPr>
+              <w:jc w:val="left"/>
+            </w:pPr>
+            <w:r>
+              <w:rPr>
+                <w:rFonts w:ascii="Calibri" w:cs="Calibri" w:eastAsia="Calibri" w:hAnsi="Calibri"/>
+                <w:b w:val="false"/>
+                <w:bCs w:val="false"/>
+                <w:sz w:val="19"/>
+                <w:szCs w:val="19"/>
+              </w:rPr>
+              <w:t xml:space="preserve">+0,5–1 dB</w:t>
+            </w:r>
+          </w:p>
+        </w:tc>
+      </w:tr>
+      <w:tr>
+        <w:tc>
+          <w:tcPr>
+            <w:tcW w:type="dxa" w:w="2600"/>
+            <w:tcBorders>
+              <w:top w:val="single" w:color="BFBFBF" w:sz="4"/>
+              <w:left w:val="single" w:color="BFBFBF" w:sz="4"/>
+              <w:bottom w:val="single" w:color="BFBFBF" w:sz="4"/>
+              <w:right w:val="single" w:color="BFBFBF" w:sz="4"/>
+            </w:tcBorders>
+            <w:tcMar>
+              <w:top w:type="dxa" w:w="50"/>
+              <w:left w:type="dxa" w:w="90"/>
+              <w:bottom w:type="dxa" w:w="50"/>
+              <w:right w:type="dxa" w:w="90"/>
+            </w:tcMar>
+          </w:tcPr>
+          <w:p>
+            <w:pPr>
+              <w:jc w:val="left"/>
+            </w:pPr>
+            <w:r>
+              <w:rPr>
+                <w:rFonts w:ascii="Calibri" w:cs="Calibri" w:eastAsia="Calibri" w:hAnsi="Calibri"/>
+                <w:b w:val="false"/>
+                <w:bCs w:val="false"/>
+                <w:sz w:val="19"/>
+                <w:szCs w:val="19"/>
+              </w:rPr>
+              <w:t xml:space="preserve">Ruido del receptor</w:t>
+            </w:r>
+          </w:p>
+        </w:tc>
+        <w:tc>
+          <w:tcPr>
+            <w:tcW w:type="dxa" w:w="3900"/>
+            <w:tcBorders>
+              <w:top w:val="single" w:color="BFBFBF" w:sz="4"/>
+              <w:left w:val="single" w:color="BFBFBF" w:sz="4"/>
+              <w:bottom w:val="single" w:color="BFBFBF" w:sz="4"/>
+              <w:right w:val="single" w:color="BFBFBF" w:sz="4"/>
+            </w:tcBorders>
+            <w:tcMar>
+              <w:top w:type="dxa" w:w="50"/>
+              <w:left w:type="dxa" w:w="90"/>
+              <w:bottom w:type="dxa" w:w="50"/>
+              <w:right w:type="dxa" w:w="90"/>
+            </w:tcMar>
+          </w:tcPr>
+          <w:p>
+            <w:pPr>
+              <w:jc w:val="left"/>
+            </w:pPr>
+            <w:r>
+              <w:rPr>
+                <w:rFonts w:ascii="Calibri" w:cs="Calibri" w:eastAsia="Calibri" w:hAnsi="Calibri"/>
+                <w:b w:val="false"/>
+                <w:bCs w:val="false"/>
+                <w:sz w:val="19"/>
+                <w:szCs w:val="19"/>
+              </w:rPr>
+              <w:t xml:space="preserve">Amplificador de bajo ruido (LNA) delante del RTL-SDR</w:t>
+            </w:r>
+          </w:p>
+        </w:tc>
+        <w:tc>
+          <w:tcPr>
+            <w:tcW w:type="dxa" w:w="2526"/>
+            <w:tcBorders>
+              <w:top w:val="single" w:color="BFBFBF" w:sz="4"/>
+              <w:left w:val="single" w:color="BFBFBF" w:sz="4"/>
+              <w:bottom w:val="single" w:color="BFBFBF" w:sz="4"/>
+              <w:right w:val="single" w:color="BFBFBF" w:sz="4"/>
+            </w:tcBorders>
+            <w:tcMar>
+              <w:top w:type="dxa" w:w="50"/>
+              <w:left w:type="dxa" w:w="90"/>
+              <w:bottom w:type="dxa" w:w="50"/>
+              <w:right w:type="dxa" w:w="90"/>
+            </w:tcMar>
+          </w:tcPr>
+          <w:p>
+            <w:pPr>
+              <w:jc w:val="left"/>
+            </w:pPr>
+            <w:r>
+              <w:rPr>
+                <w:rFonts w:ascii="Calibri" w:cs="Calibri" w:eastAsia="Calibri" w:hAnsi="Calibri"/>
+                <w:b w:val="false"/>
+                <w:bCs w:val="false"/>
+                <w:sz w:val="19"/>
+                <w:szCs w:val="19"/>
+              </w:rPr>
+              <w:t xml:space="preserve">+3–4 dB</w:t>
+            </w:r>
+          </w:p>
+        </w:tc>
+      </w:tr>
+      <w:tr>
+        <w:tc>
+          <w:tcPr>
+            <w:tcW w:type="dxa" w:w="2600"/>
+            <w:tcBorders>
+              <w:top w:val="single" w:color="BFBFBF" w:sz="4"/>
+              <w:left w:val="single" w:color="BFBFBF" w:sz="4"/>
+              <w:bottom w:val="single" w:color="BFBFBF" w:sz="4"/>
+              <w:right w:val="single" w:color="BFBFBF" w:sz="4"/>
+            </w:tcBorders>
+            <w:tcMar>
+              <w:top w:type="dxa" w:w="50"/>
+              <w:left w:type="dxa" w:w="90"/>
+              <w:bottom w:type="dxa" w:w="50"/>
+              <w:right w:type="dxa" w:w="90"/>
+            </w:tcMar>
+          </w:tcPr>
+          <w:p>
+            <w:pPr>
+              <w:jc w:val="left"/>
+            </w:pPr>
+            <w:r>
+              <w:rPr>
+                <w:rFonts w:ascii="Calibri" w:cs="Calibri" w:eastAsia="Calibri" w:hAnsi="Calibri"/>
+                <w:b w:val="false"/>
+                <w:bCs w:val="false"/>
+                <w:sz w:val="19"/>
+                <w:szCs w:val="19"/>
+              </w:rPr>
+              <w:t xml:space="preserve">Velocidad binaria</w:t>
+            </w:r>
+          </w:p>
+        </w:tc>
+        <w:tc>
+          <w:tcPr>
+            <w:tcW w:type="dxa" w:w="3900"/>
+            <w:tcBorders>
+              <w:top w:val="single" w:color="BFBFBF" w:sz="4"/>
+              <w:left w:val="single" w:color="BFBFBF" w:sz="4"/>
+              <w:bottom w:val="single" w:color="BFBFBF" w:sz="4"/>
+              <w:right w:val="single" w:color="BFBFBF" w:sz="4"/>
+            </w:tcBorders>
+            <w:tcMar>
+              <w:top w:type="dxa" w:w="50"/>
+              <w:left w:type="dxa" w:w="90"/>
+              <w:bottom w:type="dxa" w:w="50"/>
+              <w:right w:type="dxa" w:w="90"/>
+            </w:tcMar>
+          </w:tcPr>
+          <w:p>
+            <w:pPr>
+              <w:jc w:val="left"/>
+            </w:pPr>
+            <w:r>
+              <w:rPr>
+                <w:rFonts w:ascii="Calibri" w:cs="Calibri" w:eastAsia="Calibri" w:hAnsi="Calibri"/>
+                <w:b w:val="false"/>
+                <w:bCs w:val="false"/>
+                <w:sz w:val="19"/>
+                <w:szCs w:val="19"/>
+              </w:rPr>
+              <w:t xml:space="preserve">Pasar de 9,6 a 4,8 kbit/s</w:t>
+            </w:r>
+          </w:p>
+        </w:tc>
+        <w:tc>
+          <w:tcPr>
+            <w:tcW w:type="dxa" w:w="2526"/>
+            <w:tcBorders>
+              <w:top w:val="single" w:color="BFBFBF" w:sz="4"/>
+              <w:left w:val="single" w:color="BFBFBF" w:sz="4"/>
+              <w:bottom w:val="single" w:color="BFBFBF" w:sz="4"/>
+              <w:right w:val="single" w:color="BFBFBF" w:sz="4"/>
+            </w:tcBorders>
+            <w:tcMar>
+              <w:top w:type="dxa" w:w="50"/>
+              <w:left w:type="dxa" w:w="90"/>
+              <w:bottom w:type="dxa" w:w="50"/>
+              <w:right w:type="dxa" w:w="90"/>
+            </w:tcMar>
+          </w:tcPr>
+          <w:p>
+            <w:pPr>
+              <w:jc w:val="left"/>
+            </w:pPr>
+            <w:r>
+              <w:rPr>
+                <w:rFonts w:ascii="Calibri" w:cs="Calibri" w:eastAsia="Calibri" w:hAnsi="Calibri"/>
+                <w:b w:val="false"/>
+                <w:bCs w:val="false"/>
+                <w:sz w:val="19"/>
+                <w:szCs w:val="19"/>
+              </w:rPr>
+              <w:t xml:space="preserve">+3 dB</w:t>
+            </w:r>
+          </w:p>
+        </w:tc>
+      </w:tr>
+      <w:tr>
+        <w:tc>
+          <w:tcPr>
+            <w:tcW w:type="dxa" w:w="2600"/>
+            <w:tcBorders>
+              <w:top w:val="single" w:color="BFBFBF" w:sz="4"/>
+              <w:left w:val="single" w:color="BFBFBF" w:sz="4"/>
+              <w:bottom w:val="single" w:color="BFBFBF" w:sz="4"/>
+              <w:right w:val="single" w:color="BFBFBF" w:sz="4"/>
+            </w:tcBorders>
+            <w:tcMar>
+              <w:top w:type="dxa" w:w="50"/>
+              <w:left w:type="dxa" w:w="90"/>
+              <w:bottom w:type="dxa" w:w="50"/>
+              <w:right w:type="dxa" w:w="90"/>
+            </w:tcMar>
+          </w:tcPr>
+          <w:p>
+            <w:pPr>
+              <w:jc w:val="left"/>
+            </w:pPr>
+            <w:r>
+              <w:rPr>
+                <w:rFonts w:ascii="Calibri" w:cs="Calibri" w:eastAsia="Calibri" w:hAnsi="Calibri"/>
+                <w:b w:val="false"/>
+                <w:bCs w:val="false"/>
+                <w:sz w:val="19"/>
+                <w:szCs w:val="19"/>
+              </w:rPr>
+              <w:t xml:space="preserve">Demodulador</w:t>
+            </w:r>
+          </w:p>
+        </w:tc>
+        <w:tc>
+          <w:tcPr>
+            <w:tcW w:type="dxa" w:w="3900"/>
+            <w:tcBorders>
+              <w:top w:val="single" w:color="BFBFBF" w:sz="4"/>
+              <w:left w:val="single" w:color="BFBFBF" w:sz="4"/>
+              <w:bottom w:val="single" w:color="BFBFBF" w:sz="4"/>
+              <w:right w:val="single" w:color="BFBFBF" w:sz="4"/>
+            </w:tcBorders>
+            <w:tcMar>
+              <w:top w:type="dxa" w:w="50"/>
+              <w:left w:type="dxa" w:w="90"/>
+              <w:bottom w:type="dxa" w:w="50"/>
+              <w:right w:type="dxa" w:w="90"/>
+            </w:tcMar>
+          </w:tcPr>
+          <w:p>
+            <w:pPr>
+              <w:jc w:val="left"/>
+            </w:pPr>
+            <w:r>
+              <w:rPr>
+                <w:rFonts w:ascii="Calibri" w:cs="Calibri" w:eastAsia="Calibri" w:hAnsi="Calibri"/>
+                <w:b w:val="false"/>
+                <w:bCs w:val="false"/>
+                <w:sz w:val="19"/>
+                <w:szCs w:val="19"/>
+              </w:rPr>
+              <w:t xml:space="preserve">Integrador (filtro adaptado)</w:t>
+            </w:r>
+          </w:p>
+        </w:tc>
+        <w:tc>
+          <w:tcPr>
+            <w:tcW w:type="dxa" w:w="2526"/>
+            <w:tcBorders>
+              <w:top w:val="single" w:color="BFBFBF" w:sz="4"/>
+              <w:left w:val="single" w:color="BFBFBF" w:sz="4"/>
+              <w:bottom w:val="single" w:color="BFBFBF" w:sz="4"/>
+              <w:right w:val="single" w:color="BFBFBF" w:sz="4"/>
+            </w:tcBorders>
+            <w:tcMar>
+              <w:top w:type="dxa" w:w="50"/>
+              <w:left w:type="dxa" w:w="90"/>
+              <w:bottom w:type="dxa" w:w="50"/>
+              <w:right w:type="dxa" w:w="90"/>
+            </w:tcMar>
+          </w:tcPr>
+          <w:p>
+            <w:pPr>
+              <w:jc w:val="left"/>
+            </w:pPr>
+            <w:r>
+              <w:rPr>
+                <w:rFonts w:ascii="Calibri" w:cs="Calibri" w:eastAsia="Calibri" w:hAnsi="Calibri"/>
+                <w:b w:val="false"/>
+                <w:bCs w:val="false"/>
+                <w:sz w:val="19"/>
+                <w:szCs w:val="19"/>
+              </w:rPr>
+              <w:t xml:space="preserve">+1,8 dB</w:t>
+            </w:r>
+          </w:p>
+        </w:tc>
+      </w:tr>
+      <w:tr>
+        <w:tc>
+          <w:tcPr>
+            <w:tcW w:type="dxa" w:w="2600"/>
+            <w:tcBorders>
+              <w:top w:val="single" w:color="BFBFBF" w:sz="4"/>
+              <w:left w:val="single" w:color="BFBFBF" w:sz="4"/>
+              <w:bottom w:val="single" w:color="BFBFBF" w:sz="4"/>
+              <w:right w:val="single" w:color="BFBFBF" w:sz="4"/>
+            </w:tcBorders>
+            <w:tcMar>
+              <w:top w:type="dxa" w:w="50"/>
+              <w:left w:type="dxa" w:w="90"/>
+              <w:bottom w:type="dxa" w:w="50"/>
+              <w:right w:type="dxa" w:w="90"/>
+            </w:tcMar>
+          </w:tcPr>
+          <w:p>
+            <w:pPr>
+              <w:jc w:val="left"/>
+            </w:pPr>
+            <w:r>
+              <w:rPr>
+                <w:rFonts w:ascii="Calibri" w:cs="Calibri" w:eastAsia="Calibri" w:hAnsi="Calibri"/>
+                <w:b w:val="false"/>
+                <w:bCs w:val="false"/>
+                <w:sz w:val="19"/>
+                <w:szCs w:val="19"/>
+              </w:rPr>
+              <w:t xml:space="preserve">Distancia</w:t>
+            </w:r>
+          </w:p>
+        </w:tc>
+        <w:tc>
+          <w:tcPr>
+            <w:tcW w:type="dxa" w:w="3900"/>
+            <w:tcBorders>
+              <w:top w:val="single" w:color="BFBFBF" w:sz="4"/>
+              <w:left w:val="single" w:color="BFBFBF" w:sz="4"/>
+              <w:bottom w:val="single" w:color="BFBFBF" w:sz="4"/>
+              <w:right w:val="single" w:color="BFBFBF" w:sz="4"/>
+            </w:tcBorders>
+            <w:tcMar>
+              <w:top w:type="dxa" w:w="50"/>
+              <w:left w:type="dxa" w:w="90"/>
+              <w:bottom w:type="dxa" w:w="50"/>
+              <w:right w:type="dxa" w:w="90"/>
+            </w:tcMar>
+          </w:tcPr>
+          <w:p>
+            <w:pPr>
+              <w:jc w:val="left"/>
+            </w:pPr>
+            <w:r>
+              <w:rPr>
+                <w:rFonts w:ascii="Calibri" w:cs="Calibri" w:eastAsia="Calibri" w:hAnsi="Calibri"/>
+                <w:b w:val="false"/>
+                <w:bCs w:val="false"/>
+                <w:sz w:val="19"/>
+                <w:szCs w:val="19"/>
+              </w:rPr>
+              <w:t xml:space="preserve">Reducirla a la mitad (espacio libre)</w:t>
+            </w:r>
+          </w:p>
+        </w:tc>
+        <w:tc>
+          <w:tcPr>
+            <w:tcW w:type="dxa" w:w="2526"/>
+            <w:tcBorders>
+              <w:top w:val="single" w:color="BFBFBF" w:sz="4"/>
+              <w:left w:val="single" w:color="BFBFBF" w:sz="4"/>
+              <w:bottom w:val="single" w:color="BFBFBF" w:sz="4"/>
+              <w:right w:val="single" w:color="BFBFBF" w:sz="4"/>
+            </w:tcBorders>
+            <w:tcMar>
+              <w:top w:type="dxa" w:w="50"/>
+              <w:left w:type="dxa" w:w="90"/>
+              <w:bottom w:type="dxa" w:w="50"/>
+              <w:right w:type="dxa" w:w="90"/>
+            </w:tcMar>
+          </w:tcPr>
+          <w:p>
+            <w:pPr>
+              <w:jc w:val="left"/>
+            </w:pPr>
+            <w:r>
+              <w:rPr>
+                <w:rFonts w:ascii="Calibri" w:cs="Calibri" w:eastAsia="Calibri" w:hAnsi="Calibri"/>
+                <w:b w:val="false"/>
+                <w:bCs w:val="false"/>
+                <w:sz w:val="19"/>
+                <w:szCs w:val="19"/>
+              </w:rPr>
+              <w:t xml:space="preserve">+6 dB</w:t>
+            </w:r>
+          </w:p>
+        </w:tc>
+      </w:tr>
+    </w:tbl>
+    <w:p>
+      <w:pPr>
+        <w:spacing w:after="200" w:before="60"/>
+        <w:jc w:val="center"/>
+      </w:pPr>
+      <w:r>
+        <w:rPr>
+          <w:rFonts w:ascii="Calibri" w:cs="Calibri" w:eastAsia="Calibri" w:hAnsi="Calibri"/>
+          <w:i/>
+          <w:iCs/>
+          <w:color w:val="595959"/>
+          <w:sz w:val="19"/>
+          <w:szCs w:val="19"/>
+        </w:rPr>
+        <w:t xml:space="preserve">Tabla 14. Formas de aumentar el Eb/N0 recibido.</w:t>
+      </w:r>
+    </w:p>
+    <w:p>
+      <w:pPr>
+        <w:spacing w:after="140" w:line="276"/>
+        <w:jc w:val="both"/>
+      </w:pPr>
+      <w:r>
+        <w:rPr>
+          <w:rFonts w:ascii="Calibri" w:cs="Calibri" w:eastAsia="Calibri" w:hAnsi="Calibri"/>
+          <w:sz w:val="22"/>
+          <w:szCs w:val="22"/>
+        </w:rPr>
+        <w:t xml:space="preserve">La sensibilidad es el mismo concepto expresado en potencia: la potencia mínima en la antena que, una vez sumado el ruido del receptor, proporciona al demodulador el Eb/N0 necesario. Para este receptor se estimó en unos −116 dBm. Un receptor más sensible es el que necesita menos potencia, por tener menos ruido o un demodulador mejor.</w:t>
+      </w:r>
+    </w:p>
+    <w:p>
+      <w:pPr>
+        <w:pStyle w:val="Heading3"/>
+        <w:spacing w:after="100" w:before="200"/>
+      </w:pPr>
+      <w:r>
+        <w:rPr>
+          <w:rFonts w:ascii="Calibri" w:cs="Calibri" w:eastAsia="Calibri" w:hAnsi="Calibri"/>
+          <w:b/>
+          <w:bCs/>
+          <w:color w:val="2E75B6"/>
+          <w:sz w:val="23"/>
+          <w:szCs w:val="23"/>
+        </w:rPr>
+        <w:t xml:space="preserve">El margen como presupuesto</w:t>
+      </w:r>
+    </w:p>
+    <w:p>
+      <w:pPr>
+        <w:spacing w:after="140" w:line="276"/>
+        <w:jc w:val="both"/>
+      </w:pPr>
+      <w:r>
+        <w:rPr>
+          <w:rFonts w:ascii="Calibri" w:cs="Calibri" w:eastAsia="Calibri" w:hAnsi="Calibri"/>
+          <w:sz w:val="22"/>
+          <w:szCs w:val="22"/>
+        </w:rPr>
+        <w:t xml:space="preserve">El balance de enlace da unos 38 dB de Eb/N0 a 2 km (modelo de 2 rayos) frente a los 14 dB necesarios: unos 24 dB de margen. Dos ideas importantes:</w:t>
+      </w:r>
+    </w:p>
+    <w:p>
+      <w:pPr>
+        <w:pStyle w:val="ListParagraph"/>
+        <w:numPr>
+          <w:ilvl w:val="0"/>
+          <w:numId w:val="3"/>
+        </w:numPr>
+        <w:spacing w:after="80"/>
+      </w:pPr>
+      <w:r>
+        <w:rPr>
+          <w:rFonts w:ascii="Calibri" w:cs="Calibri" w:eastAsia="Calibri" w:hAnsi="Calibri"/>
+          <w:b/>
+          <w:bCs/>
+          <w:sz w:val="22"/>
+          <w:szCs w:val="22"/>
+        </w:rPr>
+        <w:t xml:space="preserve">El ruido no se puede eliminar: </w:t>
+      </w:r>
+      <w:r>
+        <w:rPr>
+          <w:rFonts w:ascii="Calibri" w:cs="Calibri" w:eastAsia="Calibri" w:hAnsi="Calibri"/>
+          <w:sz w:val="22"/>
+          <w:szCs w:val="22"/>
+        </w:rPr>
+        <w:t xml:space="preserve">el ruido térmico (kT) y el captado por la antena están siempre presentes. Lo que se controla es cuánta señal hay por encima de él.</w:t>
+      </w:r>
+    </w:p>
+    <w:p>
+      <w:pPr>
+        <w:pStyle w:val="ListParagraph"/>
+        <w:numPr>
+          <w:ilvl w:val="0"/>
+          <w:numId w:val="3"/>
+        </w:numPr>
+        <w:spacing w:after="80"/>
+      </w:pPr>
+      <w:r>
+        <w:rPr>
+          <w:rFonts w:ascii="Calibri" w:cs="Calibri" w:eastAsia="Calibri" w:hAnsi="Calibri"/>
+          <w:b/>
+          <w:bCs/>
+          <w:sz w:val="22"/>
+          <w:szCs w:val="22"/>
+        </w:rPr>
+        <w:t xml:space="preserve">Más Eb/N0 del necesario no aporta nada: </w:t>
+      </w:r>
+      <w:r>
+        <w:rPr>
+          <w:rFonts w:ascii="Calibri" w:cs="Calibri" w:eastAsia="Calibri" w:hAnsi="Calibri"/>
+          <w:sz w:val="22"/>
+          <w:szCs w:val="22"/>
+        </w:rPr>
+        <w:t xml:space="preserve">a 16 dB ya no se midieron errores en 100 000 bits; con 38 dB la BER es despreciable. El exceso no mejora la calidad, es una reserva.</w:t>
+      </w:r>
+    </w:p>
+    <w:p>
+      <w:pPr>
+        <w:spacing w:after="140" w:line="276"/>
+        <w:jc w:val="both"/>
+      </w:pPr>
+      <w:r>
+        <w:rPr>
+          <w:rFonts w:ascii="Calibri" w:cs="Calibri" w:eastAsia="Calibri" w:hAnsi="Calibri"/>
+          <w:sz w:val="22"/>
+          <w:szCs w:val="22"/>
+        </w:rPr>
+        <w:t xml:space="preserve">Ese margen se puede gastar en lo que interese:</w:t>
+      </w:r>
+    </w:p>
+    <w:tbl>
+      <w:tblPr>
+        <w:tblW w:type="dxa" w:w="9026"/>
+        <w:tblBorders>
+          <w:top w:val="single" w:color="auto" w:sz="4"/>
+          <w:left w:val="single" w:color="auto" w:sz="4"/>
+          <w:bottom w:val="single" w:color="auto" w:sz="4"/>
+          <w:right w:val="single" w:color="auto" w:sz="4"/>
+          <w:insideH w:val="single" w:color="auto" w:sz="4"/>
+          <w:insideV w:val="single" w:color="auto" w:sz="4"/>
+        </w:tblBorders>
+      </w:tblPr>
+      <w:tblGrid>
+        <w:gridCol w:w="2200"/>
+        <w:gridCol w:w="3800"/>
+        <w:gridCol w:w="3026"/>
+      </w:tblGrid>
+      <w:tr>
+        <w:trPr>
+          <w:tblHeader/>
+        </w:trPr>
+        <w:tc>
+          <w:tcPr>
+            <w:tcW w:type="dxa" w:w="2200"/>
+            <w:tcBorders>
+              <w:top w:val="single" w:color="BFBFBF" w:sz="4"/>
+              <w:left w:val="single" w:color="BFBFBF" w:sz="4"/>
+              <w:bottom w:val="single" w:color="BFBFBF" w:sz="4"/>
+              <w:right w:val="single" w:color="BFBFBF" w:sz="4"/>
+            </w:tcBorders>
+            <w:shd w:fill="1F4E79" w:color="auto" w:val="clear"/>
+            <w:tcMar>
+              <w:top w:type="dxa" w:w="50"/>
+              <w:left w:type="dxa" w:w="90"/>
+              <w:bottom w:type="dxa" w:w="50"/>
+              <w:right w:type="dxa" w:w="90"/>
+            </w:tcMar>
+          </w:tcPr>
+          <w:p>
+            <w:pPr>
+              <w:jc w:val="left"/>
+            </w:pPr>
+            <w:r>
+              <w:rPr>
+                <w:rFonts w:ascii="Calibri" w:cs="Calibri" w:eastAsia="Calibri" w:hAnsi="Calibri"/>
+                <w:b/>
+                <w:bCs/>
+                <w:color w:val="FFFFFF"/>
+                <w:sz w:val="19"/>
+                <w:szCs w:val="19"/>
+              </w:rPr>
+              <w:t xml:space="preserve">Gastar el margen en…</w:t>
+            </w:r>
+          </w:p>
+        </w:tc>
+        <w:tc>
+          <w:tcPr>
+            <w:tcW w:type="dxa" w:w="3800"/>
+            <w:tcBorders>
+              <w:top w:val="single" w:color="BFBFBF" w:sz="4"/>
+              <w:left w:val="single" w:color="BFBFBF" w:sz="4"/>
+              <w:bottom w:val="single" w:color="BFBFBF" w:sz="4"/>
+              <w:right w:val="single" w:color="BFBFBF" w:sz="4"/>
+            </w:tcBorders>
+            <w:shd w:fill="1F4E79" w:color="auto" w:val="clear"/>
+            <w:tcMar>
+              <w:top w:type="dxa" w:w="50"/>
+              <w:left w:type="dxa" w:w="90"/>
+              <w:bottom w:type="dxa" w:w="50"/>
+              <w:right w:type="dxa" w:w="90"/>
+            </w:tcMar>
+          </w:tcPr>
+          <w:p>
+            <w:pPr>
+              <w:jc w:val="left"/>
+            </w:pPr>
+            <w:r>
+              <w:rPr>
+                <w:rFonts w:ascii="Calibri" w:cs="Calibri" w:eastAsia="Calibri" w:hAnsi="Calibri"/>
+                <w:b/>
+                <w:bCs/>
+                <w:color w:val="FFFFFF"/>
+                <w:sz w:val="19"/>
+                <w:szCs w:val="19"/>
+              </w:rPr>
+              <w:t xml:space="preserve">Ejemplo</w:t>
+            </w:r>
+          </w:p>
+        </w:tc>
+        <w:tc>
+          <w:tcPr>
+            <w:tcW w:type="dxa" w:w="3026"/>
+            <w:tcBorders>
+              <w:top w:val="single" w:color="BFBFBF" w:sz="4"/>
+              <w:left w:val="single" w:color="BFBFBF" w:sz="4"/>
+              <w:bottom w:val="single" w:color="BFBFBF" w:sz="4"/>
+              <w:right w:val="single" w:color="BFBFBF" w:sz="4"/>
+            </w:tcBorders>
+            <w:shd w:fill="1F4E79" w:color="auto" w:val="clear"/>
+            <w:tcMar>
+              <w:top w:type="dxa" w:w="50"/>
+              <w:left w:type="dxa" w:w="90"/>
+              <w:bottom w:type="dxa" w:w="50"/>
+              <w:right w:type="dxa" w:w="90"/>
+            </w:tcMar>
+          </w:tcPr>
+          <w:p>
+            <w:pPr>
+              <w:jc w:val="left"/>
+            </w:pPr>
+            <w:r>
+              <w:rPr>
+                <w:rFonts w:ascii="Calibri" w:cs="Calibri" w:eastAsia="Calibri" w:hAnsi="Calibri"/>
+                <w:b/>
+                <w:bCs/>
+                <w:color w:val="FFFFFF"/>
+                <w:sz w:val="19"/>
+                <w:szCs w:val="19"/>
+              </w:rPr>
+              <w:t xml:space="preserve">Beneficio</w:t>
+            </w:r>
+          </w:p>
+        </w:tc>
+      </w:tr>
+      <w:tr>
+        <w:tc>
+          <w:tcPr>
+            <w:tcW w:type="dxa" w:w="2200"/>
+            <w:tcBorders>
+              <w:top w:val="single" w:color="BFBFBF" w:sz="4"/>
+              <w:left w:val="single" w:color="BFBFBF" w:sz="4"/>
+              <w:bottom w:val="single" w:color="BFBFBF" w:sz="4"/>
+              <w:right w:val="single" w:color="BFBFBF" w:sz="4"/>
+            </w:tcBorders>
+            <w:tcMar>
+              <w:top w:type="dxa" w:w="50"/>
+              <w:left w:type="dxa" w:w="90"/>
+              <w:bottom w:type="dxa" w:w="50"/>
+              <w:right w:type="dxa" w:w="90"/>
+            </w:tcMar>
+          </w:tcPr>
+          <w:p>
+            <w:pPr>
+              <w:jc w:val="left"/>
+            </w:pPr>
+            <w:r>
+              <w:rPr>
+                <w:rFonts w:ascii="Calibri" w:cs="Calibri" w:eastAsia="Calibri" w:hAnsi="Calibri"/>
+                <w:b w:val="false"/>
+                <w:bCs w:val="false"/>
+                <w:sz w:val="19"/>
+                <w:szCs w:val="19"/>
+              </w:rPr>
+              <w:t xml:space="preserve">Distancia</w:t>
+            </w:r>
+          </w:p>
+        </w:tc>
+        <w:tc>
+          <w:tcPr>
+            <w:tcW w:type="dxa" w:w="3800"/>
+            <w:tcBorders>
+              <w:top w:val="single" w:color="BFBFBF" w:sz="4"/>
+              <w:left w:val="single" w:color="BFBFBF" w:sz="4"/>
+              <w:bottom w:val="single" w:color="BFBFBF" w:sz="4"/>
+              <w:right w:val="single" w:color="BFBFBF" w:sz="4"/>
+            </w:tcBorders>
+            <w:tcMar>
+              <w:top w:type="dxa" w:w="50"/>
+              <w:left w:type="dxa" w:w="90"/>
+              <w:bottom w:type="dxa" w:w="50"/>
+              <w:right w:type="dxa" w:w="90"/>
+            </w:tcMar>
+          </w:tcPr>
+          <w:p>
+            <w:pPr>
+              <w:jc w:val="left"/>
+            </w:pPr>
+            <w:r>
+              <w:rPr>
+                <w:rFonts w:ascii="Calibri" w:cs="Calibri" w:eastAsia="Calibri" w:hAnsi="Calibri"/>
+                <w:b w:val="false"/>
+                <w:bCs w:val="false"/>
+                <w:sz w:val="19"/>
+                <w:szCs w:val="19"/>
+              </w:rPr>
+              <w:t xml:space="preserve">Usar ~14 dB y conservar 10 dB de reserva</w:t>
+            </w:r>
+          </w:p>
+        </w:tc>
+        <w:tc>
+          <w:tcPr>
+            <w:tcW w:type="dxa" w:w="3026"/>
+            <w:tcBorders>
+              <w:top w:val="single" w:color="BFBFBF" w:sz="4"/>
+              <w:left w:val="single" w:color="BFBFBF" w:sz="4"/>
+              <w:bottom w:val="single" w:color="BFBFBF" w:sz="4"/>
+              <w:right w:val="single" w:color="BFBFBF" w:sz="4"/>
+            </w:tcBorders>
+            <w:tcMar>
+              <w:top w:type="dxa" w:w="50"/>
+              <w:left w:type="dxa" w:w="90"/>
+              <w:bottom w:type="dxa" w:w="50"/>
+              <w:right w:type="dxa" w:w="90"/>
+            </w:tcMar>
+          </w:tcPr>
+          <w:p>
+            <w:pPr>
+              <w:jc w:val="left"/>
+            </w:pPr>
+            <w:r>
+              <w:rPr>
+                <w:rFonts w:ascii="Calibri" w:cs="Calibri" w:eastAsia="Calibri" w:hAnsi="Calibri"/>
+                <w:b w:val="false"/>
+                <w:bCs w:val="false"/>
+                <w:sz w:val="19"/>
+                <w:szCs w:val="19"/>
+              </w:rPr>
+              <w:t xml:space="preserve">Pasar de 2 km a unos 4–5 km</w:t>
+            </w:r>
+          </w:p>
+        </w:tc>
+      </w:tr>
+      <w:tr>
+        <w:tc>
+          <w:tcPr>
+            <w:tcW w:type="dxa" w:w="2200"/>
+            <w:tcBorders>
+              <w:top w:val="single" w:color="BFBFBF" w:sz="4"/>
+              <w:left w:val="single" w:color="BFBFBF" w:sz="4"/>
+              <w:bottom w:val="single" w:color="BFBFBF" w:sz="4"/>
+              <w:right w:val="single" w:color="BFBFBF" w:sz="4"/>
+            </w:tcBorders>
+            <w:tcMar>
+              <w:top w:type="dxa" w:w="50"/>
+              <w:left w:type="dxa" w:w="90"/>
+              <w:bottom w:type="dxa" w:w="50"/>
+              <w:right w:type="dxa" w:w="90"/>
+            </w:tcMar>
+          </w:tcPr>
+          <w:p>
+            <w:pPr>
+              <w:jc w:val="left"/>
+            </w:pPr>
+            <w:r>
+              <w:rPr>
+                <w:rFonts w:ascii="Calibri" w:cs="Calibri" w:eastAsia="Calibri" w:hAnsi="Calibri"/>
+                <w:b w:val="false"/>
+                <w:bCs w:val="false"/>
+                <w:sz w:val="19"/>
+                <w:szCs w:val="19"/>
+              </w:rPr>
+              <w:t xml:space="preserve">Menos potencia</w:t>
+            </w:r>
+          </w:p>
+        </w:tc>
+        <w:tc>
+          <w:tcPr>
+            <w:tcW w:type="dxa" w:w="3800"/>
+            <w:tcBorders>
+              <w:top w:val="single" w:color="BFBFBF" w:sz="4"/>
+              <w:left w:val="single" w:color="BFBFBF" w:sz="4"/>
+              <w:bottom w:val="single" w:color="BFBFBF" w:sz="4"/>
+              <w:right w:val="single" w:color="BFBFBF" w:sz="4"/>
+            </w:tcBorders>
+            <w:tcMar>
+              <w:top w:type="dxa" w:w="50"/>
+              <w:left w:type="dxa" w:w="90"/>
+              <w:bottom w:type="dxa" w:w="50"/>
+              <w:right w:type="dxa" w:w="90"/>
+            </w:tcMar>
+          </w:tcPr>
+          <w:p>
+            <w:pPr>
+              <w:jc w:val="left"/>
+            </w:pPr>
+            <w:r>
+              <w:rPr>
+                <w:rFonts w:ascii="Calibri" w:cs="Calibri" w:eastAsia="Calibri" w:hAnsi="Calibri"/>
+                <w:b w:val="false"/>
+                <w:bCs w:val="false"/>
+                <w:sz w:val="19"/>
+                <w:szCs w:val="19"/>
+              </w:rPr>
+              <w:t xml:space="preserve">Bajar el transmisor de +20 a +6 dBm</w:t>
+            </w:r>
+          </w:p>
+        </w:tc>
+        <w:tc>
+          <w:tcPr>
+            <w:tcW w:type="dxa" w:w="3026"/>
+            <w:tcBorders>
+              <w:top w:val="single" w:color="BFBFBF" w:sz="4"/>
+              <w:left w:val="single" w:color="BFBFBF" w:sz="4"/>
+              <w:bottom w:val="single" w:color="BFBFBF" w:sz="4"/>
+              <w:right w:val="single" w:color="BFBFBF" w:sz="4"/>
+            </w:tcBorders>
+            <w:tcMar>
+              <w:top w:type="dxa" w:w="50"/>
+              <w:left w:type="dxa" w:w="90"/>
+              <w:bottom w:type="dxa" w:w="50"/>
+              <w:right w:type="dxa" w:w="90"/>
+            </w:tcMar>
+          </w:tcPr>
+          <w:p>
+            <w:pPr>
+              <w:jc w:val="left"/>
+            </w:pPr>
+            <w:r>
+              <w:rPr>
+                <w:rFonts w:ascii="Calibri" w:cs="Calibri" w:eastAsia="Calibri" w:hAnsi="Calibri"/>
+                <w:b w:val="false"/>
+                <w:bCs w:val="false"/>
+                <w:sz w:val="19"/>
+                <w:szCs w:val="19"/>
+              </w:rPr>
+              <w:t xml:space="preserve">Más autonomía y menos interferencia</w:t>
+            </w:r>
+          </w:p>
+        </w:tc>
+      </w:tr>
+      <w:tr>
+        <w:tc>
+          <w:tcPr>
+            <w:tcW w:type="dxa" w:w="2200"/>
+            <w:tcBorders>
+              <w:top w:val="single" w:color="BFBFBF" w:sz="4"/>
+              <w:left w:val="single" w:color="BFBFBF" w:sz="4"/>
+              <w:bottom w:val="single" w:color="BFBFBF" w:sz="4"/>
+              <w:right w:val="single" w:color="BFBFBF" w:sz="4"/>
+            </w:tcBorders>
+            <w:tcMar>
+              <w:top w:type="dxa" w:w="50"/>
+              <w:left w:type="dxa" w:w="90"/>
+              <w:bottom w:type="dxa" w:w="50"/>
+              <w:right w:type="dxa" w:w="90"/>
+            </w:tcMar>
+          </w:tcPr>
+          <w:p>
+            <w:pPr>
+              <w:jc w:val="left"/>
+            </w:pPr>
+            <w:r>
+              <w:rPr>
+                <w:rFonts w:ascii="Calibri" w:cs="Calibri" w:eastAsia="Calibri" w:hAnsi="Calibri"/>
+                <w:b w:val="false"/>
+                <w:bCs w:val="false"/>
+                <w:sz w:val="19"/>
+                <w:szCs w:val="19"/>
+              </w:rPr>
+              <w:t xml:space="preserve">Más velocidad</w:t>
+            </w:r>
+          </w:p>
+        </w:tc>
+        <w:tc>
+          <w:tcPr>
+            <w:tcW w:type="dxa" w:w="3800"/>
+            <w:tcBorders>
+              <w:top w:val="single" w:color="BFBFBF" w:sz="4"/>
+              <w:left w:val="single" w:color="BFBFBF" w:sz="4"/>
+              <w:bottom w:val="single" w:color="BFBFBF" w:sz="4"/>
+              <w:right w:val="single" w:color="BFBFBF" w:sz="4"/>
+            </w:tcBorders>
+            <w:tcMar>
+              <w:top w:type="dxa" w:w="50"/>
+              <w:left w:type="dxa" w:w="90"/>
+              <w:bottom w:type="dxa" w:w="50"/>
+              <w:right w:type="dxa" w:w="90"/>
+            </w:tcMar>
+          </w:tcPr>
+          <w:p>
+            <w:pPr>
+              <w:jc w:val="left"/>
+            </w:pPr>
+            <w:r>
+              <w:rPr>
+                <w:rFonts w:ascii="Calibri" w:cs="Calibri" w:eastAsia="Calibri" w:hAnsi="Calibri"/>
+                <w:b w:val="false"/>
+                <w:bCs w:val="false"/>
+                <w:sz w:val="19"/>
+                <w:szCs w:val="19"/>
+              </w:rPr>
+              <w:t xml:space="preserve">Subir de 9,6 a unos 100 kbit/s</w:t>
+            </w:r>
+          </w:p>
+        </w:tc>
+        <w:tc>
+          <w:tcPr>
+            <w:tcW w:type="dxa" w:w="3026"/>
+            <w:tcBorders>
+              <w:top w:val="single" w:color="BFBFBF" w:sz="4"/>
+              <w:left w:val="single" w:color="BFBFBF" w:sz="4"/>
+              <w:bottom w:val="single" w:color="BFBFBF" w:sz="4"/>
+              <w:right w:val="single" w:color="BFBFBF" w:sz="4"/>
+            </w:tcBorders>
+            <w:tcMar>
+              <w:top w:type="dxa" w:w="50"/>
+              <w:left w:type="dxa" w:w="90"/>
+              <w:bottom w:type="dxa" w:w="50"/>
+              <w:right w:type="dxa" w:w="90"/>
+            </w:tcMar>
+          </w:tcPr>
+          <w:p>
+            <w:pPr>
+              <w:jc w:val="left"/>
+            </w:pPr>
+            <w:r>
+              <w:rPr>
+                <w:rFonts w:ascii="Calibri" w:cs="Calibri" w:eastAsia="Calibri" w:hAnsi="Calibri"/>
+                <w:b w:val="false"/>
+                <w:bCs w:val="false"/>
+                <w:sz w:val="19"/>
+                <w:szCs w:val="19"/>
+              </w:rPr>
+              <w:t xml:space="preserve">Más datos o más tramas por segundo</w:t>
+            </w:r>
+          </w:p>
+        </w:tc>
+      </w:tr>
+      <w:tr>
+        <w:tc>
+          <w:tcPr>
+            <w:tcW w:type="dxa" w:w="2200"/>
+            <w:tcBorders>
+              <w:top w:val="single" w:color="BFBFBF" w:sz="4"/>
+              <w:left w:val="single" w:color="BFBFBF" w:sz="4"/>
+              <w:bottom w:val="single" w:color="BFBFBF" w:sz="4"/>
+              <w:right w:val="single" w:color="BFBFBF" w:sz="4"/>
+            </w:tcBorders>
+            <w:tcMar>
+              <w:top w:type="dxa" w:w="50"/>
+              <w:left w:type="dxa" w:w="90"/>
+              <w:bottom w:type="dxa" w:w="50"/>
+              <w:right w:type="dxa" w:w="90"/>
+            </w:tcMar>
+          </w:tcPr>
+          <w:p>
+            <w:pPr>
+              <w:jc w:val="left"/>
+            </w:pPr>
+            <w:r>
+              <w:rPr>
+                <w:rFonts w:ascii="Calibri" w:cs="Calibri" w:eastAsia="Calibri" w:hAnsi="Calibri"/>
+                <w:b w:val="false"/>
+                <w:bCs w:val="false"/>
+                <w:sz w:val="19"/>
+                <w:szCs w:val="19"/>
+              </w:rPr>
+              <w:t xml:space="preserve">Robustez</w:t>
+            </w:r>
+          </w:p>
+        </w:tc>
+        <w:tc>
+          <w:tcPr>
+            <w:tcW w:type="dxa" w:w="3800"/>
+            <w:tcBorders>
+              <w:top w:val="single" w:color="BFBFBF" w:sz="4"/>
+              <w:left w:val="single" w:color="BFBFBF" w:sz="4"/>
+              <w:bottom w:val="single" w:color="BFBFBF" w:sz="4"/>
+              <w:right w:val="single" w:color="BFBFBF" w:sz="4"/>
+            </w:tcBorders>
+            <w:tcMar>
+              <w:top w:type="dxa" w:w="50"/>
+              <w:left w:type="dxa" w:w="90"/>
+              <w:bottom w:type="dxa" w:w="50"/>
+              <w:right w:type="dxa" w:w="90"/>
+            </w:tcMar>
+          </w:tcPr>
+          <w:p>
+            <w:pPr>
+              <w:jc w:val="left"/>
+            </w:pPr>
+            <w:r>
+              <w:rPr>
+                <w:rFonts w:ascii="Calibri" w:cs="Calibri" w:eastAsia="Calibri" w:hAnsi="Calibri"/>
+                <w:b w:val="false"/>
+                <w:bCs w:val="false"/>
+                <w:sz w:val="19"/>
+                <w:szCs w:val="19"/>
+              </w:rPr>
+              <w:t xml:space="preserve">No gastarlo</w:t>
+            </w:r>
+          </w:p>
+        </w:tc>
+        <w:tc>
+          <w:tcPr>
+            <w:tcW w:type="dxa" w:w="3026"/>
+            <w:tcBorders>
+              <w:top w:val="single" w:color="BFBFBF" w:sz="4"/>
+              <w:left w:val="single" w:color="BFBFBF" w:sz="4"/>
+              <w:bottom w:val="single" w:color="BFBFBF" w:sz="4"/>
+              <w:right w:val="single" w:color="BFBFBF" w:sz="4"/>
+            </w:tcBorders>
+            <w:tcMar>
+              <w:top w:type="dxa" w:w="50"/>
+              <w:left w:type="dxa" w:w="90"/>
+              <w:bottom w:type="dxa" w:w="50"/>
+              <w:right w:type="dxa" w:w="90"/>
+            </w:tcMar>
+          </w:tcPr>
+          <w:p>
+            <w:pPr>
+              <w:jc w:val="left"/>
+            </w:pPr>
+            <w:r>
+              <w:rPr>
+                <w:rFonts w:ascii="Calibri" w:cs="Calibri" w:eastAsia="Calibri" w:hAnsi="Calibri"/>
+                <w:b w:val="false"/>
+                <w:bCs w:val="false"/>
+                <w:sz w:val="19"/>
+                <w:szCs w:val="19"/>
+              </w:rPr>
+              <w:t xml:space="preserve">Tolerar giros, vegetación y desapuntamiento</w:t>
+            </w:r>
+          </w:p>
+        </w:tc>
+      </w:tr>
+    </w:tbl>
+    <w:p>
+      <w:pPr>
+        <w:spacing w:after="200" w:before="60"/>
+        <w:jc w:val="center"/>
+      </w:pPr>
+      <w:r>
+        <w:rPr>
+          <w:rFonts w:ascii="Calibri" w:cs="Calibri" w:eastAsia="Calibri" w:hAnsi="Calibri"/>
+          <w:i/>
+          <w:iCs/>
+          <w:color w:val="595959"/>
+          <w:sz w:val="19"/>
+          <w:szCs w:val="19"/>
+        </w:rPr>
+        <w:t xml:space="preserve">Tabla 15. Usos del margen de enlace.</w:t>
+      </w:r>
+    </w:p>
+    <w:tbl>
+      <w:tblPr>
+        <w:tblW w:type="dxa" w:w="9026"/>
+        <w:tblBorders>
+          <w:top w:val="single" w:color="auto" w:sz="4"/>
+          <w:left w:val="single" w:color="auto" w:sz="4"/>
+          <w:bottom w:val="single" w:color="auto" w:sz="4"/>
+          <w:right w:val="single" w:color="auto" w:sz="4"/>
+          <w:insideH w:val="single" w:color="auto" w:sz="4"/>
+          <w:insideV w:val="single" w:color="auto" w:sz="4"/>
+        </w:tblBorders>
+      </w:tblPr>
+      <w:tblGrid>
+        <w:gridCol w:w="9026"/>
+      </w:tblGrid>
+      <w:tr>
+        <w:tc>
+          <w:tcPr>
+            <w:tcW w:type="dxa" w:w="9026"/>
+            <w:tcBorders>
+              <w:top w:val="none" w:color="FFFFFF" w:sz="0"/>
+              <w:left w:val="single" w:color="2E75B6" w:sz="24"/>
+              <w:bottom w:val="none" w:color="FFFFFF" w:sz="0"/>
+              <w:right w:val="none" w:color="FFFFFF" w:sz="0"/>
+            </w:tcBorders>
+            <w:shd w:fill="DEEAF6" w:color="auto" w:val="clear"/>
+            <w:tcMar>
+              <w:top w:type="dxa" w:w="120"/>
+              <w:left w:type="dxa" w:w="180"/>
+              <w:bottom w:type="dxa" w:w="100"/>
+              <w:right w:type="dxa" w:w="180"/>
+            </w:tcMar>
+          </w:tcPr>
+          <w:p>
+            <w:pPr>
+              <w:spacing w:after="80"/>
+            </w:pPr>
+            <w:r>
+              <w:rPr>
+                <w:rFonts w:ascii="Calibri" w:cs="Calibri" w:eastAsia="Calibri" w:hAnsi="Calibri"/>
+                <w:b/>
+                <w:bCs/>
+                <w:color w:val="2E75B6"/>
+                <w:sz w:val="22"/>
+                <w:szCs w:val="22"/>
+              </w:rPr>
+              <w:t xml:space="preserve">Criterio de diseño</w:t>
+            </w:r>
+          </w:p>
+          <w:p>
+            <w:pPr>
+              <w:spacing w:after="140" w:line="276"/>
+              <w:jc w:val="left"/>
+            </w:pPr>
+            <w:r>
+              <w:rPr>
+                <w:rFonts w:ascii="Calibri" w:cs="Calibri" w:eastAsia="Calibri" w:hAnsi="Calibri"/>
+                <w:sz w:val="22"/>
+                <w:szCs w:val="22"/>
+              </w:rPr>
+              <w:t xml:space="preserve">No se busca el máximo Eb/N0, sino el mínimo que cumple los requisitos más un margen de seguridad (10 dB en REQ-COM-022); el resto se invierte en alcance, autonomía o velocidad. En un lanzador real casi todo el margen se consume en distancia. En este proyecto se conservará como reserva en la prueba de campo para observar el efecto real del terreno, la vegetación y la altura de las antenas. Frase resumen: «mi demodulador necesita 14 dB, el enlace da 38 dB a 2 km: 24 dB de margen».</w:t>
+            </w:r>
+          </w:p>
+        </w:tc>
+      </w:tr>
+    </w:tbl>
     <w:p>
       <w:pPr>
         <w:pStyle w:val="Heading1"/>
@@ -15718,7 +18690,7 @@
                 <w:sz w:val="19"/>
                 <w:szCs w:val="19"/>
               </w:rPr>
-              <w:t xml:space="preserve">Simulación FSK completada; falta el hardware</w:t>
+              <w:t xml:space="preserve">Simulación FSK y medida de BER completadas; falta el hardware</w:t>
             </w:r>
           </w:p>
         </w:tc>
@@ -15836,7 +18808,7 @@
           <w:sz w:val="19"/>
           <w:szCs w:val="19"/>
         </w:rPr>
-        <w:t xml:space="preserve">Tabla 13. Estado del proyecto.</w:t>
+        <w:t xml:space="preserve">Tabla 16. Estado del proyecto.</w:t>
       </w:r>
     </w:p>
     <w:p>
@@ -15943,7 +18915,7 @@
           <w:sz w:val="22"/>
           <w:szCs w:val="22"/>
         </w:rPr>
-        <w:t xml:space="preserve">Añadir a la simulación un contador de errores (BER) como preparación de la fase F4.</w:t>
+        <w:t xml:space="preserve">Siguiente paso de simulación: construir la trama (sincronismo 0x1ACFFC1D + datos + CRC) y detectarla en GNU Radio.</w:t>
       </w:r>
     </w:p>
     <w:sectPr>

</xml_diff>

<commit_message>
F2: transmisión FSK con SX1262 (RadioLib)
</commit_message>
<xml_diff>
--- a/docs/Memoria_telemetria_868.docx
+++ b/docs/Memoria_telemetria_868.docx
@@ -142,7 +142,7 @@
           <w:sz w:val="22"/>
           <w:szCs w:val="22"/>
         </w:rPr>
-        <w:t xml:space="preserve">0.3 · 5 de octubre de 2026 · F1, entorno y simulación de BER</w:t>
+        <w:t xml:space="preserve">0.5 · 5 de octubre de 2026 · F1, entorno, simulación y trama</w:t>
       </w:r>
     </w:p>
     <w:p>
@@ -18164,6 +18164,3135 @@
     </w:tbl>
     <w:p>
       <w:pPr>
+        <w:pStyle w:val="Heading2"/>
+        <w:spacing w:after="120" w:before="260"/>
+      </w:pPr>
+      <w:r>
+        <w:rPr>
+          <w:rFonts w:ascii="Calibri" w:cs="Calibri" w:eastAsia="Calibri" w:hAnsi="Calibri"/>
+          <w:b/>
+          <w:bCs/>
+          <w:color w:val="1F4E79"/>
+          <w:sz w:val="26"/>
+          <w:szCs w:val="26"/>
+        </w:rPr>
+        <w:t xml:space="preserve">10.7 Trama completa: sincronismo, Reed-Solomon y CRC</w:t>
+      </w:r>
+    </w:p>
+    <w:p>
+      <w:pPr>
+        <w:pStyle w:val="Heading3"/>
+        <w:spacing w:after="100" w:before="200"/>
+      </w:pPr>
+      <w:r>
+        <w:rPr>
+          <w:rFonts w:ascii="Calibri" w:cs="Calibri" w:eastAsia="Calibri" w:hAnsi="Calibri"/>
+          <w:b/>
+          <w:bCs/>
+          <w:color w:val="2E75B6"/>
+          <w:sz w:val="23"/>
+          <w:szCs w:val="23"/>
+        </w:rPr>
+        <w:t xml:space="preserve">Implementación de referencia (ground/scripts/trama.py)</w:t>
+      </w:r>
+    </w:p>
+    <w:p>
+      <w:pPr>
+        <w:spacing w:after="140" w:line="276"/>
+        <w:jc w:val="both"/>
+      </w:pPr>
+      <w:r>
+        <w:rPr>
+          <w:rFonts w:ascii="Calibri" w:cs="Calibri" w:eastAsia="Calibri" w:hAnsi="Calibri"/>
+          <w:sz w:val="22"/>
+          <w:szCs w:val="22"/>
+        </w:rPr>
+        <w:t xml:space="preserve">Se escribió en Python la construcción y descodificación de la trama definida en el ICD. Es el «contrato» entre transmisor y receptor: el firmware de la Heltec la replicará en C++ y el receptor de GNU Radio utiliza directamente su función de descodificación. Se ejecuta con el Python de radioconda (librería reedsolo).</w:t>
+      </w:r>
+    </w:p>
+    <w:tbl>
+      <w:tblPr>
+        <w:tblW w:type="dxa" w:w="9026"/>
+        <w:tblBorders>
+          <w:top w:val="single" w:color="auto" w:sz="4"/>
+          <w:left w:val="single" w:color="auto" w:sz="4"/>
+          <w:bottom w:val="single" w:color="auto" w:sz="4"/>
+          <w:right w:val="single" w:color="auto" w:sz="4"/>
+          <w:insideH w:val="single" w:color="auto" w:sz="4"/>
+          <w:insideV w:val="single" w:color="auto" w:sz="4"/>
+        </w:tblBorders>
+      </w:tblPr>
+      <w:tblGrid>
+        <w:gridCol w:w="2600"/>
+        <w:gridCol w:w="1300"/>
+        <w:gridCol w:w="5126"/>
+      </w:tblGrid>
+      <w:tr>
+        <w:trPr>
+          <w:tblHeader/>
+        </w:trPr>
+        <w:tc>
+          <w:tcPr>
+            <w:tcW w:type="dxa" w:w="2600"/>
+            <w:tcBorders>
+              <w:top w:val="single" w:color="BFBFBF" w:sz="4"/>
+              <w:left w:val="single" w:color="BFBFBF" w:sz="4"/>
+              <w:bottom w:val="single" w:color="BFBFBF" w:sz="4"/>
+              <w:right w:val="single" w:color="BFBFBF" w:sz="4"/>
+            </w:tcBorders>
+            <w:shd w:fill="1F4E79" w:color="auto" w:val="clear"/>
+            <w:tcMar>
+              <w:top w:type="dxa" w:w="50"/>
+              <w:left w:type="dxa" w:w="90"/>
+              <w:bottom w:type="dxa" w:w="50"/>
+              <w:right w:type="dxa" w:w="90"/>
+            </w:tcMar>
+          </w:tcPr>
+          <w:p>
+            <w:pPr>
+              <w:jc w:val="left"/>
+            </w:pPr>
+            <w:r>
+              <w:rPr>
+                <w:rFonts w:ascii="Calibri" w:cs="Calibri" w:eastAsia="Calibri" w:hAnsi="Calibri"/>
+                <w:b/>
+                <w:bCs/>
+                <w:color w:val="FFFFFF"/>
+                <w:sz w:val="19"/>
+                <w:szCs w:val="19"/>
+              </w:rPr>
+              <w:t xml:space="preserve">Parte</w:t>
+            </w:r>
+          </w:p>
+        </w:tc>
+        <w:tc>
+          <w:tcPr>
+            <w:tcW w:type="dxa" w:w="1300"/>
+            <w:tcBorders>
+              <w:top w:val="single" w:color="BFBFBF" w:sz="4"/>
+              <w:left w:val="single" w:color="BFBFBF" w:sz="4"/>
+              <w:bottom w:val="single" w:color="BFBFBF" w:sz="4"/>
+              <w:right w:val="single" w:color="BFBFBF" w:sz="4"/>
+            </w:tcBorders>
+            <w:shd w:fill="1F4E79" w:color="auto" w:val="clear"/>
+            <w:tcMar>
+              <w:top w:type="dxa" w:w="50"/>
+              <w:left w:type="dxa" w:w="90"/>
+              <w:bottom w:type="dxa" w:w="50"/>
+              <w:right w:type="dxa" w:w="90"/>
+            </w:tcMar>
+          </w:tcPr>
+          <w:p>
+            <w:pPr>
+              <w:jc w:val="left"/>
+            </w:pPr>
+            <w:r>
+              <w:rPr>
+                <w:rFonts w:ascii="Calibri" w:cs="Calibri" w:eastAsia="Calibri" w:hAnsi="Calibri"/>
+                <w:b/>
+                <w:bCs/>
+                <w:color w:val="FFFFFF"/>
+                <w:sz w:val="19"/>
+                <w:szCs w:val="19"/>
+              </w:rPr>
+              <w:t xml:space="preserve">Tamaño</w:t>
+            </w:r>
+          </w:p>
+        </w:tc>
+        <w:tc>
+          <w:tcPr>
+            <w:tcW w:type="dxa" w:w="5126"/>
+            <w:tcBorders>
+              <w:top w:val="single" w:color="BFBFBF" w:sz="4"/>
+              <w:left w:val="single" w:color="BFBFBF" w:sz="4"/>
+              <w:bottom w:val="single" w:color="BFBFBF" w:sz="4"/>
+              <w:right w:val="single" w:color="BFBFBF" w:sz="4"/>
+            </w:tcBorders>
+            <w:shd w:fill="1F4E79" w:color="auto" w:val="clear"/>
+            <w:tcMar>
+              <w:top w:type="dxa" w:w="50"/>
+              <w:left w:type="dxa" w:w="90"/>
+              <w:bottom w:type="dxa" w:w="50"/>
+              <w:right w:type="dxa" w:w="90"/>
+            </w:tcMar>
+          </w:tcPr>
+          <w:p>
+            <w:pPr>
+              <w:jc w:val="left"/>
+            </w:pPr>
+            <w:r>
+              <w:rPr>
+                <w:rFonts w:ascii="Calibri" w:cs="Calibri" w:eastAsia="Calibri" w:hAnsi="Calibri"/>
+                <w:b/>
+                <w:bCs/>
+                <w:color w:val="FFFFFF"/>
+                <w:sz w:val="19"/>
+                <w:szCs w:val="19"/>
+              </w:rPr>
+              <w:t xml:space="preserve">Función</w:t>
+            </w:r>
+          </w:p>
+        </w:tc>
+      </w:tr>
+      <w:tr>
+        <w:tc>
+          <w:tcPr>
+            <w:tcW w:type="dxa" w:w="2600"/>
+            <w:tcBorders>
+              <w:top w:val="single" w:color="BFBFBF" w:sz="4"/>
+              <w:left w:val="single" w:color="BFBFBF" w:sz="4"/>
+              <w:bottom w:val="single" w:color="BFBFBF" w:sz="4"/>
+              <w:right w:val="single" w:color="BFBFBF" w:sz="4"/>
+            </w:tcBorders>
+            <w:tcMar>
+              <w:top w:type="dxa" w:w="50"/>
+              <w:left w:type="dxa" w:w="90"/>
+              <w:bottom w:type="dxa" w:w="50"/>
+              <w:right w:type="dxa" w:w="90"/>
+            </w:tcMar>
+          </w:tcPr>
+          <w:p>
+            <w:pPr>
+              <w:jc w:val="left"/>
+            </w:pPr>
+            <w:r>
+              <w:rPr>
+                <w:rFonts w:ascii="Calibri" w:cs="Calibri" w:eastAsia="Calibri" w:hAnsi="Calibri"/>
+                <w:b w:val="false"/>
+                <w:bCs w:val="false"/>
+                <w:sz w:val="19"/>
+                <w:szCs w:val="19"/>
+              </w:rPr>
+              <w:t xml:space="preserve">Preámbulo 0xAA…</w:t>
+            </w:r>
+          </w:p>
+        </w:tc>
+        <w:tc>
+          <w:tcPr>
+            <w:tcW w:type="dxa" w:w="1300"/>
+            <w:tcBorders>
+              <w:top w:val="single" w:color="BFBFBF" w:sz="4"/>
+              <w:left w:val="single" w:color="BFBFBF" w:sz="4"/>
+              <w:bottom w:val="single" w:color="BFBFBF" w:sz="4"/>
+              <w:right w:val="single" w:color="BFBFBF" w:sz="4"/>
+            </w:tcBorders>
+            <w:tcMar>
+              <w:top w:type="dxa" w:w="50"/>
+              <w:left w:type="dxa" w:w="90"/>
+              <w:bottom w:type="dxa" w:w="50"/>
+              <w:right w:type="dxa" w:w="90"/>
+            </w:tcMar>
+          </w:tcPr>
+          <w:p>
+            <w:pPr>
+              <w:jc w:val="left"/>
+            </w:pPr>
+            <w:r>
+              <w:rPr>
+                <w:rFonts w:ascii="Calibri" w:cs="Calibri" w:eastAsia="Calibri" w:hAnsi="Calibri"/>
+                <w:b w:val="false"/>
+                <w:bCs w:val="false"/>
+                <w:sz w:val="19"/>
+                <w:szCs w:val="19"/>
+              </w:rPr>
+              <w:t xml:space="preserve">4 B</w:t>
+            </w:r>
+          </w:p>
+        </w:tc>
+        <w:tc>
+          <w:tcPr>
+            <w:tcW w:type="dxa" w:w="5126"/>
+            <w:tcBorders>
+              <w:top w:val="single" w:color="BFBFBF" w:sz="4"/>
+              <w:left w:val="single" w:color="BFBFBF" w:sz="4"/>
+              <w:bottom w:val="single" w:color="BFBFBF" w:sz="4"/>
+              <w:right w:val="single" w:color="BFBFBF" w:sz="4"/>
+            </w:tcBorders>
+            <w:tcMar>
+              <w:top w:type="dxa" w:w="50"/>
+              <w:left w:type="dxa" w:w="90"/>
+              <w:bottom w:type="dxa" w:w="50"/>
+              <w:right w:type="dxa" w:w="90"/>
+            </w:tcMar>
+          </w:tcPr>
+          <w:p>
+            <w:pPr>
+              <w:jc w:val="left"/>
+            </w:pPr>
+            <w:r>
+              <w:rPr>
+                <w:rFonts w:ascii="Calibri" w:cs="Calibri" w:eastAsia="Calibri" w:hAnsi="Calibri"/>
+                <w:b w:val="false"/>
+                <w:bCs w:val="false"/>
+                <w:sz w:val="19"/>
+                <w:szCs w:val="19"/>
+              </w:rPr>
+              <w:t xml:space="preserve">Lo añade el SX1262; permite al receptor estabilizarse</w:t>
+            </w:r>
+          </w:p>
+        </w:tc>
+      </w:tr>
+      <w:tr>
+        <w:tc>
+          <w:tcPr>
+            <w:tcW w:type="dxa" w:w="2600"/>
+            <w:tcBorders>
+              <w:top w:val="single" w:color="BFBFBF" w:sz="4"/>
+              <w:left w:val="single" w:color="BFBFBF" w:sz="4"/>
+              <w:bottom w:val="single" w:color="BFBFBF" w:sz="4"/>
+              <w:right w:val="single" w:color="BFBFBF" w:sz="4"/>
+            </w:tcBorders>
+            <w:tcMar>
+              <w:top w:type="dxa" w:w="50"/>
+              <w:left w:type="dxa" w:w="90"/>
+              <w:bottom w:type="dxa" w:w="50"/>
+              <w:right w:type="dxa" w:w="90"/>
+            </w:tcMar>
+          </w:tcPr>
+          <w:p>
+            <w:pPr>
+              <w:jc w:val="left"/>
+            </w:pPr>
+            <w:r>
+              <w:rPr>
+                <w:rFonts w:ascii="Calibri" w:cs="Calibri" w:eastAsia="Calibri" w:hAnsi="Calibri"/>
+                <w:b w:val="false"/>
+                <w:bCs w:val="false"/>
+                <w:sz w:val="19"/>
+                <w:szCs w:val="19"/>
+              </w:rPr>
+              <w:t xml:space="preserve">ASM 1A CF FC 1D</w:t>
+            </w:r>
+          </w:p>
+        </w:tc>
+        <w:tc>
+          <w:tcPr>
+            <w:tcW w:type="dxa" w:w="1300"/>
+            <w:tcBorders>
+              <w:top w:val="single" w:color="BFBFBF" w:sz="4"/>
+              <w:left w:val="single" w:color="BFBFBF" w:sz="4"/>
+              <w:bottom w:val="single" w:color="BFBFBF" w:sz="4"/>
+              <w:right w:val="single" w:color="BFBFBF" w:sz="4"/>
+            </w:tcBorders>
+            <w:tcMar>
+              <w:top w:type="dxa" w:w="50"/>
+              <w:left w:type="dxa" w:w="90"/>
+              <w:bottom w:type="dxa" w:w="50"/>
+              <w:right w:type="dxa" w:w="90"/>
+            </w:tcMar>
+          </w:tcPr>
+          <w:p>
+            <w:pPr>
+              <w:jc w:val="left"/>
+            </w:pPr>
+            <w:r>
+              <w:rPr>
+                <w:rFonts w:ascii="Calibri" w:cs="Calibri" w:eastAsia="Calibri" w:hAnsi="Calibri"/>
+                <w:b w:val="false"/>
+                <w:bCs w:val="false"/>
+                <w:sz w:val="19"/>
+                <w:szCs w:val="19"/>
+              </w:rPr>
+              <w:t xml:space="preserve">4 B</w:t>
+            </w:r>
+          </w:p>
+        </w:tc>
+        <w:tc>
+          <w:tcPr>
+            <w:tcW w:type="dxa" w:w="5126"/>
+            <w:tcBorders>
+              <w:top w:val="single" w:color="BFBFBF" w:sz="4"/>
+              <w:left w:val="single" w:color="BFBFBF" w:sz="4"/>
+              <w:bottom w:val="single" w:color="BFBFBF" w:sz="4"/>
+              <w:right w:val="single" w:color="BFBFBF" w:sz="4"/>
+            </w:tcBorders>
+            <w:tcMar>
+              <w:top w:type="dxa" w:w="50"/>
+              <w:left w:type="dxa" w:w="90"/>
+              <w:bottom w:type="dxa" w:w="50"/>
+              <w:right w:type="dxa" w:w="90"/>
+            </w:tcMar>
+          </w:tcPr>
+          <w:p>
+            <w:pPr>
+              <w:jc w:val="left"/>
+            </w:pPr>
+            <w:r>
+              <w:rPr>
+                <w:rFonts w:ascii="Calibri" w:cs="Calibri" w:eastAsia="Calibri" w:hAnsi="Calibri"/>
+                <w:b w:val="false"/>
+                <w:bCs w:val="false"/>
+                <w:sz w:val="19"/>
+                <w:szCs w:val="19"/>
+              </w:rPr>
+              <w:t xml:space="preserve">Marca el inicio de la trama (CCSDS 131.0-B)</w:t>
+            </w:r>
+          </w:p>
+        </w:tc>
+      </w:tr>
+      <w:tr>
+        <w:tc>
+          <w:tcPr>
+            <w:tcW w:type="dxa" w:w="2600"/>
+            <w:tcBorders>
+              <w:top w:val="single" w:color="BFBFBF" w:sz="4"/>
+              <w:left w:val="single" w:color="BFBFBF" w:sz="4"/>
+              <w:bottom w:val="single" w:color="BFBFBF" w:sz="4"/>
+              <w:right w:val="single" w:color="BFBFBF" w:sz="4"/>
+            </w:tcBorders>
+            <w:tcMar>
+              <w:top w:type="dxa" w:w="50"/>
+              <w:left w:type="dxa" w:w="90"/>
+              <w:bottom w:type="dxa" w:w="50"/>
+              <w:right w:type="dxa" w:w="90"/>
+            </w:tcMar>
+          </w:tcPr>
+          <w:p>
+            <w:pPr>
+              <w:jc w:val="left"/>
+            </w:pPr>
+            <w:r>
+              <w:rPr>
+                <w:rFonts w:ascii="Calibri" w:cs="Calibri" w:eastAsia="Calibri" w:hAnsi="Calibri"/>
+                <w:b w:val="false"/>
+                <w:bCs w:val="false"/>
+                <w:sz w:val="19"/>
+                <w:szCs w:val="19"/>
+              </w:rPr>
+              <w:t xml:space="preserve">Datos</w:t>
+            </w:r>
+          </w:p>
+        </w:tc>
+        <w:tc>
+          <w:tcPr>
+            <w:tcW w:type="dxa" w:w="1300"/>
+            <w:tcBorders>
+              <w:top w:val="single" w:color="BFBFBF" w:sz="4"/>
+              <w:left w:val="single" w:color="BFBFBF" w:sz="4"/>
+              <w:bottom w:val="single" w:color="BFBFBF" w:sz="4"/>
+              <w:right w:val="single" w:color="BFBFBF" w:sz="4"/>
+            </w:tcBorders>
+            <w:tcMar>
+              <w:top w:type="dxa" w:w="50"/>
+              <w:left w:type="dxa" w:w="90"/>
+              <w:bottom w:type="dxa" w:w="50"/>
+              <w:right w:type="dxa" w:w="90"/>
+            </w:tcMar>
+          </w:tcPr>
+          <w:p>
+            <w:pPr>
+              <w:jc w:val="left"/>
+            </w:pPr>
+            <w:r>
+              <w:rPr>
+                <w:rFonts w:ascii="Calibri" w:cs="Calibri" w:eastAsia="Calibri" w:hAnsi="Calibri"/>
+                <w:b w:val="false"/>
+                <w:bCs w:val="false"/>
+                <w:sz w:val="19"/>
+                <w:szCs w:val="19"/>
+              </w:rPr>
+              <w:t xml:space="preserve">44 B</w:t>
+            </w:r>
+          </w:p>
+        </w:tc>
+        <w:tc>
+          <w:tcPr>
+            <w:tcW w:type="dxa" w:w="5126"/>
+            <w:tcBorders>
+              <w:top w:val="single" w:color="BFBFBF" w:sz="4"/>
+              <w:left w:val="single" w:color="BFBFBF" w:sz="4"/>
+              <w:bottom w:val="single" w:color="BFBFBF" w:sz="4"/>
+              <w:right w:val="single" w:color="BFBFBF" w:sz="4"/>
+            </w:tcBorders>
+            <w:tcMar>
+              <w:top w:type="dxa" w:w="50"/>
+              <w:left w:type="dxa" w:w="90"/>
+              <w:bottom w:type="dxa" w:w="50"/>
+              <w:right w:type="dxa" w:w="90"/>
+            </w:tcMar>
+          </w:tcPr>
+          <w:p>
+            <w:pPr>
+              <w:jc w:val="left"/>
+            </w:pPr>
+            <w:r>
+              <w:rPr>
+                <w:rFonts w:ascii="Calibri" w:cs="Calibri" w:eastAsia="Calibri" w:hAnsi="Calibri"/>
+                <w:b w:val="false"/>
+                <w:bCs w:val="false"/>
+                <w:sz w:val="19"/>
+                <w:szCs w:val="19"/>
+              </w:rPr>
+              <w:t xml:space="preserve">Versión, ID, contador, tiempo GPS, posición, altitud, presión, temperatura, humedad, IMU, batería, satélites, fix</w:t>
+            </w:r>
+          </w:p>
+        </w:tc>
+      </w:tr>
+      <w:tr>
+        <w:tc>
+          <w:tcPr>
+            <w:tcW w:type="dxa" w:w="2600"/>
+            <w:tcBorders>
+              <w:top w:val="single" w:color="BFBFBF" w:sz="4"/>
+              <w:left w:val="single" w:color="BFBFBF" w:sz="4"/>
+              <w:bottom w:val="single" w:color="BFBFBF" w:sz="4"/>
+              <w:right w:val="single" w:color="BFBFBF" w:sz="4"/>
+            </w:tcBorders>
+            <w:tcMar>
+              <w:top w:type="dxa" w:w="50"/>
+              <w:left w:type="dxa" w:w="90"/>
+              <w:bottom w:type="dxa" w:w="50"/>
+              <w:right w:type="dxa" w:w="90"/>
+            </w:tcMar>
+          </w:tcPr>
+          <w:p>
+            <w:pPr>
+              <w:jc w:val="left"/>
+            </w:pPr>
+            <w:r>
+              <w:rPr>
+                <w:rFonts w:ascii="Calibri" w:cs="Calibri" w:eastAsia="Calibri" w:hAnsi="Calibri"/>
+                <w:b w:val="false"/>
+                <w:bCs w:val="false"/>
+                <w:sz w:val="19"/>
+                <w:szCs w:val="19"/>
+              </w:rPr>
+              <w:t xml:space="preserve">CRC-16-CCITT</w:t>
+            </w:r>
+          </w:p>
+        </w:tc>
+        <w:tc>
+          <w:tcPr>
+            <w:tcW w:type="dxa" w:w="1300"/>
+            <w:tcBorders>
+              <w:top w:val="single" w:color="BFBFBF" w:sz="4"/>
+              <w:left w:val="single" w:color="BFBFBF" w:sz="4"/>
+              <w:bottom w:val="single" w:color="BFBFBF" w:sz="4"/>
+              <w:right w:val="single" w:color="BFBFBF" w:sz="4"/>
+            </w:tcBorders>
+            <w:tcMar>
+              <w:top w:type="dxa" w:w="50"/>
+              <w:left w:type="dxa" w:w="90"/>
+              <w:bottom w:type="dxa" w:w="50"/>
+              <w:right w:type="dxa" w:w="90"/>
+            </w:tcMar>
+          </w:tcPr>
+          <w:p>
+            <w:pPr>
+              <w:jc w:val="left"/>
+            </w:pPr>
+            <w:r>
+              <w:rPr>
+                <w:rFonts w:ascii="Calibri" w:cs="Calibri" w:eastAsia="Calibri" w:hAnsi="Calibri"/>
+                <w:b w:val="false"/>
+                <w:bCs w:val="false"/>
+                <w:sz w:val="19"/>
+                <w:szCs w:val="19"/>
+              </w:rPr>
+              <w:t xml:space="preserve">2 B</w:t>
+            </w:r>
+          </w:p>
+        </w:tc>
+        <w:tc>
+          <w:tcPr>
+            <w:tcW w:type="dxa" w:w="5126"/>
+            <w:tcBorders>
+              <w:top w:val="single" w:color="BFBFBF" w:sz="4"/>
+              <w:left w:val="single" w:color="BFBFBF" w:sz="4"/>
+              <w:bottom w:val="single" w:color="BFBFBF" w:sz="4"/>
+              <w:right w:val="single" w:color="BFBFBF" w:sz="4"/>
+            </w:tcBorders>
+            <w:tcMar>
+              <w:top w:type="dxa" w:w="50"/>
+              <w:left w:type="dxa" w:w="90"/>
+              <w:bottom w:type="dxa" w:w="50"/>
+              <w:right w:type="dxa" w:w="90"/>
+            </w:tcMar>
+          </w:tcPr>
+          <w:p>
+            <w:pPr>
+              <w:jc w:val="left"/>
+            </w:pPr>
+            <w:r>
+              <w:rPr>
+                <w:rFonts w:ascii="Calibri" w:cs="Calibri" w:eastAsia="Calibri" w:hAnsi="Calibri"/>
+                <w:b w:val="false"/>
+                <w:bCs w:val="false"/>
+                <w:sz w:val="19"/>
+                <w:szCs w:val="19"/>
+              </w:rPr>
+              <w:t xml:space="preserve">Detecta cualquier error residual (polinomio 0x1021, inicial 0xFFFF)</w:t>
+            </w:r>
+          </w:p>
+        </w:tc>
+      </w:tr>
+      <w:tr>
+        <w:tc>
+          <w:tcPr>
+            <w:tcW w:type="dxa" w:w="2600"/>
+            <w:tcBorders>
+              <w:top w:val="single" w:color="BFBFBF" w:sz="4"/>
+              <w:left w:val="single" w:color="BFBFBF" w:sz="4"/>
+              <w:bottom w:val="single" w:color="BFBFBF" w:sz="4"/>
+              <w:right w:val="single" w:color="BFBFBF" w:sz="4"/>
+            </w:tcBorders>
+            <w:tcMar>
+              <w:top w:type="dxa" w:w="50"/>
+              <w:left w:type="dxa" w:w="90"/>
+              <w:bottom w:type="dxa" w:w="50"/>
+              <w:right w:type="dxa" w:w="90"/>
+            </w:tcMar>
+          </w:tcPr>
+          <w:p>
+            <w:pPr>
+              <w:jc w:val="left"/>
+            </w:pPr>
+            <w:r>
+              <w:rPr>
+                <w:rFonts w:ascii="Calibri" w:cs="Calibri" w:eastAsia="Calibri" w:hAnsi="Calibri"/>
+                <w:b w:val="false"/>
+                <w:bCs w:val="false"/>
+                <w:sz w:val="19"/>
+                <w:szCs w:val="19"/>
+              </w:rPr>
+              <w:t xml:space="preserve">Paridad Reed-Solomon</w:t>
+            </w:r>
+          </w:p>
+        </w:tc>
+        <w:tc>
+          <w:tcPr>
+            <w:tcW w:type="dxa" w:w="1300"/>
+            <w:tcBorders>
+              <w:top w:val="single" w:color="BFBFBF" w:sz="4"/>
+              <w:left w:val="single" w:color="BFBFBF" w:sz="4"/>
+              <w:bottom w:val="single" w:color="BFBFBF" w:sz="4"/>
+              <w:right w:val="single" w:color="BFBFBF" w:sz="4"/>
+            </w:tcBorders>
+            <w:tcMar>
+              <w:top w:type="dxa" w:w="50"/>
+              <w:left w:type="dxa" w:w="90"/>
+              <w:bottom w:type="dxa" w:w="50"/>
+              <w:right w:type="dxa" w:w="90"/>
+            </w:tcMar>
+          </w:tcPr>
+          <w:p>
+            <w:pPr>
+              <w:jc w:val="left"/>
+            </w:pPr>
+            <w:r>
+              <w:rPr>
+                <w:rFonts w:ascii="Calibri" w:cs="Calibri" w:eastAsia="Calibri" w:hAnsi="Calibri"/>
+                <w:b w:val="false"/>
+                <w:bCs w:val="false"/>
+                <w:sz w:val="19"/>
+                <w:szCs w:val="19"/>
+              </w:rPr>
+              <w:t xml:space="preserve">32 B</w:t>
+            </w:r>
+          </w:p>
+        </w:tc>
+        <w:tc>
+          <w:tcPr>
+            <w:tcW w:type="dxa" w:w="5126"/>
+            <w:tcBorders>
+              <w:top w:val="single" w:color="BFBFBF" w:sz="4"/>
+              <w:left w:val="single" w:color="BFBFBF" w:sz="4"/>
+              <w:bottom w:val="single" w:color="BFBFBF" w:sz="4"/>
+              <w:right w:val="single" w:color="BFBFBF" w:sz="4"/>
+            </w:tcBorders>
+            <w:tcMar>
+              <w:top w:type="dxa" w:w="50"/>
+              <w:left w:type="dxa" w:w="90"/>
+              <w:bottom w:type="dxa" w:w="50"/>
+              <w:right w:type="dxa" w:w="90"/>
+            </w:tcMar>
+          </w:tcPr>
+          <w:p>
+            <w:pPr>
+              <w:jc w:val="left"/>
+            </w:pPr>
+            <w:r>
+              <w:rPr>
+                <w:rFonts w:ascii="Calibri" w:cs="Calibri" w:eastAsia="Calibri" w:hAnsi="Calibri"/>
+                <w:b w:val="false"/>
+                <w:bCs w:val="false"/>
+                <w:sz w:val="19"/>
+                <w:szCs w:val="19"/>
+              </w:rPr>
+              <w:t xml:space="preserve">Corrige hasta 16 bytes erróneos: RS(78,46)</w:t>
+            </w:r>
+          </w:p>
+        </w:tc>
+      </w:tr>
+    </w:tbl>
+    <w:p>
+      <w:pPr>
+        <w:spacing w:after="200" w:before="60"/>
+        <w:jc w:val="center"/>
+      </w:pPr>
+      <w:r>
+        <w:rPr>
+          <w:rFonts w:ascii="Calibri" w:cs="Calibri" w:eastAsia="Calibri" w:hAnsi="Calibri"/>
+          <w:i/>
+          <w:iCs/>
+          <w:color w:val="595959"/>
+          <w:sz w:val="19"/>
+          <w:szCs w:val="19"/>
+        </w:rPr>
+        <w:t xml:space="preserve">Tabla 17. Estructura de la trama: 86 bytes, 72 ms en el aire a 9,6 kbit/s.</w:t>
+      </w:r>
+    </w:p>
+    <w:p>
+      <w:pPr>
+        <w:spacing w:after="140" w:line="276"/>
+        <w:jc w:val="both"/>
+      </w:pPr>
+      <w:r>
+        <w:rPr>
+          <w:rFonts w:ascii="Calibri" w:cs="Calibri" w:eastAsia="Calibri" w:hAnsi="Calibri"/>
+          <w:sz w:val="22"/>
+          <w:szCs w:val="22"/>
+        </w:rPr>
+        <w:t xml:space="preserve">Reed-Solomon trata los datos como puntos de un polinomio y envía puntos adicionales; el receptor reconstruye el polinomio con los puntos coherentes y descarta los erróneos. Cada 2 bytes de paridad permiten corregir 1 byte, y al operar sobre bytes completos es muy robusto frente a errores en ráfaga. La prueba del script lo confirmó: con 16 bytes corrompidos la telemetría se recupera idéntica; con 17 la trama se descarta en lugar de entregar datos falsos. El CRC actúa como comprobación final por si el decodificador corrigiera hacia un dato incorrecto.</w:t>
+      </w:r>
+    </w:p>
+    <w:p>
+      <w:pPr>
+        <w:pStyle w:val="Heading3"/>
+        <w:spacing w:after="100" w:before="200"/>
+      </w:pPr>
+      <w:r>
+        <w:rPr>
+          <w:rFonts w:ascii="Calibri" w:cs="Calibri" w:eastAsia="Calibri" w:hAnsi="Calibri"/>
+          <w:b/>
+          <w:bCs/>
+          <w:color w:val="2E75B6"/>
+          <w:sz w:val="23"/>
+          <w:szCs w:val="23"/>
+        </w:rPr>
+        <w:t xml:space="preserve">Simulación en GNU Radio (ground/gnuradio/03_fsk_tramas.grc)</w:t>
+      </w:r>
+    </w:p>
+    <w:p>
+      <w:pPr>
+        <w:spacing w:after="140" w:line="276"/>
+        <w:jc w:val="both"/>
+      </w:pPr>
+      <w:r>
+        <w:rPr>
+          <w:rFonts w:ascii="Calibri" w:cs="Calibri" w:eastAsia="Calibri" w:hAnsi="Calibri"/>
+          <w:sz w:val="22"/>
+          <w:szCs w:val="22"/>
+        </w:rPr>
+        <w:t xml:space="preserve">El tercer flujo sustituye los bits aleatorios por tramas reales y añade la cadena de recepción completa:</w:t>
+      </w:r>
+    </w:p>
+    <w:tbl>
+      <w:tblPr>
+        <w:tblW w:type="dxa" w:w="9026"/>
+        <w:tblBorders>
+          <w:top w:val="single" w:color="auto" w:sz="4"/>
+          <w:left w:val="single" w:color="auto" w:sz="4"/>
+          <w:bottom w:val="single" w:color="auto" w:sz="4"/>
+          <w:right w:val="single" w:color="auto" w:sz="4"/>
+          <w:insideH w:val="single" w:color="auto" w:sz="4"/>
+          <w:insideV w:val="single" w:color="auto" w:sz="4"/>
+        </w:tblBorders>
+      </w:tblPr>
+      <w:tblGrid>
+        <w:gridCol w:w="2900"/>
+        <w:gridCol w:w="6126"/>
+      </w:tblGrid>
+      <w:tr>
+        <w:trPr>
+          <w:tblHeader/>
+        </w:trPr>
+        <w:tc>
+          <w:tcPr>
+            <w:tcW w:type="dxa" w:w="2900"/>
+            <w:tcBorders>
+              <w:top w:val="single" w:color="BFBFBF" w:sz="4"/>
+              <w:left w:val="single" w:color="BFBFBF" w:sz="4"/>
+              <w:bottom w:val="single" w:color="BFBFBF" w:sz="4"/>
+              <w:right w:val="single" w:color="BFBFBF" w:sz="4"/>
+            </w:tcBorders>
+            <w:shd w:fill="1F4E79" w:color="auto" w:val="clear"/>
+            <w:tcMar>
+              <w:top w:type="dxa" w:w="50"/>
+              <w:left w:type="dxa" w:w="90"/>
+              <w:bottom w:type="dxa" w:w="50"/>
+              <w:right w:type="dxa" w:w="90"/>
+            </w:tcMar>
+          </w:tcPr>
+          <w:p>
+            <w:pPr>
+              <w:jc w:val="left"/>
+            </w:pPr>
+            <w:r>
+              <w:rPr>
+                <w:rFonts w:ascii="Calibri" w:cs="Calibri" w:eastAsia="Calibri" w:hAnsi="Calibri"/>
+                <w:b/>
+                <w:bCs/>
+                <w:color w:val="FFFFFF"/>
+                <w:sz w:val="19"/>
+                <w:szCs w:val="19"/>
+              </w:rPr>
+              <w:t xml:space="preserve">Bloque</w:t>
+            </w:r>
+          </w:p>
+        </w:tc>
+        <w:tc>
+          <w:tcPr>
+            <w:tcW w:type="dxa" w:w="6126"/>
+            <w:tcBorders>
+              <w:top w:val="single" w:color="BFBFBF" w:sz="4"/>
+              <w:left w:val="single" w:color="BFBFBF" w:sz="4"/>
+              <w:bottom w:val="single" w:color="BFBFBF" w:sz="4"/>
+              <w:right w:val="single" w:color="BFBFBF" w:sz="4"/>
+            </w:tcBorders>
+            <w:shd w:fill="1F4E79" w:color="auto" w:val="clear"/>
+            <w:tcMar>
+              <w:top w:type="dxa" w:w="50"/>
+              <w:left w:type="dxa" w:w="90"/>
+              <w:bottom w:type="dxa" w:w="50"/>
+              <w:right w:type="dxa" w:w="90"/>
+            </w:tcMar>
+          </w:tcPr>
+          <w:p>
+            <w:pPr>
+              <w:jc w:val="left"/>
+            </w:pPr>
+            <w:r>
+              <w:rPr>
+                <w:rFonts w:ascii="Calibri" w:cs="Calibri" w:eastAsia="Calibri" w:hAnsi="Calibri"/>
+                <w:b/>
+                <w:bCs/>
+                <w:color w:val="FFFFFF"/>
+                <w:sz w:val="19"/>
+                <w:szCs w:val="19"/>
+              </w:rPr>
+              <w:t xml:space="preserve">Función</w:t>
+            </w:r>
+          </w:p>
+        </w:tc>
+      </w:tr>
+      <w:tr>
+        <w:tc>
+          <w:tcPr>
+            <w:tcW w:type="dxa" w:w="2900"/>
+            <w:tcBorders>
+              <w:top w:val="single" w:color="BFBFBF" w:sz="4"/>
+              <w:left w:val="single" w:color="BFBFBF" w:sz="4"/>
+              <w:bottom w:val="single" w:color="BFBFBF" w:sz="4"/>
+              <w:right w:val="single" w:color="BFBFBF" w:sz="4"/>
+            </w:tcBorders>
+            <w:tcMar>
+              <w:top w:type="dxa" w:w="50"/>
+              <w:left w:type="dxa" w:w="90"/>
+              <w:bottom w:type="dxa" w:w="50"/>
+              <w:right w:type="dxa" w:w="90"/>
+            </w:tcMar>
+          </w:tcPr>
+          <w:p>
+            <w:pPr>
+              <w:jc w:val="left"/>
+            </w:pPr>
+            <w:r>
+              <w:rPr>
+                <w:rFonts w:ascii="Calibri" w:cs="Calibri" w:eastAsia="Calibri" w:hAnsi="Calibri"/>
+                <w:b w:val="false"/>
+                <w:bCs w:val="false"/>
+                <w:sz w:val="19"/>
+                <w:szCs w:val="19"/>
+              </w:rPr>
+              <w:t xml:space="preserve">Generador de tramas (Python embebido)</w:t>
+            </w:r>
+          </w:p>
+        </w:tc>
+        <w:tc>
+          <w:tcPr>
+            <w:tcW w:type="dxa" w:w="6126"/>
+            <w:tcBorders>
+              <w:top w:val="single" w:color="BFBFBF" w:sz="4"/>
+              <w:left w:val="single" w:color="BFBFBF" w:sz="4"/>
+              <w:bottom w:val="single" w:color="BFBFBF" w:sz="4"/>
+              <w:right w:val="single" w:color="BFBFBF" w:sz="4"/>
+            </w:tcBorders>
+            <w:tcMar>
+              <w:top w:type="dxa" w:w="50"/>
+              <w:left w:type="dxa" w:w="90"/>
+              <w:bottom w:type="dxa" w:w="50"/>
+              <w:right w:type="dxa" w:w="90"/>
+            </w:tcMar>
+          </w:tcPr>
+          <w:p>
+            <w:pPr>
+              <w:jc w:val="left"/>
+            </w:pPr>
+            <w:r>
+              <w:rPr>
+                <w:rFonts w:ascii="Calibri" w:cs="Calibri" w:eastAsia="Calibri" w:hAnsi="Calibri"/>
+                <w:b w:val="false"/>
+                <w:bCs w:val="false"/>
+                <w:sz w:val="19"/>
+                <w:szCs w:val="19"/>
+              </w:rPr>
+              <w:t xml:space="preserve">Crea tramas con trama.py simulando un vuelo (contador, altitud y presión variables)</w:t>
+            </w:r>
+          </w:p>
+        </w:tc>
+      </w:tr>
+      <w:tr>
+        <w:tc>
+          <w:tcPr>
+            <w:tcW w:type="dxa" w:w="2900"/>
+            <w:tcBorders>
+              <w:top w:val="single" w:color="BFBFBF" w:sz="4"/>
+              <w:left w:val="single" w:color="BFBFBF" w:sz="4"/>
+              <w:bottom w:val="single" w:color="BFBFBF" w:sz="4"/>
+              <w:right w:val="single" w:color="BFBFBF" w:sz="4"/>
+            </w:tcBorders>
+            <w:tcMar>
+              <w:top w:type="dxa" w:w="50"/>
+              <w:left w:type="dxa" w:w="90"/>
+              <w:bottom w:type="dxa" w:w="50"/>
+              <w:right w:type="dxa" w:w="90"/>
+            </w:tcMar>
+          </w:tcPr>
+          <w:p>
+            <w:pPr>
+              <w:jc w:val="left"/>
+            </w:pPr>
+            <w:r>
+              <w:rPr>
+                <w:rFonts w:ascii="Calibri" w:cs="Calibri" w:eastAsia="Calibri" w:hAnsi="Calibri"/>
+                <w:b w:val="false"/>
+                <w:bCs w:val="false"/>
+                <w:sz w:val="19"/>
+                <w:szCs w:val="19"/>
+              </w:rPr>
+              <w:t xml:space="preserve">Modulador, ruido, filtro, demodulador, integrador, decisor</w:t>
+            </w:r>
+          </w:p>
+        </w:tc>
+        <w:tc>
+          <w:tcPr>
+            <w:tcW w:type="dxa" w:w="6126"/>
+            <w:tcBorders>
+              <w:top w:val="single" w:color="BFBFBF" w:sz="4"/>
+              <w:left w:val="single" w:color="BFBFBF" w:sz="4"/>
+              <w:bottom w:val="single" w:color="BFBFBF" w:sz="4"/>
+              <w:right w:val="single" w:color="BFBFBF" w:sz="4"/>
+            </w:tcBorders>
+            <w:tcMar>
+              <w:top w:type="dxa" w:w="50"/>
+              <w:left w:type="dxa" w:w="90"/>
+              <w:bottom w:type="dxa" w:w="50"/>
+              <w:right w:type="dxa" w:w="90"/>
+            </w:tcMar>
+          </w:tcPr>
+          <w:p>
+            <w:pPr>
+              <w:jc w:val="left"/>
+            </w:pPr>
+            <w:r>
+              <w:rPr>
+                <w:rFonts w:ascii="Calibri" w:cs="Calibri" w:eastAsia="Calibri" w:hAnsi="Calibri"/>
+                <w:b w:val="false"/>
+                <w:bCs w:val="false"/>
+                <w:sz w:val="19"/>
+                <w:szCs w:val="19"/>
+              </w:rPr>
+              <w:t xml:space="preserve">Igual que en el flujo 02</w:t>
+            </w:r>
+          </w:p>
+        </w:tc>
+      </w:tr>
+      <w:tr>
+        <w:tc>
+          <w:tcPr>
+            <w:tcW w:type="dxa" w:w="2900"/>
+            <w:tcBorders>
+              <w:top w:val="single" w:color="BFBFBF" w:sz="4"/>
+              <w:left w:val="single" w:color="BFBFBF" w:sz="4"/>
+              <w:bottom w:val="single" w:color="BFBFBF" w:sz="4"/>
+              <w:right w:val="single" w:color="BFBFBF" w:sz="4"/>
+            </w:tcBorders>
+            <w:tcMar>
+              <w:top w:type="dxa" w:w="50"/>
+              <w:left w:type="dxa" w:w="90"/>
+              <w:bottom w:type="dxa" w:w="50"/>
+              <w:right w:type="dxa" w:w="90"/>
+            </w:tcMar>
+          </w:tcPr>
+          <w:p>
+            <w:pPr>
+              <w:jc w:val="left"/>
+            </w:pPr>
+            <w:r>
+              <w:rPr>
+                <w:rFonts w:ascii="Calibri" w:cs="Calibri" w:eastAsia="Calibri" w:hAnsi="Calibri"/>
+                <w:b w:val="false"/>
+                <w:bCs w:val="false"/>
+                <w:sz w:val="19"/>
+                <w:szCs w:val="19"/>
+              </w:rPr>
+              <w:t xml:space="preserve">Correlate Access Code</w:t>
+            </w:r>
+          </w:p>
+        </w:tc>
+        <w:tc>
+          <w:tcPr>
+            <w:tcW w:type="dxa" w:w="6126"/>
+            <w:tcBorders>
+              <w:top w:val="single" w:color="BFBFBF" w:sz="4"/>
+              <w:left w:val="single" w:color="BFBFBF" w:sz="4"/>
+              <w:bottom w:val="single" w:color="BFBFBF" w:sz="4"/>
+              <w:right w:val="single" w:color="BFBFBF" w:sz="4"/>
+            </w:tcBorders>
+            <w:tcMar>
+              <w:top w:type="dxa" w:w="50"/>
+              <w:left w:type="dxa" w:w="90"/>
+              <w:bottom w:type="dxa" w:w="50"/>
+              <w:right w:type="dxa" w:w="90"/>
+            </w:tcMar>
+          </w:tcPr>
+          <w:p>
+            <w:pPr>
+              <w:jc w:val="left"/>
+            </w:pPr>
+            <w:r>
+              <w:rPr>
+                <w:rFonts w:ascii="Calibri" w:cs="Calibri" w:eastAsia="Calibri" w:hAnsi="Calibri"/>
+                <w:b w:val="false"/>
+                <w:bCs w:val="false"/>
+                <w:sz w:val="19"/>
+                <w:szCs w:val="19"/>
+              </w:rPr>
+              <w:t xml:space="preserve">Busca 1A CF FC 1D (hasta 2 bits erróneos) y marca el inicio de cada trama</w:t>
+            </w:r>
+          </w:p>
+        </w:tc>
+      </w:tr>
+      <w:tr>
+        <w:tc>
+          <w:tcPr>
+            <w:tcW w:type="dxa" w:w="2900"/>
+            <w:tcBorders>
+              <w:top w:val="single" w:color="BFBFBF" w:sz="4"/>
+              <w:left w:val="single" w:color="BFBFBF" w:sz="4"/>
+              <w:bottom w:val="single" w:color="BFBFBF" w:sz="4"/>
+              <w:right w:val="single" w:color="BFBFBF" w:sz="4"/>
+            </w:tcBorders>
+            <w:tcMar>
+              <w:top w:type="dxa" w:w="50"/>
+              <w:left w:type="dxa" w:w="90"/>
+              <w:bottom w:type="dxa" w:w="50"/>
+              <w:right w:type="dxa" w:w="90"/>
+            </w:tcMar>
+          </w:tcPr>
+          <w:p>
+            <w:pPr>
+              <w:jc w:val="left"/>
+            </w:pPr>
+            <w:r>
+              <w:rPr>
+                <w:rFonts w:ascii="Calibri" w:cs="Calibri" w:eastAsia="Calibri" w:hAnsi="Calibri"/>
+                <w:b w:val="false"/>
+                <w:bCs w:val="false"/>
+                <w:sz w:val="19"/>
+                <w:szCs w:val="19"/>
+              </w:rPr>
+              <w:t xml:space="preserve">Descodificador de tramas (Python embebido)</w:t>
+            </w:r>
+          </w:p>
+        </w:tc>
+        <w:tc>
+          <w:tcPr>
+            <w:tcW w:type="dxa" w:w="6126"/>
+            <w:tcBorders>
+              <w:top w:val="single" w:color="BFBFBF" w:sz="4"/>
+              <w:left w:val="single" w:color="BFBFBF" w:sz="4"/>
+              <w:bottom w:val="single" w:color="BFBFBF" w:sz="4"/>
+              <w:right w:val="single" w:color="BFBFBF" w:sz="4"/>
+            </w:tcBorders>
+            <w:tcMar>
+              <w:top w:type="dxa" w:w="50"/>
+              <w:left w:type="dxa" w:w="90"/>
+              <w:bottom w:type="dxa" w:w="50"/>
+              <w:right w:type="dxa" w:w="90"/>
+            </w:tcMar>
+          </w:tcPr>
+          <w:p>
+            <w:pPr>
+              <w:jc w:val="left"/>
+            </w:pPr>
+            <w:r>
+              <w:rPr>
+                <w:rFonts w:ascii="Calibri" w:cs="Calibri" w:eastAsia="Calibri" w:hAnsi="Calibri"/>
+                <w:b w:val="false"/>
+                <w:bCs w:val="false"/>
+                <w:sz w:val="19"/>
+                <w:szCs w:val="19"/>
+              </w:rPr>
+              <w:t xml:space="preserve">Recorta 78 bytes, corrige con Reed-Solomon, comprueba el CRC y muestra la telemetría en consola</w:t>
+            </w:r>
+          </w:p>
+        </w:tc>
+      </w:tr>
+      <w:tr>
+        <w:tc>
+          <w:tcPr>
+            <w:tcW w:type="dxa" w:w="2900"/>
+            <w:tcBorders>
+              <w:top w:val="single" w:color="BFBFBF" w:sz="4"/>
+              <w:left w:val="single" w:color="BFBFBF" w:sz="4"/>
+              <w:bottom w:val="single" w:color="BFBFBF" w:sz="4"/>
+              <w:right w:val="single" w:color="BFBFBF" w:sz="4"/>
+            </w:tcBorders>
+            <w:tcMar>
+              <w:top w:type="dxa" w:w="50"/>
+              <w:left w:type="dxa" w:w="90"/>
+              <w:bottom w:type="dxa" w:w="50"/>
+              <w:right w:type="dxa" w:w="90"/>
+            </w:tcMar>
+          </w:tcPr>
+          <w:p>
+            <w:pPr>
+              <w:jc w:val="left"/>
+            </w:pPr>
+            <w:r>
+              <w:rPr>
+                <w:rFonts w:ascii="Calibri" w:cs="Calibri" w:eastAsia="Calibri" w:hAnsi="Calibri"/>
+                <w:b w:val="false"/>
+                <w:bCs w:val="false"/>
+                <w:sz w:val="19"/>
+                <w:szCs w:val="19"/>
+              </w:rPr>
+              <w:t xml:space="preserve">Tramas perdidas</w:t>
+            </w:r>
+          </w:p>
+        </w:tc>
+        <w:tc>
+          <w:tcPr>
+            <w:tcW w:type="dxa" w:w="6126"/>
+            <w:tcBorders>
+              <w:top w:val="single" w:color="BFBFBF" w:sz="4"/>
+              <w:left w:val="single" w:color="BFBFBF" w:sz="4"/>
+              <w:bottom w:val="single" w:color="BFBFBF" w:sz="4"/>
+              <w:right w:val="single" w:color="BFBFBF" w:sz="4"/>
+            </w:tcBorders>
+            <w:tcMar>
+              <w:top w:type="dxa" w:w="50"/>
+              <w:left w:type="dxa" w:w="90"/>
+              <w:bottom w:type="dxa" w:w="50"/>
+              <w:right w:type="dxa" w:w="90"/>
+            </w:tcMar>
+          </w:tcPr>
+          <w:p>
+            <w:pPr>
+              <w:jc w:val="left"/>
+            </w:pPr>
+            <w:r>
+              <w:rPr>
+                <w:rFonts w:ascii="Calibri" w:cs="Calibri" w:eastAsia="Calibri" w:hAnsi="Calibri"/>
+                <w:b w:val="false"/>
+                <w:bCs w:val="false"/>
+                <w:sz w:val="19"/>
+                <w:szCs w:val="19"/>
+              </w:rPr>
+              <w:t xml:space="preserve">Porcentaje de tramas no recibidas en las últimas 100 (huecos del contador)</w:t>
+            </w:r>
+          </w:p>
+        </w:tc>
+      </w:tr>
+    </w:tbl>
+    <w:p>
+      <w:pPr>
+        <w:spacing w:after="200" w:before="60"/>
+        <w:jc w:val="center"/>
+      </w:pPr>
+      <w:r>
+        <w:rPr>
+          <w:rFonts w:ascii="Calibri" w:cs="Calibri" w:eastAsia="Calibri" w:hAnsi="Calibri"/>
+          <w:i/>
+          <w:iCs/>
+          <w:color w:val="595959"/>
+          <w:sz w:val="19"/>
+          <w:szCs w:val="19"/>
+        </w:rPr>
+        <w:t xml:space="preserve">Tabla 18. Bloques añadidos en el flujo 03.</w:t>
+      </w:r>
+    </w:p>
+    <w:tbl>
+      <w:tblPr>
+        <w:tblW w:type="dxa" w:w="9026"/>
+        <w:tblBorders>
+          <w:top w:val="single" w:color="auto" w:sz="4"/>
+          <w:left w:val="single" w:color="auto" w:sz="4"/>
+          <w:bottom w:val="single" w:color="auto" w:sz="4"/>
+          <w:right w:val="single" w:color="auto" w:sz="4"/>
+          <w:insideH w:val="single" w:color="auto" w:sz="4"/>
+          <w:insideV w:val="single" w:color="auto" w:sz="4"/>
+        </w:tblBorders>
+      </w:tblPr>
+      <w:tblGrid>
+        <w:gridCol w:w="1300"/>
+        <w:gridCol w:w="1500"/>
+        <w:gridCol w:w="6226"/>
+      </w:tblGrid>
+      <w:tr>
+        <w:trPr>
+          <w:tblHeader/>
+        </w:trPr>
+        <w:tc>
+          <w:tcPr>
+            <w:tcW w:type="dxa" w:w="1300"/>
+            <w:tcBorders>
+              <w:top w:val="single" w:color="BFBFBF" w:sz="4"/>
+              <w:left w:val="single" w:color="BFBFBF" w:sz="4"/>
+              <w:bottom w:val="single" w:color="BFBFBF" w:sz="4"/>
+              <w:right w:val="single" w:color="BFBFBF" w:sz="4"/>
+            </w:tcBorders>
+            <w:shd w:fill="1F4E79" w:color="auto" w:val="clear"/>
+            <w:tcMar>
+              <w:top w:type="dxa" w:w="50"/>
+              <w:left w:type="dxa" w:w="90"/>
+              <w:bottom w:type="dxa" w:w="50"/>
+              <w:right w:type="dxa" w:w="90"/>
+            </w:tcMar>
+          </w:tcPr>
+          <w:p>
+            <w:pPr>
+              <w:jc w:val="left"/>
+            </w:pPr>
+            <w:r>
+              <w:rPr>
+                <w:rFonts w:ascii="Calibri" w:cs="Calibri" w:eastAsia="Calibri" w:hAnsi="Calibri"/>
+                <w:b/>
+                <w:bCs/>
+                <w:color w:val="FFFFFF"/>
+                <w:sz w:val="19"/>
+                <w:szCs w:val="19"/>
+              </w:rPr>
+              <w:t xml:space="preserve">Ruido</w:t>
+            </w:r>
+          </w:p>
+        </w:tc>
+        <w:tc>
+          <w:tcPr>
+            <w:tcW w:type="dxa" w:w="1500"/>
+            <w:tcBorders>
+              <w:top w:val="single" w:color="BFBFBF" w:sz="4"/>
+              <w:left w:val="single" w:color="BFBFBF" w:sz="4"/>
+              <w:bottom w:val="single" w:color="BFBFBF" w:sz="4"/>
+              <w:right w:val="single" w:color="BFBFBF" w:sz="4"/>
+            </w:tcBorders>
+            <w:shd w:fill="1F4E79" w:color="auto" w:val="clear"/>
+            <w:tcMar>
+              <w:top w:type="dxa" w:w="50"/>
+              <w:left w:type="dxa" w:w="90"/>
+              <w:bottom w:type="dxa" w:w="50"/>
+              <w:right w:type="dxa" w:w="90"/>
+            </w:tcMar>
+          </w:tcPr>
+          <w:p>
+            <w:pPr>
+              <w:jc w:val="left"/>
+            </w:pPr>
+            <w:r>
+              <w:rPr>
+                <w:rFonts w:ascii="Calibri" w:cs="Calibri" w:eastAsia="Calibri" w:hAnsi="Calibri"/>
+                <w:b/>
+                <w:bCs/>
+                <w:color w:val="FFFFFF"/>
+                <w:sz w:val="19"/>
+                <w:szCs w:val="19"/>
+              </w:rPr>
+              <w:t xml:space="preserve">Eb/N0</w:t>
+            </w:r>
+          </w:p>
+        </w:tc>
+        <w:tc>
+          <w:tcPr>
+            <w:tcW w:type="dxa" w:w="6226"/>
+            <w:tcBorders>
+              <w:top w:val="single" w:color="BFBFBF" w:sz="4"/>
+              <w:left w:val="single" w:color="BFBFBF" w:sz="4"/>
+              <w:bottom w:val="single" w:color="BFBFBF" w:sz="4"/>
+              <w:right w:val="single" w:color="BFBFBF" w:sz="4"/>
+            </w:tcBorders>
+            <w:shd w:fill="1F4E79" w:color="auto" w:val="clear"/>
+            <w:tcMar>
+              <w:top w:type="dxa" w:w="50"/>
+              <w:left w:type="dxa" w:w="90"/>
+              <w:bottom w:type="dxa" w:w="50"/>
+              <w:right w:type="dxa" w:w="90"/>
+            </w:tcMar>
+          </w:tcPr>
+          <w:p>
+            <w:pPr>
+              <w:jc w:val="left"/>
+            </w:pPr>
+            <w:r>
+              <w:rPr>
+                <w:rFonts w:ascii="Calibri" w:cs="Calibri" w:eastAsia="Calibri" w:hAnsi="Calibri"/>
+                <w:b/>
+                <w:bCs/>
+                <w:color w:val="FFFFFF"/>
+                <w:sz w:val="19"/>
+                <w:szCs w:val="19"/>
+              </w:rPr>
+              <w:t xml:space="preserve">Resultado</w:t>
+            </w:r>
+          </w:p>
+        </w:tc>
+      </w:tr>
+      <w:tr>
+        <w:tc>
+          <w:tcPr>
+            <w:tcW w:type="dxa" w:w="1300"/>
+            <w:tcBorders>
+              <w:top w:val="single" w:color="BFBFBF" w:sz="4"/>
+              <w:left w:val="single" w:color="BFBFBF" w:sz="4"/>
+              <w:bottom w:val="single" w:color="BFBFBF" w:sz="4"/>
+              <w:right w:val="single" w:color="BFBFBF" w:sz="4"/>
+            </w:tcBorders>
+            <w:tcMar>
+              <w:top w:type="dxa" w:w="50"/>
+              <w:left w:type="dxa" w:w="90"/>
+              <w:bottom w:type="dxa" w:w="50"/>
+              <w:right w:type="dxa" w:w="90"/>
+            </w:tcMar>
+          </w:tcPr>
+          <w:p>
+            <w:pPr>
+              <w:jc w:val="left"/>
+            </w:pPr>
+            <w:r>
+              <w:rPr>
+                <w:rFonts w:ascii="Calibri" w:cs="Calibri" w:eastAsia="Calibri" w:hAnsi="Calibri"/>
+                <w:b w:val="false"/>
+                <w:bCs w:val="false"/>
+                <w:sz w:val="19"/>
+                <w:szCs w:val="19"/>
+              </w:rPr>
+              <w:t xml:space="preserve">0,30</w:t>
+            </w:r>
+          </w:p>
+        </w:tc>
+        <w:tc>
+          <w:tcPr>
+            <w:tcW w:type="dxa" w:w="1500"/>
+            <w:tcBorders>
+              <w:top w:val="single" w:color="BFBFBF" w:sz="4"/>
+              <w:left w:val="single" w:color="BFBFBF" w:sz="4"/>
+              <w:bottom w:val="single" w:color="BFBFBF" w:sz="4"/>
+              <w:right w:val="single" w:color="BFBFBF" w:sz="4"/>
+            </w:tcBorders>
+            <w:tcMar>
+              <w:top w:type="dxa" w:w="50"/>
+              <w:left w:type="dxa" w:w="90"/>
+              <w:bottom w:type="dxa" w:w="50"/>
+              <w:right w:type="dxa" w:w="90"/>
+            </w:tcMar>
+          </w:tcPr>
+          <w:p>
+            <w:pPr>
+              <w:jc w:val="left"/>
+            </w:pPr>
+            <w:r>
+              <w:rPr>
+                <w:rFonts w:ascii="Calibri" w:cs="Calibri" w:eastAsia="Calibri" w:hAnsi="Calibri"/>
+                <w:b w:val="false"/>
+                <w:bCs w:val="false"/>
+                <w:sz w:val="19"/>
+                <w:szCs w:val="19"/>
+              </w:rPr>
+              <w:t xml:space="preserve">20,5 dB</w:t>
+            </w:r>
+          </w:p>
+        </w:tc>
+        <w:tc>
+          <w:tcPr>
+            <w:tcW w:type="dxa" w:w="6226"/>
+            <w:tcBorders>
+              <w:top w:val="single" w:color="BFBFBF" w:sz="4"/>
+              <w:left w:val="single" w:color="BFBFBF" w:sz="4"/>
+              <w:bottom w:val="single" w:color="BFBFBF" w:sz="4"/>
+              <w:right w:val="single" w:color="BFBFBF" w:sz="4"/>
+            </w:tcBorders>
+            <w:tcMar>
+              <w:top w:type="dxa" w:w="50"/>
+              <w:left w:type="dxa" w:w="90"/>
+              <w:bottom w:type="dxa" w:w="50"/>
+              <w:right w:type="dxa" w:w="90"/>
+            </w:tcMar>
+          </w:tcPr>
+          <w:p>
+            <w:pPr>
+              <w:jc w:val="left"/>
+            </w:pPr>
+            <w:r>
+              <w:rPr>
+                <w:rFonts w:ascii="Calibri" w:cs="Calibri" w:eastAsia="Calibri" w:hAnsi="Calibri"/>
+                <w:b w:val="false"/>
+                <w:bCs w:val="false"/>
+                <w:sz w:val="19"/>
+                <w:szCs w:val="19"/>
+              </w:rPr>
+              <w:t xml:space="preserve">Todas las tramas recibidas sin correcciones</w:t>
+            </w:r>
+          </w:p>
+        </w:tc>
+      </w:tr>
+      <w:tr>
+        <w:tc>
+          <w:tcPr>
+            <w:tcW w:type="dxa" w:w="1300"/>
+            <w:tcBorders>
+              <w:top w:val="single" w:color="BFBFBF" w:sz="4"/>
+              <w:left w:val="single" w:color="BFBFBF" w:sz="4"/>
+              <w:bottom w:val="single" w:color="BFBFBF" w:sz="4"/>
+              <w:right w:val="single" w:color="BFBFBF" w:sz="4"/>
+            </w:tcBorders>
+            <w:tcMar>
+              <w:top w:type="dxa" w:w="50"/>
+              <w:left w:type="dxa" w:w="90"/>
+              <w:bottom w:type="dxa" w:w="50"/>
+              <w:right w:type="dxa" w:w="90"/>
+            </w:tcMar>
+          </w:tcPr>
+          <w:p>
+            <w:pPr>
+              <w:jc w:val="left"/>
+            </w:pPr>
+            <w:r>
+              <w:rPr>
+                <w:rFonts w:ascii="Calibri" w:cs="Calibri" w:eastAsia="Calibri" w:hAnsi="Calibri"/>
+                <w:b w:val="false"/>
+                <w:bCs w:val="false"/>
+                <w:sz w:val="19"/>
+                <w:szCs w:val="19"/>
+              </w:rPr>
+              <w:t xml:space="preserve">0,80</w:t>
+            </w:r>
+          </w:p>
+        </w:tc>
+        <w:tc>
+          <w:tcPr>
+            <w:tcW w:type="dxa" w:w="1500"/>
+            <w:tcBorders>
+              <w:top w:val="single" w:color="BFBFBF" w:sz="4"/>
+              <w:left w:val="single" w:color="BFBFBF" w:sz="4"/>
+              <w:bottom w:val="single" w:color="BFBFBF" w:sz="4"/>
+              <w:right w:val="single" w:color="BFBFBF" w:sz="4"/>
+            </w:tcBorders>
+            <w:tcMar>
+              <w:top w:type="dxa" w:w="50"/>
+              <w:left w:type="dxa" w:w="90"/>
+              <w:bottom w:type="dxa" w:w="50"/>
+              <w:right w:type="dxa" w:w="90"/>
+            </w:tcMar>
+          </w:tcPr>
+          <w:p>
+            <w:pPr>
+              <w:jc w:val="left"/>
+            </w:pPr>
+            <w:r>
+              <w:rPr>
+                <w:rFonts w:ascii="Calibri" w:cs="Calibri" w:eastAsia="Calibri" w:hAnsi="Calibri"/>
+                <w:b w:val="false"/>
+                <w:bCs w:val="false"/>
+                <w:sz w:val="19"/>
+                <w:szCs w:val="19"/>
+              </w:rPr>
+              <w:t xml:space="preserve">11,9 dB</w:t>
+            </w:r>
+          </w:p>
+        </w:tc>
+        <w:tc>
+          <w:tcPr>
+            <w:tcW w:type="dxa" w:w="6226"/>
+            <w:tcBorders>
+              <w:top w:val="single" w:color="BFBFBF" w:sz="4"/>
+              <w:left w:val="single" w:color="BFBFBF" w:sz="4"/>
+              <w:bottom w:val="single" w:color="BFBFBF" w:sz="4"/>
+              <w:right w:val="single" w:color="BFBFBF" w:sz="4"/>
+            </w:tcBorders>
+            <w:tcMar>
+              <w:top w:type="dxa" w:w="50"/>
+              <w:left w:type="dxa" w:w="90"/>
+              <w:bottom w:type="dxa" w:w="50"/>
+              <w:right w:type="dxa" w:w="90"/>
+            </w:tcMar>
+          </w:tcPr>
+          <w:p>
+            <w:pPr>
+              <w:jc w:val="left"/>
+            </w:pPr>
+            <w:r>
+              <w:rPr>
+                <w:rFonts w:ascii="Calibri" w:cs="Calibri" w:eastAsia="Calibri" w:hAnsi="Calibri"/>
+                <w:b w:val="false"/>
+                <w:bCs w:val="false"/>
+                <w:sz w:val="19"/>
+                <w:szCs w:val="19"/>
+              </w:rPr>
+              <w:t xml:space="preserve">Todas recibidas; ~30 % con 1–2 bytes corregidos por RS</w:t>
+            </w:r>
+          </w:p>
+        </w:tc>
+      </w:tr>
+      <w:tr>
+        <w:tc>
+          <w:tcPr>
+            <w:tcW w:type="dxa" w:w="1300"/>
+            <w:tcBorders>
+              <w:top w:val="single" w:color="BFBFBF" w:sz="4"/>
+              <w:left w:val="single" w:color="BFBFBF" w:sz="4"/>
+              <w:bottom w:val="single" w:color="BFBFBF" w:sz="4"/>
+              <w:right w:val="single" w:color="BFBFBF" w:sz="4"/>
+            </w:tcBorders>
+            <w:tcMar>
+              <w:top w:type="dxa" w:w="50"/>
+              <w:left w:type="dxa" w:w="90"/>
+              <w:bottom w:type="dxa" w:w="50"/>
+              <w:right w:type="dxa" w:w="90"/>
+            </w:tcMar>
+          </w:tcPr>
+          <w:p>
+            <w:pPr>
+              <w:jc w:val="left"/>
+            </w:pPr>
+            <w:r>
+              <w:rPr>
+                <w:rFonts w:ascii="Calibri" w:cs="Calibri" w:eastAsia="Calibri" w:hAnsi="Calibri"/>
+                <w:b w:val="false"/>
+                <w:bCs w:val="false"/>
+                <w:sz w:val="19"/>
+                <w:szCs w:val="19"/>
+              </w:rPr>
+              <w:t xml:space="preserve">1,00</w:t>
+            </w:r>
+          </w:p>
+        </w:tc>
+        <w:tc>
+          <w:tcPr>
+            <w:tcW w:type="dxa" w:w="1500"/>
+            <w:tcBorders>
+              <w:top w:val="single" w:color="BFBFBF" w:sz="4"/>
+              <w:left w:val="single" w:color="BFBFBF" w:sz="4"/>
+              <w:bottom w:val="single" w:color="BFBFBF" w:sz="4"/>
+              <w:right w:val="single" w:color="BFBFBF" w:sz="4"/>
+            </w:tcBorders>
+            <w:tcMar>
+              <w:top w:type="dxa" w:w="50"/>
+              <w:left w:type="dxa" w:w="90"/>
+              <w:bottom w:type="dxa" w:w="50"/>
+              <w:right w:type="dxa" w:w="90"/>
+            </w:tcMar>
+          </w:tcPr>
+          <w:p>
+            <w:pPr>
+              <w:jc w:val="left"/>
+            </w:pPr>
+            <w:r>
+              <w:rPr>
+                <w:rFonts w:ascii="Calibri" w:cs="Calibri" w:eastAsia="Calibri" w:hAnsi="Calibri"/>
+                <w:b w:val="false"/>
+                <w:bCs w:val="false"/>
+                <w:sz w:val="19"/>
+                <w:szCs w:val="19"/>
+              </w:rPr>
+              <w:t xml:space="preserve">10,0 dB</w:t>
+            </w:r>
+          </w:p>
+        </w:tc>
+        <w:tc>
+          <w:tcPr>
+            <w:tcW w:type="dxa" w:w="6226"/>
+            <w:tcBorders>
+              <w:top w:val="single" w:color="BFBFBF" w:sz="4"/>
+              <w:left w:val="single" w:color="BFBFBF" w:sz="4"/>
+              <w:bottom w:val="single" w:color="BFBFBF" w:sz="4"/>
+              <w:right w:val="single" w:color="BFBFBF" w:sz="4"/>
+            </w:tcBorders>
+            <w:tcMar>
+              <w:top w:type="dxa" w:w="50"/>
+              <w:left w:type="dxa" w:w="90"/>
+              <w:bottom w:type="dxa" w:w="50"/>
+              <w:right w:type="dxa" w:w="90"/>
+            </w:tcMar>
+          </w:tcPr>
+          <w:p>
+            <w:pPr>
+              <w:jc w:val="left"/>
+            </w:pPr>
+            <w:r>
+              <w:rPr>
+                <w:rFonts w:ascii="Calibri" w:cs="Calibri" w:eastAsia="Calibri" w:hAnsi="Calibri"/>
+                <w:b w:val="false"/>
+                <w:bCs w:val="false"/>
+                <w:sz w:val="19"/>
+                <w:szCs w:val="19"/>
+              </w:rPr>
+              <w:t xml:space="preserve">Todas recibidas; el 100 % necesitó corrección (BER ≈ 7 × 10⁻³)</w:t>
+            </w:r>
+          </w:p>
+        </w:tc>
+      </w:tr>
+      <w:tr>
+        <w:tc>
+          <w:tcPr>
+            <w:tcW w:type="dxa" w:w="1300"/>
+            <w:tcBorders>
+              <w:top w:val="single" w:color="BFBFBF" w:sz="4"/>
+              <w:left w:val="single" w:color="BFBFBF" w:sz="4"/>
+              <w:bottom w:val="single" w:color="BFBFBF" w:sz="4"/>
+              <w:right w:val="single" w:color="BFBFBF" w:sz="4"/>
+            </w:tcBorders>
+            <w:shd w:fill="DEEAF6" w:color="auto" w:val="clear"/>
+            <w:tcMar>
+              <w:top w:type="dxa" w:w="50"/>
+              <w:left w:type="dxa" w:w="90"/>
+              <w:bottom w:type="dxa" w:w="50"/>
+              <w:right w:type="dxa" w:w="90"/>
+            </w:tcMar>
+          </w:tcPr>
+          <w:p>
+            <w:pPr>
+              <w:jc w:val="left"/>
+            </w:pPr>
+            <w:r>
+              <w:rPr>
+                <w:rFonts w:ascii="Calibri" w:cs="Calibri" w:eastAsia="Calibri" w:hAnsi="Calibri"/>
+                <w:b/>
+                <w:bCs/>
+                <w:sz w:val="19"/>
+                <w:szCs w:val="19"/>
+              </w:rPr>
+              <w:t xml:space="preserve">1,18</w:t>
+            </w:r>
+          </w:p>
+        </w:tc>
+        <w:tc>
+          <w:tcPr>
+            <w:tcW w:type="dxa" w:w="1500"/>
+            <w:tcBorders>
+              <w:top w:val="single" w:color="BFBFBF" w:sz="4"/>
+              <w:left w:val="single" w:color="BFBFBF" w:sz="4"/>
+              <w:bottom w:val="single" w:color="BFBFBF" w:sz="4"/>
+              <w:right w:val="single" w:color="BFBFBF" w:sz="4"/>
+            </w:tcBorders>
+            <w:shd w:fill="DEEAF6" w:color="auto" w:val="clear"/>
+            <w:tcMar>
+              <w:top w:type="dxa" w:w="50"/>
+              <w:left w:type="dxa" w:w="90"/>
+              <w:bottom w:type="dxa" w:w="50"/>
+              <w:right w:type="dxa" w:w="90"/>
+            </w:tcMar>
+          </w:tcPr>
+          <w:p>
+            <w:pPr>
+              <w:jc w:val="left"/>
+            </w:pPr>
+            <w:r>
+              <w:rPr>
+                <w:rFonts w:ascii="Calibri" w:cs="Calibri" w:eastAsia="Calibri" w:hAnsi="Calibri"/>
+                <w:b/>
+                <w:bCs/>
+                <w:sz w:val="19"/>
+                <w:szCs w:val="19"/>
+              </w:rPr>
+              <w:t xml:space="preserve">8,6 dB</w:t>
+            </w:r>
+          </w:p>
+        </w:tc>
+        <w:tc>
+          <w:tcPr>
+            <w:tcW w:type="dxa" w:w="6226"/>
+            <w:tcBorders>
+              <w:top w:val="single" w:color="BFBFBF" w:sz="4"/>
+              <w:left w:val="single" w:color="BFBFBF" w:sz="4"/>
+              <w:bottom w:val="single" w:color="BFBFBF" w:sz="4"/>
+              <w:right w:val="single" w:color="BFBFBF" w:sz="4"/>
+            </w:tcBorders>
+            <w:shd w:fill="DEEAF6" w:color="auto" w:val="clear"/>
+            <w:tcMar>
+              <w:top w:type="dxa" w:w="50"/>
+              <w:left w:type="dxa" w:w="90"/>
+              <w:bottom w:type="dxa" w:w="50"/>
+              <w:right w:type="dxa" w:w="90"/>
+            </w:tcMar>
+          </w:tcPr>
+          <w:p>
+            <w:pPr>
+              <w:jc w:val="left"/>
+            </w:pPr>
+            <w:r>
+              <w:rPr>
+                <w:rFonts w:ascii="Calibri" w:cs="Calibri" w:eastAsia="Calibri" w:hAnsi="Calibri"/>
+                <w:b/>
+                <w:bCs/>
+                <w:sz w:val="19"/>
+                <w:szCs w:val="19"/>
+              </w:rPr>
+              <w:t xml:space="preserve">Umbral: empiezan a perderse tramas (medida de Alejandro)</w:t>
+            </w:r>
+          </w:p>
+        </w:tc>
+      </w:tr>
+      <w:tr>
+        <w:tc>
+          <w:tcPr>
+            <w:tcW w:type="dxa" w:w="1300"/>
+            <w:tcBorders>
+              <w:top w:val="single" w:color="BFBFBF" w:sz="4"/>
+              <w:left w:val="single" w:color="BFBFBF" w:sz="4"/>
+              <w:bottom w:val="single" w:color="BFBFBF" w:sz="4"/>
+              <w:right w:val="single" w:color="BFBFBF" w:sz="4"/>
+            </w:tcBorders>
+            <w:tcMar>
+              <w:top w:type="dxa" w:w="50"/>
+              <w:left w:type="dxa" w:w="90"/>
+              <w:bottom w:type="dxa" w:w="50"/>
+              <w:right w:type="dxa" w:w="90"/>
+            </w:tcMar>
+          </w:tcPr>
+          <w:p>
+            <w:pPr>
+              <w:jc w:val="left"/>
+            </w:pPr>
+            <w:r>
+              <w:rPr>
+                <w:rFonts w:ascii="Calibri" w:cs="Calibri" w:eastAsia="Calibri" w:hAnsi="Calibri"/>
+                <w:b w:val="false"/>
+                <w:bCs w:val="false"/>
+                <w:sz w:val="19"/>
+                <w:szCs w:val="19"/>
+              </w:rPr>
+              <w:t xml:space="preserve">1,20</w:t>
+            </w:r>
+          </w:p>
+        </w:tc>
+        <w:tc>
+          <w:tcPr>
+            <w:tcW w:type="dxa" w:w="1500"/>
+            <w:tcBorders>
+              <w:top w:val="single" w:color="BFBFBF" w:sz="4"/>
+              <w:left w:val="single" w:color="BFBFBF" w:sz="4"/>
+              <w:bottom w:val="single" w:color="BFBFBF" w:sz="4"/>
+              <w:right w:val="single" w:color="BFBFBF" w:sz="4"/>
+            </w:tcBorders>
+            <w:tcMar>
+              <w:top w:type="dxa" w:w="50"/>
+              <w:left w:type="dxa" w:w="90"/>
+              <w:bottom w:type="dxa" w:w="50"/>
+              <w:right w:type="dxa" w:w="90"/>
+            </w:tcMar>
+          </w:tcPr>
+          <w:p>
+            <w:pPr>
+              <w:jc w:val="left"/>
+            </w:pPr>
+            <w:r>
+              <w:rPr>
+                <w:rFonts w:ascii="Calibri" w:cs="Calibri" w:eastAsia="Calibri" w:hAnsi="Calibri"/>
+                <w:b w:val="false"/>
+                <w:bCs w:val="false"/>
+                <w:sz w:val="19"/>
+                <w:szCs w:val="19"/>
+              </w:rPr>
+              <w:t xml:space="preserve">8,4 dB</w:t>
+            </w:r>
+          </w:p>
+        </w:tc>
+        <w:tc>
+          <w:tcPr>
+            <w:tcW w:type="dxa" w:w="6226"/>
+            <w:tcBorders>
+              <w:top w:val="single" w:color="BFBFBF" w:sz="4"/>
+              <w:left w:val="single" w:color="BFBFBF" w:sz="4"/>
+              <w:bottom w:val="single" w:color="BFBFBF" w:sz="4"/>
+              <w:right w:val="single" w:color="BFBFBF" w:sz="4"/>
+            </w:tcBorders>
+            <w:tcMar>
+              <w:top w:type="dxa" w:w="50"/>
+              <w:left w:type="dxa" w:w="90"/>
+              <w:bottom w:type="dxa" w:w="50"/>
+              <w:right w:type="dxa" w:w="90"/>
+            </w:tcMar>
+          </w:tcPr>
+          <w:p>
+            <w:pPr>
+              <w:jc w:val="left"/>
+            </w:pPr>
+            <w:r>
+              <w:rPr>
+                <w:rFonts w:ascii="Calibri" w:cs="Calibri" w:eastAsia="Calibri" w:hAnsi="Calibri"/>
+                <w:b w:val="false"/>
+                <w:bCs w:val="false"/>
+                <w:sz w:val="19"/>
+                <w:szCs w:val="19"/>
+              </w:rPr>
+              <w:t xml:space="preserve">17 % de tramas perdidas</w:t>
+            </w:r>
+          </w:p>
+        </w:tc>
+      </w:tr>
+    </w:tbl>
+    <w:p>
+      <w:pPr>
+        <w:spacing w:after="200" w:before="60"/>
+        <w:jc w:val="center"/>
+      </w:pPr>
+      <w:r>
+        <w:rPr>
+          <w:rFonts w:ascii="Calibri" w:cs="Calibri" w:eastAsia="Calibri" w:hAnsi="Calibri"/>
+          <w:i/>
+          <w:iCs/>
+          <w:color w:val="595959"/>
+          <w:sz w:val="19"/>
+          <w:szCs w:val="19"/>
+        </w:rPr>
+        <w:t xml:space="preserve">Tabla 19. Recepción de tramas frente al ruido.</w:t>
+      </w:r>
+    </w:p>
+    <w:tbl>
+      <w:tblPr>
+        <w:tblW w:type="dxa" w:w="9026"/>
+        <w:tblBorders>
+          <w:top w:val="single" w:color="auto" w:sz="4"/>
+          <w:left w:val="single" w:color="auto" w:sz="4"/>
+          <w:bottom w:val="single" w:color="auto" w:sz="4"/>
+          <w:right w:val="single" w:color="auto" w:sz="4"/>
+          <w:insideH w:val="single" w:color="auto" w:sz="4"/>
+          <w:insideV w:val="single" w:color="auto" w:sz="4"/>
+        </w:tblBorders>
+      </w:tblPr>
+      <w:tblGrid>
+        <w:gridCol w:w="9026"/>
+      </w:tblGrid>
+      <w:tr>
+        <w:tc>
+          <w:tcPr>
+            <w:tcW w:type="dxa" w:w="9026"/>
+            <w:tcBorders>
+              <w:top w:val="none" w:color="FFFFFF" w:sz="0"/>
+              <w:left w:val="single" w:color="2E75B6" w:sz="24"/>
+              <w:bottom w:val="none" w:color="FFFFFF" w:sz="0"/>
+              <w:right w:val="none" w:color="FFFFFF" w:sz="0"/>
+            </w:tcBorders>
+            <w:shd w:fill="DEEAF6" w:color="auto" w:val="clear"/>
+            <w:tcMar>
+              <w:top w:type="dxa" w:w="120"/>
+              <w:left w:type="dxa" w:w="180"/>
+              <w:bottom w:type="dxa" w:w="100"/>
+              <w:right w:type="dxa" w:w="180"/>
+            </w:tcMar>
+          </w:tcPr>
+          <w:p>
+            <w:pPr>
+              <w:spacing w:after="80"/>
+            </w:pPr>
+            <w:r>
+              <w:rPr>
+                <w:rFonts w:ascii="Calibri" w:cs="Calibri" w:eastAsia="Calibri" w:hAnsi="Calibri"/>
+                <w:b/>
+                <w:bCs/>
+                <w:color w:val="2E75B6"/>
+                <w:sz w:val="22"/>
+                <w:szCs w:val="22"/>
+              </w:rPr>
+              <w:t xml:space="preserve">Conclusión: ganancia de codificación</w:t>
+            </w:r>
+          </w:p>
+          <w:p>
+            <w:pPr>
+              <w:spacing w:after="140" w:line="276"/>
+              <w:jc w:val="left"/>
+            </w:pPr>
+            <w:r>
+              <w:rPr>
+                <w:rFonts w:ascii="Calibri" w:cs="Calibri" w:eastAsia="Calibri" w:hAnsi="Calibri"/>
+                <w:sz w:val="22"/>
+                <w:szCs w:val="22"/>
+              </w:rPr>
+              <w:t xml:space="preserve">Sin corrección de errores hacen falta unos 14 dB de Eb/N0 para recibir las tramas íntegras; con Reed-Solomon las tramas empiezan a perderse por debajo de 8,6 dB. La ganancia de codificación es de unos 5 dB (comparación aproximada, con criterios ligeramente distintos), superior a los 4 dB supuestos en el balance de enlace. Su coste son 32 bytes por trama, que elevan el ciclo de trabajo del 4 % al 7,2 %, dentro del 10 % permitido. Con este flujo queda completa la simulación del receptor: demodulación, sincronismo, corrección de errores y verificación.</w:t>
+            </w:r>
+          </w:p>
+        </w:tc>
+      </w:tr>
+    </w:tbl>
+    <w:p>
+      <w:pPr>
+        <w:pStyle w:val="Heading2"/>
+        <w:spacing w:after="120" w:before="260"/>
+      </w:pPr>
+      <w:r>
+        <w:rPr>
+          <w:rFonts w:ascii="Calibri" w:cs="Calibri" w:eastAsia="Calibri" w:hAnsi="Calibri"/>
+          <w:b/>
+          <w:bCs/>
+          <w:color w:val="1F4E79"/>
+          <w:sz w:val="26"/>
+          <w:szCs w:val="26"/>
+        </w:rPr>
+        <w:t xml:space="preserve">10.8 Cómo funciona una trama, paso a paso</w:t>
+      </w:r>
+    </w:p>
+    <w:p>
+      <w:pPr>
+        <w:pStyle w:val="Heading3"/>
+        <w:spacing w:after="100" w:before="200"/>
+      </w:pPr>
+      <w:r>
+        <w:rPr>
+          <w:rFonts w:ascii="Calibri" w:cs="Calibri" w:eastAsia="Calibri" w:hAnsi="Calibri"/>
+          <w:b/>
+          <w:bCs/>
+          <w:color w:val="2E75B6"/>
+          <w:sz w:val="23"/>
+          <w:szCs w:val="23"/>
+        </w:rPr>
+        <w:t xml:space="preserve">Por qué hace falta una trama</w:t>
+      </w:r>
+    </w:p>
+    <w:p>
+      <w:pPr>
+        <w:spacing w:after="140" w:line="276"/>
+        <w:jc w:val="both"/>
+      </w:pPr>
+      <w:r>
+        <w:rPr>
+          <w:rFonts w:ascii="Calibri" w:cs="Calibri" w:eastAsia="Calibri" w:hAnsi="Calibri"/>
+          <w:sz w:val="22"/>
+          <w:szCs w:val="22"/>
+        </w:rPr>
+        <w:t xml:space="preserve">El demodulador entrega un chorro continuo de bits (0110100111…) sin ninguna marca de dónde empieza o acaba cada mensaje, ni de si ha llegado bien. La trama da estructura a ese chorro, igual que una carta tiene encabezado, texto y firma: el ASM es el «Querido amigo:» que indica el inicio, los datos son el texto, el CRC es la firma que demuestra que no se ha alterado y la paridad Reed-Solomon es una copia de seguridad codificada que permite reparar lo que llegue dañado.</w:t>
+      </w:r>
+    </w:p>
+    <w:p>
+      <w:pPr>
+        <w:jc w:val="center"/>
+      </w:pPr>
+      <w:r>
+        <w:drawing>
+          <wp:inline distT="0" distB="0" distL="0" distR="0">
+            <wp:extent cx="5715000" cy="1657350"/>
+            <wp:effectExtent t="0" r="0" b="0" l="0"/>
+            <wp:docPr id="1" name="" descr="" title=""/>
+            <wp:cNvGraphicFramePr>
+              <a:graphicFrameLocks xmlns:a="http://schemas.openxmlformats.org/drawingml/2006/main" noChangeAspect="1"/>
+            </wp:cNvGraphicFramePr>
+            <a:graphic xmlns:a="http://schemas.openxmlformats.org/drawingml/2006/main">
+              <a:graphicData uri="http://schemas.openxmlformats.org/drawingml/2006/picture">
+                <pic:pic xmlns:pic="http://schemas.openxmlformats.org/drawingml/2006/picture">
+                  <pic:nvPicPr>
+                    <pic:cNvPr id="0" name="" descr=""/>
+                    <pic:cNvPicPr>
+                      <a:picLocks noChangeAspect="1" noChangeArrowheads="1"/>
+                    </pic:cNvPicPr>
+                  </pic:nvPicPr>
+                  <pic:blipFill>
+                    <a:blip r:embed="rId12" cstate="none"/>
+                    <a:srcRect/>
+                    <a:stretch>
+                      <a:fillRect/>
+                    </a:stretch>
+                  </pic:blipFill>
+                  <pic:spPr bwMode="auto">
+                    <a:xfrm>
+                      <a:off x="0" y="0"/>
+                      <a:ext cx="5715000" cy="1657350"/>
+                    </a:xfrm>
+                    <a:prstGeom prst="rect">
+                      <a:avLst/>
+                    </a:prstGeom>
+                  </pic:spPr>
+                </pic:pic>
+              </a:graphicData>
+            </a:graphic>
+          </wp:inline>
+        </w:drawing>
+      </w:r>
+    </w:p>
+    <w:p>
+      <w:pPr>
+        <w:spacing w:after="200" w:before="60"/>
+        <w:jc w:val="center"/>
+      </w:pPr>
+      <w:r>
+        <w:rPr>
+          <w:rFonts w:ascii="Calibri" w:cs="Calibri" w:eastAsia="Calibri" w:hAnsi="Calibri"/>
+          <w:i/>
+          <w:iCs/>
+          <w:color w:val="595959"/>
+          <w:sz w:val="19"/>
+          <w:szCs w:val="19"/>
+        </w:rPr>
+        <w:t xml:space="preserve">Figura 4. Estructura de la trama (longitudes a escala).</w:t>
+      </w:r>
+    </w:p>
+    <w:p>
+      <w:pPr>
+        <w:pStyle w:val="Heading3"/>
+        <w:spacing w:after="100" w:before="200"/>
+      </w:pPr>
+      <w:r>
+        <w:rPr>
+          <w:rFonts w:ascii="Calibri" w:cs="Calibri" w:eastAsia="Calibri" w:hAnsi="Calibri"/>
+          <w:b/>
+          <w:bCs/>
+          <w:color w:val="2E75B6"/>
+          <w:sz w:val="23"/>
+          <w:szCs w:val="23"/>
+        </w:rPr>
+        <w:t xml:space="preserve">En el transmisor: construir y enviar</w:t>
+      </w:r>
+    </w:p>
+    <w:p>
+      <w:pPr>
+        <w:pStyle w:val="ListParagraph"/>
+        <w:numPr>
+          <w:ilvl w:val="0"/>
+          <w:numId w:val="5"/>
+        </w:numPr>
+        <w:spacing w:after="80"/>
+      </w:pPr>
+      <w:r>
+        <w:rPr>
+          <w:rFonts w:ascii="Calibri" w:cs="Calibri" w:eastAsia="Calibri" w:hAnsi="Calibri"/>
+          <w:sz w:val="22"/>
+          <w:szCs w:val="22"/>
+        </w:rPr>
+        <w:t xml:space="preserve">Empaquetar: los valores de los sensores se convierten en 44 bytes según la plantilla del ICD. Como los bytes solo guardan enteros, se aplican escalas (por ejemplo, latitud × 10⁷) y se usa orden big-endian (el byte más significativo primero, como en CCSDS). Los valores negativos se codifican en complemento a dos.</w:t>
+      </w:r>
+    </w:p>
+    <w:p>
+      <w:pPr>
+        <w:pStyle w:val="ListParagraph"/>
+        <w:numPr>
+          <w:ilvl w:val="0"/>
+          <w:numId w:val="5"/>
+        </w:numPr>
+        <w:spacing w:after="80"/>
+      </w:pPr>
+      <w:r>
+        <w:rPr>
+          <w:rFonts w:ascii="Calibri" w:cs="Calibri" w:eastAsia="Calibri" w:hAnsi="Calibri"/>
+          <w:sz w:val="22"/>
+          <w:szCs w:val="22"/>
+        </w:rPr>
+        <w:t xml:space="preserve">Calcular el CRC-16 de esos 44 bytes y añadirlo (46 bytes).</w:t>
+      </w:r>
+    </w:p>
+    <w:p>
+      <w:pPr>
+        <w:pStyle w:val="ListParagraph"/>
+        <w:numPr>
+          <w:ilvl w:val="0"/>
+          <w:numId w:val="5"/>
+        </w:numPr>
+        <w:spacing w:after="80"/>
+      </w:pPr>
+      <w:r>
+        <w:rPr>
+          <w:rFonts w:ascii="Calibri" w:cs="Calibri" w:eastAsia="Calibri" w:hAnsi="Calibri"/>
+          <w:sz w:val="22"/>
+          <w:szCs w:val="22"/>
+        </w:rPr>
+        <w:t xml:space="preserve">Codificar con Reed-Solomon: se calculan 32 bytes de paridad y se añaden (78 bytes).</w:t>
+      </w:r>
+    </w:p>
+    <w:p>
+      <w:pPr>
+        <w:pStyle w:val="ListParagraph"/>
+        <w:numPr>
+          <w:ilvl w:val="0"/>
+          <w:numId w:val="5"/>
+        </w:numPr>
+        <w:spacing w:after="80"/>
+      </w:pPr>
+      <w:r>
+        <w:rPr>
+          <w:rFonts w:ascii="Calibri" w:cs="Calibri" w:eastAsia="Calibri" w:hAnsi="Calibri"/>
+          <w:sz w:val="22"/>
+          <w:szCs w:val="22"/>
+        </w:rPr>
+        <w:t xml:space="preserve">Anteponer el marcador de sincronismo 1A CF FC 1D (82 bytes).</w:t>
+      </w:r>
+    </w:p>
+    <w:p>
+      <w:pPr>
+        <w:pStyle w:val="ListParagraph"/>
+        <w:numPr>
+          <w:ilvl w:val="0"/>
+          <w:numId w:val="5"/>
+        </w:numPr>
+        <w:spacing w:after="80"/>
+      </w:pPr>
+      <w:r>
+        <w:rPr>
+          <w:rFonts w:ascii="Calibri" w:cs="Calibri" w:eastAsia="Calibri" w:hAnsi="Calibri"/>
+          <w:sz w:val="22"/>
+          <w:szCs w:val="22"/>
+        </w:rPr>
+        <w:t xml:space="preserve">El SX1262 añade 4 bytes de preámbulo (0xAA = 10101010), que ayudan al receptor a ajustar nivel y temporización, y transmite los 688 bits en 2-GFSK.</w:t>
+      </w:r>
+    </w:p>
+    <w:p>
+      <w:pPr>
+        <w:pStyle w:val="Heading3"/>
+        <w:spacing w:after="100" w:before="200"/>
+      </w:pPr>
+      <w:r>
+        <w:rPr>
+          <w:rFonts w:ascii="Calibri" w:cs="Calibri" w:eastAsia="Calibri" w:hAnsi="Calibri"/>
+          <w:b/>
+          <w:bCs/>
+          <w:color w:val="2E75B6"/>
+          <w:sz w:val="23"/>
+          <w:szCs w:val="23"/>
+        </w:rPr>
+        <w:t xml:space="preserve">En el receptor: encontrar, reparar y comprobar</w:t>
+      </w:r>
+    </w:p>
+    <w:p>
+      <w:pPr>
+        <w:pStyle w:val="ListParagraph"/>
+        <w:numPr>
+          <w:ilvl w:val="0"/>
+          <w:numId w:val="6"/>
+        </w:numPr>
+        <w:spacing w:after="80"/>
+      </w:pPr>
+      <w:r>
+        <w:rPr>
+          <w:rFonts w:ascii="Calibri" w:cs="Calibri" w:eastAsia="Calibri" w:hAnsi="Calibri"/>
+          <w:sz w:val="22"/>
+          <w:szCs w:val="22"/>
+        </w:rPr>
+        <w:t xml:space="preserve">Demodular la señal y decidir cada bit (0 o 1).</w:t>
+      </w:r>
+    </w:p>
+    <w:p>
+      <w:pPr>
+        <w:pStyle w:val="ListParagraph"/>
+        <w:numPr>
+          <w:ilvl w:val="0"/>
+          <w:numId w:val="6"/>
+        </w:numPr>
+        <w:spacing w:after="80"/>
+      </w:pPr>
+      <w:r>
+        <w:rPr>
+          <w:rFonts w:ascii="Calibri" w:cs="Calibri" w:eastAsia="Calibri" w:hAnsi="Calibri"/>
+          <w:sz w:val="22"/>
+          <w:szCs w:val="22"/>
+        </w:rPr>
+        <w:t xml:space="preserve">Buscar el patrón 1A CF FC 1D en el chorro de bits, admitiendo hasta 2 bits erróneos de 32. Donde aparece empieza una trama.</w:t>
+      </w:r>
+    </w:p>
+    <w:p>
+      <w:pPr>
+        <w:pStyle w:val="ListParagraph"/>
+        <w:numPr>
+          <w:ilvl w:val="0"/>
+          <w:numId w:val="6"/>
+        </w:numPr>
+        <w:spacing w:after="80"/>
+      </w:pPr>
+      <w:r>
+        <w:rPr>
+          <w:rFonts w:ascii="Calibri" w:cs="Calibri" w:eastAsia="Calibri" w:hAnsi="Calibri"/>
+          <w:sz w:val="22"/>
+          <w:szCs w:val="22"/>
+        </w:rPr>
+        <w:t xml:space="preserve">Recortar los 78 bytes siguientes y pasarlos al decodificador Reed-Solomon, que corrige hasta 16 bytes. Si hay más errores, la trama se descarta.</w:t>
+      </w:r>
+    </w:p>
+    <w:p>
+      <w:pPr>
+        <w:pStyle w:val="ListParagraph"/>
+        <w:numPr>
+          <w:ilvl w:val="0"/>
+          <w:numId w:val="6"/>
+        </w:numPr>
+        <w:spacing w:after="80"/>
+      </w:pPr>
+      <w:r>
+        <w:rPr>
+          <w:rFonts w:ascii="Calibri" w:cs="Calibri" w:eastAsia="Calibri" w:hAnsi="Calibri"/>
+          <w:sz w:val="22"/>
+          <w:szCs w:val="22"/>
+        </w:rPr>
+        <w:t xml:space="preserve">Recalcular el CRC de los 44 bytes de datos y compararlo con el recibido. Si no coincide, la trama se descarta.</w:t>
+      </w:r>
+    </w:p>
+    <w:p>
+      <w:pPr>
+        <w:pStyle w:val="ListParagraph"/>
+        <w:numPr>
+          <w:ilvl w:val="0"/>
+          <w:numId w:val="6"/>
+        </w:numPr>
+        <w:spacing w:after="80"/>
+      </w:pPr>
+      <w:r>
+        <w:rPr>
+          <w:rFonts w:ascii="Calibri" w:cs="Calibri" w:eastAsia="Calibri" w:hAnsi="Calibri"/>
+          <w:sz w:val="22"/>
+          <w:szCs w:val="22"/>
+        </w:rPr>
+        <w:t xml:space="preserve">Desempaquetar los datos (deshacer escalas) y registrar la telemetría. Los saltos en el contador indican tramas perdidas.</w:t>
+      </w:r>
+    </w:p>
+    <w:p>
+      <w:pPr>
+        <w:pStyle w:val="Heading3"/>
+        <w:spacing w:after="100" w:before="200"/>
+      </w:pPr>
+      <w:r>
+        <w:rPr>
+          <w:rFonts w:ascii="Calibri" w:cs="Calibri" w:eastAsia="Calibri" w:hAnsi="Calibri"/>
+          <w:b/>
+          <w:bCs/>
+          <w:color w:val="2E75B6"/>
+          <w:sz w:val="23"/>
+          <w:szCs w:val="23"/>
+        </w:rPr>
+        <w:t xml:space="preserve">Ejemplo descodificado a mano</w:t>
+      </w:r>
+    </w:p>
+    <w:tbl>
+      <w:tblPr>
+        <w:tblW w:type="dxa" w:w="9026"/>
+        <w:tblBorders>
+          <w:top w:val="single" w:color="auto" w:sz="4"/>
+          <w:left w:val="single" w:color="auto" w:sz="4"/>
+          <w:bottom w:val="single" w:color="auto" w:sz="4"/>
+          <w:right w:val="single" w:color="auto" w:sz="4"/>
+          <w:insideH w:val="single" w:color="auto" w:sz="4"/>
+          <w:insideV w:val="single" w:color="auto" w:sz="4"/>
+        </w:tblBorders>
+      </w:tblPr>
+      <w:tblGrid>
+        <w:gridCol w:w="2300"/>
+        <w:gridCol w:w="2100"/>
+        <w:gridCol w:w="4626"/>
+      </w:tblGrid>
+      <w:tr>
+        <w:trPr>
+          <w:tblHeader/>
+        </w:trPr>
+        <w:tc>
+          <w:tcPr>
+            <w:tcW w:type="dxa" w:w="2300"/>
+            <w:tcBorders>
+              <w:top w:val="single" w:color="BFBFBF" w:sz="4"/>
+              <w:left w:val="single" w:color="BFBFBF" w:sz="4"/>
+              <w:bottom w:val="single" w:color="BFBFBF" w:sz="4"/>
+              <w:right w:val="single" w:color="BFBFBF" w:sz="4"/>
+            </w:tcBorders>
+            <w:shd w:fill="1F4E79" w:color="auto" w:val="clear"/>
+            <w:tcMar>
+              <w:top w:type="dxa" w:w="50"/>
+              <w:left w:type="dxa" w:w="90"/>
+              <w:bottom w:type="dxa" w:w="50"/>
+              <w:right w:type="dxa" w:w="90"/>
+            </w:tcMar>
+          </w:tcPr>
+          <w:p>
+            <w:pPr>
+              <w:jc w:val="left"/>
+            </w:pPr>
+            <w:r>
+              <w:rPr>
+                <w:rFonts w:ascii="Calibri" w:cs="Calibri" w:eastAsia="Calibri" w:hAnsi="Calibri"/>
+                <w:b/>
+                <w:bCs/>
+                <w:color w:val="FFFFFF"/>
+                <w:sz w:val="19"/>
+                <w:szCs w:val="19"/>
+              </w:rPr>
+              <w:t xml:space="preserve">Bytes</w:t>
+            </w:r>
+          </w:p>
+        </w:tc>
+        <w:tc>
+          <w:tcPr>
+            <w:tcW w:type="dxa" w:w="2100"/>
+            <w:tcBorders>
+              <w:top w:val="single" w:color="BFBFBF" w:sz="4"/>
+              <w:left w:val="single" w:color="BFBFBF" w:sz="4"/>
+              <w:bottom w:val="single" w:color="BFBFBF" w:sz="4"/>
+              <w:right w:val="single" w:color="BFBFBF" w:sz="4"/>
+            </w:tcBorders>
+            <w:shd w:fill="1F4E79" w:color="auto" w:val="clear"/>
+            <w:tcMar>
+              <w:top w:type="dxa" w:w="50"/>
+              <w:left w:type="dxa" w:w="90"/>
+              <w:bottom w:type="dxa" w:w="50"/>
+              <w:right w:type="dxa" w:w="90"/>
+            </w:tcMar>
+          </w:tcPr>
+          <w:p>
+            <w:pPr>
+              <w:jc w:val="left"/>
+            </w:pPr>
+            <w:r>
+              <w:rPr>
+                <w:rFonts w:ascii="Calibri" w:cs="Calibri" w:eastAsia="Calibri" w:hAnsi="Calibri"/>
+                <w:b/>
+                <w:bCs/>
+                <w:color w:val="FFFFFF"/>
+                <w:sz w:val="19"/>
+                <w:szCs w:val="19"/>
+              </w:rPr>
+              <w:t xml:space="preserve">Campo</w:t>
+            </w:r>
+          </w:p>
+        </w:tc>
+        <w:tc>
+          <w:tcPr>
+            <w:tcW w:type="dxa" w:w="4626"/>
+            <w:tcBorders>
+              <w:top w:val="single" w:color="BFBFBF" w:sz="4"/>
+              <w:left w:val="single" w:color="BFBFBF" w:sz="4"/>
+              <w:bottom w:val="single" w:color="BFBFBF" w:sz="4"/>
+              <w:right w:val="single" w:color="BFBFBF" w:sz="4"/>
+            </w:tcBorders>
+            <w:shd w:fill="1F4E79" w:color="auto" w:val="clear"/>
+            <w:tcMar>
+              <w:top w:type="dxa" w:w="50"/>
+              <w:left w:type="dxa" w:w="90"/>
+              <w:bottom w:type="dxa" w:w="50"/>
+              <w:right w:type="dxa" w:w="90"/>
+            </w:tcMar>
+          </w:tcPr>
+          <w:p>
+            <w:pPr>
+              <w:jc w:val="left"/>
+            </w:pPr>
+            <w:r>
+              <w:rPr>
+                <w:rFonts w:ascii="Calibri" w:cs="Calibri" w:eastAsia="Calibri" w:hAnsi="Calibri"/>
+                <w:b/>
+                <w:bCs/>
+                <w:color w:val="FFFFFF"/>
+                <w:sz w:val="19"/>
+                <w:szCs w:val="19"/>
+              </w:rPr>
+              <w:t xml:space="preserve">Valor</w:t>
+            </w:r>
+          </w:p>
+        </w:tc>
+      </w:tr>
+      <w:tr>
+        <w:tc>
+          <w:tcPr>
+            <w:tcW w:type="dxa" w:w="2300"/>
+            <w:tcBorders>
+              <w:top w:val="single" w:color="BFBFBF" w:sz="4"/>
+              <w:left w:val="single" w:color="BFBFBF" w:sz="4"/>
+              <w:bottom w:val="single" w:color="BFBFBF" w:sz="4"/>
+              <w:right w:val="single" w:color="BFBFBF" w:sz="4"/>
+            </w:tcBorders>
+            <w:tcMar>
+              <w:top w:type="dxa" w:w="50"/>
+              <w:left w:type="dxa" w:w="90"/>
+              <w:bottom w:type="dxa" w:w="50"/>
+              <w:right w:type="dxa" w:w="90"/>
+            </w:tcMar>
+          </w:tcPr>
+          <w:p>
+            <w:pPr>
+              <w:jc w:val="left"/>
+            </w:pPr>
+            <w:r>
+              <w:rPr>
+                <w:rFonts w:ascii="Calibri" w:cs="Calibri" w:eastAsia="Calibri" w:hAnsi="Calibri"/>
+                <w:b w:val="false"/>
+                <w:bCs w:val="false"/>
+                <w:sz w:val="19"/>
+                <w:szCs w:val="19"/>
+              </w:rPr>
+              <w:t xml:space="preserve">1A CF FC 1D</w:t>
+            </w:r>
+          </w:p>
+        </w:tc>
+        <w:tc>
+          <w:tcPr>
+            <w:tcW w:type="dxa" w:w="2100"/>
+            <w:tcBorders>
+              <w:top w:val="single" w:color="BFBFBF" w:sz="4"/>
+              <w:left w:val="single" w:color="BFBFBF" w:sz="4"/>
+              <w:bottom w:val="single" w:color="BFBFBF" w:sz="4"/>
+              <w:right w:val="single" w:color="BFBFBF" w:sz="4"/>
+            </w:tcBorders>
+            <w:tcMar>
+              <w:top w:type="dxa" w:w="50"/>
+              <w:left w:type="dxa" w:w="90"/>
+              <w:bottom w:type="dxa" w:w="50"/>
+              <w:right w:type="dxa" w:w="90"/>
+            </w:tcMar>
+          </w:tcPr>
+          <w:p>
+            <w:pPr>
+              <w:jc w:val="left"/>
+            </w:pPr>
+            <w:r>
+              <w:rPr>
+                <w:rFonts w:ascii="Calibri" w:cs="Calibri" w:eastAsia="Calibri" w:hAnsi="Calibri"/>
+                <w:b w:val="false"/>
+                <w:bCs w:val="false"/>
+                <w:sz w:val="19"/>
+                <w:szCs w:val="19"/>
+              </w:rPr>
+              <w:t xml:space="preserve">Sincronismo</w:t>
+            </w:r>
+          </w:p>
+        </w:tc>
+        <w:tc>
+          <w:tcPr>
+            <w:tcW w:type="dxa" w:w="4626"/>
+            <w:tcBorders>
+              <w:top w:val="single" w:color="BFBFBF" w:sz="4"/>
+              <w:left w:val="single" w:color="BFBFBF" w:sz="4"/>
+              <w:bottom w:val="single" w:color="BFBFBF" w:sz="4"/>
+              <w:right w:val="single" w:color="BFBFBF" w:sz="4"/>
+            </w:tcBorders>
+            <w:tcMar>
+              <w:top w:type="dxa" w:w="50"/>
+              <w:left w:type="dxa" w:w="90"/>
+              <w:bottom w:type="dxa" w:w="50"/>
+              <w:right w:type="dxa" w:w="90"/>
+            </w:tcMar>
+          </w:tcPr>
+          <w:p>
+            <w:pPr>
+              <w:jc w:val="left"/>
+            </w:pPr>
+            <w:r>
+              <w:rPr>
+                <w:rFonts w:ascii="Calibri" w:cs="Calibri" w:eastAsia="Calibri" w:hAnsi="Calibri"/>
+                <w:b w:val="false"/>
+                <w:bCs w:val="false"/>
+                <w:sz w:val="19"/>
+                <w:szCs w:val="19"/>
+              </w:rPr>
+              <w:t xml:space="preserve">Marcador de inicio</w:t>
+            </w:r>
+          </w:p>
+        </w:tc>
+      </w:tr>
+      <w:tr>
+        <w:tc>
+          <w:tcPr>
+            <w:tcW w:type="dxa" w:w="2300"/>
+            <w:tcBorders>
+              <w:top w:val="single" w:color="BFBFBF" w:sz="4"/>
+              <w:left w:val="single" w:color="BFBFBF" w:sz="4"/>
+              <w:bottom w:val="single" w:color="BFBFBF" w:sz="4"/>
+              <w:right w:val="single" w:color="BFBFBF" w:sz="4"/>
+            </w:tcBorders>
+            <w:tcMar>
+              <w:top w:type="dxa" w:w="50"/>
+              <w:left w:type="dxa" w:w="90"/>
+              <w:bottom w:type="dxa" w:w="50"/>
+              <w:right w:type="dxa" w:w="90"/>
+            </w:tcMar>
+          </w:tcPr>
+          <w:p>
+            <w:pPr>
+              <w:jc w:val="left"/>
+            </w:pPr>
+            <w:r>
+              <w:rPr>
+                <w:rFonts w:ascii="Calibri" w:cs="Calibri" w:eastAsia="Calibri" w:hAnsi="Calibri"/>
+                <w:b w:val="false"/>
+                <w:bCs w:val="false"/>
+                <w:sz w:val="19"/>
+                <w:szCs w:val="19"/>
+              </w:rPr>
+              <w:t xml:space="preserve">01</w:t>
+            </w:r>
+          </w:p>
+        </w:tc>
+        <w:tc>
+          <w:tcPr>
+            <w:tcW w:type="dxa" w:w="2100"/>
+            <w:tcBorders>
+              <w:top w:val="single" w:color="BFBFBF" w:sz="4"/>
+              <w:left w:val="single" w:color="BFBFBF" w:sz="4"/>
+              <w:bottom w:val="single" w:color="BFBFBF" w:sz="4"/>
+              <w:right w:val="single" w:color="BFBFBF" w:sz="4"/>
+            </w:tcBorders>
+            <w:tcMar>
+              <w:top w:type="dxa" w:w="50"/>
+              <w:left w:type="dxa" w:w="90"/>
+              <w:bottom w:type="dxa" w:w="50"/>
+              <w:right w:type="dxa" w:w="90"/>
+            </w:tcMar>
+          </w:tcPr>
+          <w:p>
+            <w:pPr>
+              <w:jc w:val="left"/>
+            </w:pPr>
+            <w:r>
+              <w:rPr>
+                <w:rFonts w:ascii="Calibri" w:cs="Calibri" w:eastAsia="Calibri" w:hAnsi="Calibri"/>
+                <w:b w:val="false"/>
+                <w:bCs w:val="false"/>
+                <w:sz w:val="19"/>
+                <w:szCs w:val="19"/>
+              </w:rPr>
+              <w:t xml:space="preserve">Versión</w:t>
+            </w:r>
+          </w:p>
+        </w:tc>
+        <w:tc>
+          <w:tcPr>
+            <w:tcW w:type="dxa" w:w="4626"/>
+            <w:tcBorders>
+              <w:top w:val="single" w:color="BFBFBF" w:sz="4"/>
+              <w:left w:val="single" w:color="BFBFBF" w:sz="4"/>
+              <w:bottom w:val="single" w:color="BFBFBF" w:sz="4"/>
+              <w:right w:val="single" w:color="BFBFBF" w:sz="4"/>
+            </w:tcBorders>
+            <w:tcMar>
+              <w:top w:type="dxa" w:w="50"/>
+              <w:left w:type="dxa" w:w="90"/>
+              <w:bottom w:type="dxa" w:w="50"/>
+              <w:right w:type="dxa" w:w="90"/>
+            </w:tcMar>
+          </w:tcPr>
+          <w:p>
+            <w:pPr>
+              <w:jc w:val="left"/>
+            </w:pPr>
+            <w:r>
+              <w:rPr>
+                <w:rFonts w:ascii="Calibri" w:cs="Calibri" w:eastAsia="Calibri" w:hAnsi="Calibri"/>
+                <w:b w:val="false"/>
+                <w:bCs w:val="false"/>
+                <w:sz w:val="19"/>
+                <w:szCs w:val="19"/>
+              </w:rPr>
+              <w:t xml:space="preserve">1</w:t>
+            </w:r>
+          </w:p>
+        </w:tc>
+      </w:tr>
+      <w:tr>
+        <w:tc>
+          <w:tcPr>
+            <w:tcW w:type="dxa" w:w="2300"/>
+            <w:tcBorders>
+              <w:top w:val="single" w:color="BFBFBF" w:sz="4"/>
+              <w:left w:val="single" w:color="BFBFBF" w:sz="4"/>
+              <w:bottom w:val="single" w:color="BFBFBF" w:sz="4"/>
+              <w:right w:val="single" w:color="BFBFBF" w:sz="4"/>
+            </w:tcBorders>
+            <w:tcMar>
+              <w:top w:type="dxa" w:w="50"/>
+              <w:left w:type="dxa" w:w="90"/>
+              <w:bottom w:type="dxa" w:w="50"/>
+              <w:right w:type="dxa" w:w="90"/>
+            </w:tcMar>
+          </w:tcPr>
+          <w:p>
+            <w:pPr>
+              <w:jc w:val="left"/>
+            </w:pPr>
+            <w:r>
+              <w:rPr>
+                <w:rFonts w:ascii="Calibri" w:cs="Calibri" w:eastAsia="Calibri" w:hAnsi="Calibri"/>
+                <w:b w:val="false"/>
+                <w:bCs w:val="false"/>
+                <w:sz w:val="19"/>
+                <w:szCs w:val="19"/>
+              </w:rPr>
+              <w:t xml:space="preserve">42</w:t>
+            </w:r>
+          </w:p>
+        </w:tc>
+        <w:tc>
+          <w:tcPr>
+            <w:tcW w:type="dxa" w:w="2100"/>
+            <w:tcBorders>
+              <w:top w:val="single" w:color="BFBFBF" w:sz="4"/>
+              <w:left w:val="single" w:color="BFBFBF" w:sz="4"/>
+              <w:bottom w:val="single" w:color="BFBFBF" w:sz="4"/>
+              <w:right w:val="single" w:color="BFBFBF" w:sz="4"/>
+            </w:tcBorders>
+            <w:tcMar>
+              <w:top w:type="dxa" w:w="50"/>
+              <w:left w:type="dxa" w:w="90"/>
+              <w:bottom w:type="dxa" w:w="50"/>
+              <w:right w:type="dxa" w:w="90"/>
+            </w:tcMar>
+          </w:tcPr>
+          <w:p>
+            <w:pPr>
+              <w:jc w:val="left"/>
+            </w:pPr>
+            <w:r>
+              <w:rPr>
+                <w:rFonts w:ascii="Calibri" w:cs="Calibri" w:eastAsia="Calibri" w:hAnsi="Calibri"/>
+                <w:b w:val="false"/>
+                <w:bCs w:val="false"/>
+                <w:sz w:val="19"/>
+                <w:szCs w:val="19"/>
+              </w:rPr>
+              <w:t xml:space="preserve">ID del vehículo</w:t>
+            </w:r>
+          </w:p>
+        </w:tc>
+        <w:tc>
+          <w:tcPr>
+            <w:tcW w:type="dxa" w:w="4626"/>
+            <w:tcBorders>
+              <w:top w:val="single" w:color="BFBFBF" w:sz="4"/>
+              <w:left w:val="single" w:color="BFBFBF" w:sz="4"/>
+              <w:bottom w:val="single" w:color="BFBFBF" w:sz="4"/>
+              <w:right w:val="single" w:color="BFBFBF" w:sz="4"/>
+            </w:tcBorders>
+            <w:tcMar>
+              <w:top w:type="dxa" w:w="50"/>
+              <w:left w:type="dxa" w:w="90"/>
+              <w:bottom w:type="dxa" w:w="50"/>
+              <w:right w:type="dxa" w:w="90"/>
+            </w:tcMar>
+          </w:tcPr>
+          <w:p>
+            <w:pPr>
+              <w:jc w:val="left"/>
+            </w:pPr>
+            <w:r>
+              <w:rPr>
+                <w:rFonts w:ascii="Calibri" w:cs="Calibri" w:eastAsia="Calibri" w:hAnsi="Calibri"/>
+                <w:b w:val="false"/>
+                <w:bCs w:val="false"/>
+                <w:sz w:val="19"/>
+                <w:szCs w:val="19"/>
+              </w:rPr>
+              <w:t xml:space="preserve">0x42</w:t>
+            </w:r>
+          </w:p>
+        </w:tc>
+      </w:tr>
+      <w:tr>
+        <w:tc>
+          <w:tcPr>
+            <w:tcW w:type="dxa" w:w="2300"/>
+            <w:tcBorders>
+              <w:top w:val="single" w:color="BFBFBF" w:sz="4"/>
+              <w:left w:val="single" w:color="BFBFBF" w:sz="4"/>
+              <w:bottom w:val="single" w:color="BFBFBF" w:sz="4"/>
+              <w:right w:val="single" w:color="BFBFBF" w:sz="4"/>
+            </w:tcBorders>
+            <w:tcMar>
+              <w:top w:type="dxa" w:w="50"/>
+              <w:left w:type="dxa" w:w="90"/>
+              <w:bottom w:type="dxa" w:w="50"/>
+              <w:right w:type="dxa" w:w="90"/>
+            </w:tcMar>
+          </w:tcPr>
+          <w:p>
+            <w:pPr>
+              <w:jc w:val="left"/>
+            </w:pPr>
+            <w:r>
+              <w:rPr>
+                <w:rFonts w:ascii="Calibri" w:cs="Calibri" w:eastAsia="Calibri" w:hAnsi="Calibri"/>
+                <w:b w:val="false"/>
+                <w:bCs w:val="false"/>
+                <w:sz w:val="19"/>
+                <w:szCs w:val="19"/>
+              </w:rPr>
+              <w:t xml:space="preserve">04 D2</w:t>
+            </w:r>
+          </w:p>
+        </w:tc>
+        <w:tc>
+          <w:tcPr>
+            <w:tcW w:type="dxa" w:w="2100"/>
+            <w:tcBorders>
+              <w:top w:val="single" w:color="BFBFBF" w:sz="4"/>
+              <w:left w:val="single" w:color="BFBFBF" w:sz="4"/>
+              <w:bottom w:val="single" w:color="BFBFBF" w:sz="4"/>
+              <w:right w:val="single" w:color="BFBFBF" w:sz="4"/>
+            </w:tcBorders>
+            <w:tcMar>
+              <w:top w:type="dxa" w:w="50"/>
+              <w:left w:type="dxa" w:w="90"/>
+              <w:bottom w:type="dxa" w:w="50"/>
+              <w:right w:type="dxa" w:w="90"/>
+            </w:tcMar>
+          </w:tcPr>
+          <w:p>
+            <w:pPr>
+              <w:jc w:val="left"/>
+            </w:pPr>
+            <w:r>
+              <w:rPr>
+                <w:rFonts w:ascii="Calibri" w:cs="Calibri" w:eastAsia="Calibri" w:hAnsi="Calibri"/>
+                <w:b w:val="false"/>
+                <w:bCs w:val="false"/>
+                <w:sz w:val="19"/>
+                <w:szCs w:val="19"/>
+              </w:rPr>
+              <w:t xml:space="preserve">Contador</w:t>
+            </w:r>
+          </w:p>
+        </w:tc>
+        <w:tc>
+          <w:tcPr>
+            <w:tcW w:type="dxa" w:w="4626"/>
+            <w:tcBorders>
+              <w:top w:val="single" w:color="BFBFBF" w:sz="4"/>
+              <w:left w:val="single" w:color="BFBFBF" w:sz="4"/>
+              <w:bottom w:val="single" w:color="BFBFBF" w:sz="4"/>
+              <w:right w:val="single" w:color="BFBFBF" w:sz="4"/>
+            </w:tcBorders>
+            <w:tcMar>
+              <w:top w:type="dxa" w:w="50"/>
+              <w:left w:type="dxa" w:w="90"/>
+              <w:bottom w:type="dxa" w:w="50"/>
+              <w:right w:type="dxa" w:w="90"/>
+            </w:tcMar>
+          </w:tcPr>
+          <w:p>
+            <w:pPr>
+              <w:jc w:val="left"/>
+            </w:pPr>
+            <w:r>
+              <w:rPr>
+                <w:rFonts w:ascii="Calibri" w:cs="Calibri" w:eastAsia="Calibri" w:hAnsi="Calibri"/>
+                <w:b w:val="false"/>
+                <w:bCs w:val="false"/>
+                <w:sz w:val="19"/>
+                <w:szCs w:val="19"/>
+              </w:rPr>
+              <w:t xml:space="preserve">0x04D2 = 1234</w:t>
+            </w:r>
+          </w:p>
+        </w:tc>
+      </w:tr>
+      <w:tr>
+        <w:tc>
+          <w:tcPr>
+            <w:tcW w:type="dxa" w:w="2300"/>
+            <w:tcBorders>
+              <w:top w:val="single" w:color="BFBFBF" w:sz="4"/>
+              <w:left w:val="single" w:color="BFBFBF" w:sz="4"/>
+              <w:bottom w:val="single" w:color="BFBFBF" w:sz="4"/>
+              <w:right w:val="single" w:color="BFBFBF" w:sz="4"/>
+            </w:tcBorders>
+            <w:tcMar>
+              <w:top w:type="dxa" w:w="50"/>
+              <w:left w:type="dxa" w:w="90"/>
+              <w:bottom w:type="dxa" w:w="50"/>
+              <w:right w:type="dxa" w:w="90"/>
+            </w:tcMar>
+          </w:tcPr>
+          <w:p>
+            <w:pPr>
+              <w:jc w:val="left"/>
+            </w:pPr>
+            <w:r>
+              <w:rPr>
+                <w:rFonts w:ascii="Calibri" w:cs="Calibri" w:eastAsia="Calibri" w:hAnsi="Calibri"/>
+                <w:b w:val="false"/>
+                <w:bCs w:val="false"/>
+                <w:sz w:val="19"/>
+                <w:szCs w:val="19"/>
+              </w:rPr>
+              <w:t xml:space="preserve">00 06 EA 5F</w:t>
+            </w:r>
+          </w:p>
+        </w:tc>
+        <w:tc>
+          <w:tcPr>
+            <w:tcW w:type="dxa" w:w="2100"/>
+            <w:tcBorders>
+              <w:top w:val="single" w:color="BFBFBF" w:sz="4"/>
+              <w:left w:val="single" w:color="BFBFBF" w:sz="4"/>
+              <w:bottom w:val="single" w:color="BFBFBF" w:sz="4"/>
+              <w:right w:val="single" w:color="BFBFBF" w:sz="4"/>
+            </w:tcBorders>
+            <w:tcMar>
+              <w:top w:type="dxa" w:w="50"/>
+              <w:left w:type="dxa" w:w="90"/>
+              <w:bottom w:type="dxa" w:w="50"/>
+              <w:right w:type="dxa" w:w="90"/>
+            </w:tcMar>
+          </w:tcPr>
+          <w:p>
+            <w:pPr>
+              <w:jc w:val="left"/>
+            </w:pPr>
+            <w:r>
+              <w:rPr>
+                <w:rFonts w:ascii="Calibri" w:cs="Calibri" w:eastAsia="Calibri" w:hAnsi="Calibri"/>
+                <w:b w:val="false"/>
+                <w:bCs w:val="false"/>
+                <w:sz w:val="19"/>
+                <w:szCs w:val="19"/>
+              </w:rPr>
+              <w:t xml:space="preserve">Tiempo GPS</w:t>
+            </w:r>
+          </w:p>
+        </w:tc>
+        <w:tc>
+          <w:tcPr>
+            <w:tcW w:type="dxa" w:w="4626"/>
+            <w:tcBorders>
+              <w:top w:val="single" w:color="BFBFBF" w:sz="4"/>
+              <w:left w:val="single" w:color="BFBFBF" w:sz="4"/>
+              <w:bottom w:val="single" w:color="BFBFBF" w:sz="4"/>
+              <w:right w:val="single" w:color="BFBFBF" w:sz="4"/>
+            </w:tcBorders>
+            <w:tcMar>
+              <w:top w:type="dxa" w:w="50"/>
+              <w:left w:type="dxa" w:w="90"/>
+              <w:bottom w:type="dxa" w:w="50"/>
+              <w:right w:type="dxa" w:w="90"/>
+            </w:tcMar>
+          </w:tcPr>
+          <w:p>
+            <w:pPr>
+              <w:jc w:val="left"/>
+            </w:pPr>
+            <w:r>
+              <w:rPr>
+                <w:rFonts w:ascii="Calibri" w:cs="Calibri" w:eastAsia="Calibri" w:hAnsi="Calibri"/>
+                <w:b w:val="false"/>
+                <w:bCs w:val="false"/>
+                <w:sz w:val="19"/>
+                <w:szCs w:val="19"/>
+              </w:rPr>
+              <w:t xml:space="preserve">453 215 décimas de segundo = 12:35:21,5 UTC</w:t>
+            </w:r>
+          </w:p>
+        </w:tc>
+      </w:tr>
+      <w:tr>
+        <w:tc>
+          <w:tcPr>
+            <w:tcW w:type="dxa" w:w="2300"/>
+            <w:tcBorders>
+              <w:top w:val="single" w:color="BFBFBF" w:sz="4"/>
+              <w:left w:val="single" w:color="BFBFBF" w:sz="4"/>
+              <w:bottom w:val="single" w:color="BFBFBF" w:sz="4"/>
+              <w:right w:val="single" w:color="BFBFBF" w:sz="4"/>
+            </w:tcBorders>
+            <w:tcMar>
+              <w:top w:type="dxa" w:w="50"/>
+              <w:left w:type="dxa" w:w="90"/>
+              <w:bottom w:type="dxa" w:w="50"/>
+              <w:right w:type="dxa" w:w="90"/>
+            </w:tcMar>
+          </w:tcPr>
+          <w:p>
+            <w:pPr>
+              <w:jc w:val="left"/>
+            </w:pPr>
+            <w:r>
+              <w:rPr>
+                <w:rFonts w:ascii="Calibri" w:cs="Calibri" w:eastAsia="Calibri" w:hAnsi="Calibri"/>
+                <w:b w:val="false"/>
+                <w:bCs w:val="false"/>
+                <w:sz w:val="19"/>
+                <w:szCs w:val="19"/>
+              </w:rPr>
+              <w:t xml:space="preserve">16 C1 BA B8</w:t>
+            </w:r>
+          </w:p>
+        </w:tc>
+        <w:tc>
+          <w:tcPr>
+            <w:tcW w:type="dxa" w:w="2100"/>
+            <w:tcBorders>
+              <w:top w:val="single" w:color="BFBFBF" w:sz="4"/>
+              <w:left w:val="single" w:color="BFBFBF" w:sz="4"/>
+              <w:bottom w:val="single" w:color="BFBFBF" w:sz="4"/>
+              <w:right w:val="single" w:color="BFBFBF" w:sz="4"/>
+            </w:tcBorders>
+            <w:tcMar>
+              <w:top w:type="dxa" w:w="50"/>
+              <w:left w:type="dxa" w:w="90"/>
+              <w:bottom w:type="dxa" w:w="50"/>
+              <w:right w:type="dxa" w:w="90"/>
+            </w:tcMar>
+          </w:tcPr>
+          <w:p>
+            <w:pPr>
+              <w:jc w:val="left"/>
+            </w:pPr>
+            <w:r>
+              <w:rPr>
+                <w:rFonts w:ascii="Calibri" w:cs="Calibri" w:eastAsia="Calibri" w:hAnsi="Calibri"/>
+                <w:b w:val="false"/>
+                <w:bCs w:val="false"/>
+                <w:sz w:val="19"/>
+                <w:szCs w:val="19"/>
+              </w:rPr>
+              <w:t xml:space="preserve">Latitud</w:t>
+            </w:r>
+          </w:p>
+        </w:tc>
+        <w:tc>
+          <w:tcPr>
+            <w:tcW w:type="dxa" w:w="4626"/>
+            <w:tcBorders>
+              <w:top w:val="single" w:color="BFBFBF" w:sz="4"/>
+              <w:left w:val="single" w:color="BFBFBF" w:sz="4"/>
+              <w:bottom w:val="single" w:color="BFBFBF" w:sz="4"/>
+              <w:right w:val="single" w:color="BFBFBF" w:sz="4"/>
+            </w:tcBorders>
+            <w:tcMar>
+              <w:top w:type="dxa" w:w="50"/>
+              <w:left w:type="dxa" w:w="90"/>
+              <w:bottom w:type="dxa" w:w="50"/>
+              <w:right w:type="dxa" w:w="90"/>
+            </w:tcMar>
+          </w:tcPr>
+          <w:p>
+            <w:pPr>
+              <w:jc w:val="left"/>
+            </w:pPr>
+            <w:r>
+              <w:rPr>
+                <w:rFonts w:ascii="Calibri" w:cs="Calibri" w:eastAsia="Calibri" w:hAnsi="Calibri"/>
+                <w:b w:val="false"/>
+                <w:bCs w:val="false"/>
+                <w:sz w:val="19"/>
+                <w:szCs w:val="19"/>
+              </w:rPr>
+              <w:t xml:space="preserve">381 795 000 / 10⁷ = 38,1795°</w:t>
+            </w:r>
+          </w:p>
+        </w:tc>
+      </w:tr>
+      <w:tr>
+        <w:tc>
+          <w:tcPr>
+            <w:tcW w:type="dxa" w:w="2300"/>
+            <w:tcBorders>
+              <w:top w:val="single" w:color="BFBFBF" w:sz="4"/>
+              <w:left w:val="single" w:color="BFBFBF" w:sz="4"/>
+              <w:bottom w:val="single" w:color="BFBFBF" w:sz="4"/>
+              <w:right w:val="single" w:color="BFBFBF" w:sz="4"/>
+            </w:tcBorders>
+            <w:tcMar>
+              <w:top w:type="dxa" w:w="50"/>
+              <w:left w:type="dxa" w:w="90"/>
+              <w:bottom w:type="dxa" w:w="50"/>
+              <w:right w:type="dxa" w:w="90"/>
+            </w:tcMar>
+          </w:tcPr>
+          <w:p>
+            <w:pPr>
+              <w:jc w:val="left"/>
+            </w:pPr>
+            <w:r>
+              <w:rPr>
+                <w:rFonts w:ascii="Calibri" w:cs="Calibri" w:eastAsia="Calibri" w:hAnsi="Calibri"/>
+                <w:b w:val="false"/>
+                <w:bCs w:val="false"/>
+                <w:sz w:val="19"/>
+                <w:szCs w:val="19"/>
+              </w:rPr>
+              <w:t xml:space="preserve">FF 6B 9B B8</w:t>
+            </w:r>
+          </w:p>
+        </w:tc>
+        <w:tc>
+          <w:tcPr>
+            <w:tcW w:type="dxa" w:w="2100"/>
+            <w:tcBorders>
+              <w:top w:val="single" w:color="BFBFBF" w:sz="4"/>
+              <w:left w:val="single" w:color="BFBFBF" w:sz="4"/>
+              <w:bottom w:val="single" w:color="BFBFBF" w:sz="4"/>
+              <w:right w:val="single" w:color="BFBFBF" w:sz="4"/>
+            </w:tcBorders>
+            <w:tcMar>
+              <w:top w:type="dxa" w:w="50"/>
+              <w:left w:type="dxa" w:w="90"/>
+              <w:bottom w:type="dxa" w:w="50"/>
+              <w:right w:type="dxa" w:w="90"/>
+            </w:tcMar>
+          </w:tcPr>
+          <w:p>
+            <w:pPr>
+              <w:jc w:val="left"/>
+            </w:pPr>
+            <w:r>
+              <w:rPr>
+                <w:rFonts w:ascii="Calibri" w:cs="Calibri" w:eastAsia="Calibri" w:hAnsi="Calibri"/>
+                <w:b w:val="false"/>
+                <w:bCs w:val="false"/>
+                <w:sz w:val="19"/>
+                <w:szCs w:val="19"/>
+              </w:rPr>
+              <w:t xml:space="preserve">Longitud</w:t>
+            </w:r>
+          </w:p>
+        </w:tc>
+        <w:tc>
+          <w:tcPr>
+            <w:tcW w:type="dxa" w:w="4626"/>
+            <w:tcBorders>
+              <w:top w:val="single" w:color="BFBFBF" w:sz="4"/>
+              <w:left w:val="single" w:color="BFBFBF" w:sz="4"/>
+              <w:bottom w:val="single" w:color="BFBFBF" w:sz="4"/>
+              <w:right w:val="single" w:color="BFBFBF" w:sz="4"/>
+            </w:tcBorders>
+            <w:tcMar>
+              <w:top w:type="dxa" w:w="50"/>
+              <w:left w:type="dxa" w:w="90"/>
+              <w:bottom w:type="dxa" w:w="50"/>
+              <w:right w:type="dxa" w:w="90"/>
+            </w:tcMar>
+          </w:tcPr>
+          <w:p>
+            <w:pPr>
+              <w:jc w:val="left"/>
+            </w:pPr>
+            <w:r>
+              <w:rPr>
+                <w:rFonts w:ascii="Calibri" w:cs="Calibri" w:eastAsia="Calibri" w:hAnsi="Calibri"/>
+                <w:b w:val="false"/>
+                <w:bCs w:val="false"/>
+                <w:sz w:val="19"/>
+                <w:szCs w:val="19"/>
+              </w:rPr>
+              <w:t xml:space="preserve">Negativa (complemento a dos) → −0,9725°</w:t>
+            </w:r>
+          </w:p>
+        </w:tc>
+      </w:tr>
+    </w:tbl>
+    <w:p>
+      <w:pPr>
+        <w:spacing w:after="200" w:before="60"/>
+        <w:jc w:val="center"/>
+      </w:pPr>
+      <w:r>
+        <w:rPr>
+          <w:rFonts w:ascii="Calibri" w:cs="Calibri" w:eastAsia="Calibri" w:hAnsi="Calibri"/>
+          <w:i/>
+          <w:iCs/>
+          <w:color w:val="595959"/>
+          <w:sz w:val="19"/>
+          <w:szCs w:val="19"/>
+        </w:rPr>
+        <w:t xml:space="preserve">Tabla 21. Primeros campos de la trama de ejemplo.</w:t>
+      </w:r>
+    </w:p>
+    <w:p>
+      <w:pPr>
+        <w:pStyle w:val="Heading3"/>
+        <w:spacing w:after="100" w:before="200"/>
+      </w:pPr>
+      <w:r>
+        <w:rPr>
+          <w:rFonts w:ascii="Calibri" w:cs="Calibri" w:eastAsia="Calibri" w:hAnsi="Calibri"/>
+          <w:b/>
+          <w:bCs/>
+          <w:color w:val="2E75B6"/>
+          <w:sz w:val="23"/>
+          <w:szCs w:val="23"/>
+        </w:rPr>
+        <w:t xml:space="preserve">Implementación en Python y en C++</w:t>
+      </w:r>
+    </w:p>
+    <w:p>
+      <w:pPr>
+        <w:spacing w:after="140" w:line="276"/>
+        <w:jc w:val="both"/>
+      </w:pPr>
+      <w:r>
+        <w:rPr>
+          <w:rFonts w:ascii="Calibri" w:cs="Calibri" w:eastAsia="Calibri" w:hAnsi="Calibri"/>
+          <w:sz w:val="22"/>
+          <w:szCs w:val="22"/>
+        </w:rPr>
+        <w:t xml:space="preserve">La trama está implementada dos veces con el mismo resultado: ground/scripts/trama.py, referencia usada por el receptor de GNU Radio, y firmware/transmisor/src/trama.cpp, usada por la Heltec. El código C++ incluye un codificador Reed-Solomon propio sobre GF(256) (polinomio primitivo 0x11D, generador 2, primera raíz 0), con los mismos parámetros que la librería reedsolo de Python. El firmware construye una trama por segundo con datos simulados y la muestra en hexadecimal por el puerto serie; el siguiente paso será transmitirla con el SX1262.</w:t>
+      </w:r>
+    </w:p>
+    <w:tbl>
+      <w:tblPr>
+        <w:tblW w:type="dxa" w:w="9026"/>
+        <w:tblBorders>
+          <w:top w:val="single" w:color="auto" w:sz="4"/>
+          <w:left w:val="single" w:color="auto" w:sz="4"/>
+          <w:bottom w:val="single" w:color="auto" w:sz="4"/>
+          <w:right w:val="single" w:color="auto" w:sz="4"/>
+          <w:insideH w:val="single" w:color="auto" w:sz="4"/>
+          <w:insideV w:val="single" w:color="auto" w:sz="4"/>
+        </w:tblBorders>
+      </w:tblPr>
+      <w:tblGrid>
+        <w:gridCol w:w="9026"/>
+      </w:tblGrid>
+      <w:tr>
+        <w:tc>
+          <w:tcPr>
+            <w:tcW w:type="dxa" w:w="9026"/>
+            <w:tcBorders>
+              <w:top w:val="none" w:color="FFFFFF" w:sz="0"/>
+              <w:left w:val="single" w:color="548235" w:sz="24"/>
+              <w:bottom w:val="none" w:color="FFFFFF" w:sz="0"/>
+              <w:right w:val="none" w:color="FFFFFF" w:sz="0"/>
+            </w:tcBorders>
+            <w:shd w:fill="E2EFDA" w:color="auto" w:val="clear"/>
+            <w:tcMar>
+              <w:top w:type="dxa" w:w="120"/>
+              <w:left w:type="dxa" w:w="180"/>
+              <w:bottom w:type="dxa" w:w="100"/>
+              <w:right w:type="dxa" w:w="180"/>
+            </w:tcMar>
+          </w:tcPr>
+          <w:p>
+            <w:pPr>
+              <w:spacing w:after="80"/>
+            </w:pPr>
+            <w:r>
+              <w:rPr>
+                <w:rFonts w:ascii="Calibri" w:cs="Calibri" w:eastAsia="Calibri" w:hAnsi="Calibri"/>
+                <w:b/>
+                <w:bCs/>
+                <w:color w:val="548235"/>
+                <w:sz w:val="22"/>
+                <w:szCs w:val="22"/>
+              </w:rPr>
+              <w:t xml:space="preserve">Verificación</w:t>
+            </w:r>
+          </w:p>
+          <w:p>
+            <w:pPr>
+              <w:spacing w:after="140" w:line="276"/>
+              <w:jc w:val="left"/>
+            </w:pPr>
+            <w:r>
+              <w:rPr>
+                <w:rFonts w:ascii="Calibri" w:cs="Calibri" w:eastAsia="Calibri" w:hAnsi="Calibri"/>
+                <w:sz w:val="22"/>
+                <w:szCs w:val="22"/>
+              </w:rPr>
+              <w:t xml:space="preserve">Se compararon 500 tramas con valores aleatorios (coordenadas negativas, temperaturas bajo cero, giros grandes, contador en todo su rango) construidas en Python y en C++: las 500 son idénticas byte a byte. Transmisor y receptor comparten así exactamente el mismo formato, condición necesaria antes de pasar al hardware.</w:t>
+            </w:r>
+          </w:p>
+        </w:tc>
+      </w:tr>
+    </w:tbl>
+    <w:p>
+      <w:pPr>
         <w:pStyle w:val="Heading1"/>
         <w:spacing w:after="180" w:before="360"/>
       </w:pPr>
@@ -18592,7 +21721,7 @@
                 <w:sz w:val="19"/>
                 <w:szCs w:val="19"/>
               </w:rPr>
-              <w:t xml:space="preserve">Pendiente de recibir material</w:t>
+              <w:t xml:space="preserve">Trama en C++ verificada; falta el material para sensores y radio</w:t>
             </w:r>
           </w:p>
         </w:tc>
@@ -18690,7 +21819,7 @@
                 <w:sz w:val="19"/>
                 <w:szCs w:val="19"/>
               </w:rPr>
-              <w:t xml:space="preserve">Simulación FSK y medida de BER completadas; falta el hardware</w:t>
+              <w:t xml:space="preserve">Simulación completa (FSK, BER, tramas con RS y CRC); falta el hardware</w:t>
             </w:r>
           </w:p>
         </w:tc>
@@ -18808,7 +21937,7 @@
           <w:sz w:val="19"/>
           <w:szCs w:val="19"/>
         </w:rPr>
-        <w:t xml:space="preserve">Tabla 16. Estado del proyecto.</w:t>
+        <w:t xml:space="preserve">Tabla 22. Estado del proyecto.</w:t>
       </w:r>
     </w:p>
     <w:p>
@@ -18861,7 +21990,7 @@
           <w:sz w:val="22"/>
           <w:szCs w:val="22"/>
         </w:rPr>
-        <w:t xml:space="preserve">Comprar la batería LiPo (≥ 500 mAh, conector JST 1,25 mm) y un interruptor.</w:t>
+        <w:t xml:space="preserve">Batería LiPo e interruptor aplazados: de momento el transmisor se alimenta por USB (portátil o batería externa).</w:t>
       </w:r>
     </w:p>
     <w:p>
@@ -18915,7 +22044,7 @@
           <w:sz w:val="22"/>
           <w:szCs w:val="22"/>
         </w:rPr>
-        <w:t xml:space="preserve">Siguiente paso de simulación: construir la trama (sincronismo 0x1ACFFC1D + datos + CRC) y detectarla en GNU Radio.</w:t>
+        <w:t xml:space="preserve">Firmware: configurar el SX1262 en modo FSK (869,525 MHz, 9,6 kbit/s) y transmitir la trama.</w:t>
       </w:r>
     </w:p>
     <w:sectPr>
@@ -19180,6 +22309,30 @@
       </w:pPr>
     </w:lvl>
   </w:abstractNum>
+  <w:abstractNum w:abstractNumId="5" w15:restartNumberingAfterBreak="0">
+    <w:multiLevelType w:val="hybridMultilevel"/>
+    <w:lvl w:ilvl="0" w15:tentative="1">
+      <w:start w:val="1"/>
+      <w:numFmt w:val="decimal"/>
+      <w:lvlText w:val="%1."/>
+      <w:lvlJc w:val="left"/>
+      <w:pPr>
+        <w:ind w:left="540" w:hanging="300"/>
+      </w:pPr>
+    </w:lvl>
+  </w:abstractNum>
+  <w:abstractNum w:abstractNumId="6" w15:restartNumberingAfterBreak="0">
+    <w:multiLevelType w:val="hybridMultilevel"/>
+    <w:lvl w:ilvl="0" w15:tentative="1">
+      <w:start w:val="1"/>
+      <w:numFmt w:val="decimal"/>
+      <w:lvlText w:val="%1."/>
+      <w:lvlJc w:val="left"/>
+      <w:pPr>
+        <w:ind w:left="540" w:hanging="300"/>
+      </w:pPr>
+    </w:lvl>
+  </w:abstractNum>
   <w:num w:numId="1">
     <w:abstractNumId w:val="1"/>
     <w:lvlOverride w:ilvl="0">
@@ -19187,7 +22340,7 @@
     </w:lvlOverride>
   </w:num>
   <w:num w:numId="2">
-    <w:abstractNumId w:val="4"/>
+    <w:abstractNumId w:val="6"/>
     <w:lvlOverride w:ilvl="0">
       <w:startOverride w:val="1"/>
     </w:lvlOverride>
@@ -19200,6 +22353,18 @@
   </w:num>
   <w:num w:numId="4">
     <w:abstractNumId w:val="3"/>
+    <w:lvlOverride w:ilvl="0">
+      <w:startOverride w:val="1"/>
+    </w:lvlOverride>
+  </w:num>
+  <w:num w:numId="5">
+    <w:abstractNumId w:val="5"/>
+    <w:lvlOverride w:ilvl="0">
+      <w:startOverride w:val="1"/>
+    </w:lvlOverride>
+  </w:num>
+  <w:num w:numId="6">
+    <w:abstractNumId w:val="4"/>
     <w:lvlOverride w:ilvl="0">
       <w:startOverride w:val="1"/>
     </w:lvlOverride>

</xml_diff>